<commit_message>
Történet módosítása leírások bővítése
</commit_message>
<xml_diff>
--- a/Borsod Coding - For the potato.docx
+++ b/Borsod Coding - For the potato.docx
@@ -48,7 +48,31 @@
         <w:rPr>
           <w:color w:val="000000"/>
         </w:rPr>
-        <w:t>Projektünk egy 2D-s platformer játék, ami a rage game kategóriába esik. A története a következő: Volt egyszer egy troll, akinek a legjobb barátja egy krumpli volt, akit Kolompérnak hívtak. Az orosz katonák ellopták ezt a krumplit, hogy vodkát csináljanak belőle. A troll ezt nem engedhette meg, ezért elindult kiszabadítani. A játék zárása: sajnos a troll nem tudta megmenteni Kolo</w:t>
+        <w:t xml:space="preserve">Projektünk egy 2D-s platformer játék, ami a rage game kategóriába esik. A története a következő: Volt egyszer egy troll, akinek a legjobb barátja egy krumpli volt, akit Kolompérnak hívtak. Az </w:t>
+      </w:r>
+      <w:r>
+        <w:rPr>
+          <w:color w:val="000000"/>
+        </w:rPr>
+        <w:t xml:space="preserve">ottani </w:t>
+      </w:r>
+      <w:r>
+        <w:rPr>
+          <w:color w:val="000000"/>
+        </w:rPr>
+        <w:t xml:space="preserve">katonák ellopták ezt a krumplit, hogy </w:t>
+      </w:r>
+      <w:r>
+        <w:rPr>
+          <w:color w:val="000000"/>
+        </w:rPr>
+        <w:t>sült krumplit</w:t>
+      </w:r>
+      <w:r>
+        <w:rPr>
+          <w:color w:val="000000"/>
+        </w:rPr>
+        <w:t xml:space="preserve"> csináljanak belőle. A troll ezt nem engedhette meg, ezért elindult kiszabadítani. A játék zárása: sajnos a troll nem tudta megmenteni Kolo</w:t>
       </w:r>
       <w:r>
         <w:t>m</w:t>
@@ -57,7 +81,19 @@
         <w:rPr>
           <w:color w:val="000000"/>
         </w:rPr>
-        <w:t>pért. Vodka lett belőle.</w:t>
+        <w:t xml:space="preserve">pért. </w:t>
+      </w:r>
+      <w:r>
+        <w:rPr>
+          <w:color w:val="000000"/>
+        </w:rPr>
+        <w:t>sült krumpli</w:t>
+      </w:r>
+      <w:r>
+        <w:rPr>
+          <w:color w:val="000000"/>
+        </w:rPr>
+        <w:t xml:space="preserve"> lett belőle.</w:t>
       </w:r>
     </w:p>
     <w:p>
@@ -101,7 +137,43 @@
         <w:rPr>
           <w:color w:val="000000"/>
         </w:rPr>
-        <w:t>A harmadik részben elindul visszaszerezni a vodkát, amit az oroszok azóta is szigorúan őriznek, ezután elindulnak vissza a laborba, hogy Kolompér ismét krumpli lehessen. Sikerrel járnak.</w:t>
+        <w:t xml:space="preserve">A harmadik részben elindul visszaszerezni a </w:t>
+      </w:r>
+      <w:r>
+        <w:rPr>
+          <w:color w:val="000000"/>
+        </w:rPr>
+        <w:t>sült krumplit</w:t>
+      </w:r>
+      <w:r>
+        <w:rPr>
+          <w:color w:val="000000"/>
+        </w:rPr>
+        <w:t>, amit a</w:t>
+      </w:r>
+      <w:r>
+        <w:rPr>
+          <w:color w:val="000000"/>
+        </w:rPr>
+        <w:t xml:space="preserve"> k</w:t>
+      </w:r>
+      <w:r>
+        <w:rPr>
+          <w:color w:val="000000"/>
+        </w:rPr>
+        <w:t>a</w:t>
+      </w:r>
+      <w:r>
+        <w:rPr>
+          <w:color w:val="000000"/>
+        </w:rPr>
+        <w:t xml:space="preserve">tonák </w:t>
+      </w:r>
+      <w:r>
+        <w:rPr>
+          <w:color w:val="000000"/>
+        </w:rPr>
+        <w:t>azóta is szigorúan őriznek, ezután elindulnak vissza a laborba, hogy Kolompér ismét krumpli lehessen. Sikerrel járnak.</w:t>
       </w:r>
     </w:p>
     <w:p>
@@ -123,7 +195,67 @@
         <w:rPr>
           <w:color w:val="000000"/>
         </w:rPr>
-        <w:t>A negyedik részben azonban újra elrabolják a krumplit, ezúttal a McDonald’s emberei. Most sültkrumplit akarnak belőle csinálni. A troll ismét elmegy kiszabadítani. Zárás: a történet végére a troll annyira megéhezik, hogy összefog a McDonald’s-al, és hagyja, hogy barátjából sültkrumplit csináljanak, cserébe megkapja a sültkrumpli felét.</w:t>
+        <w:t>A negyedik részben azonban újra elrabolják a krumplit, ezúttal a</w:t>
+      </w:r>
+      <w:r>
+        <w:rPr>
+          <w:color w:val="000000"/>
+        </w:rPr>
+        <w:t xml:space="preserve">z étterem </w:t>
+      </w:r>
+      <w:r>
+        <w:rPr>
+          <w:color w:val="000000"/>
+        </w:rPr>
+        <w:t>emberei. Most sültkrumplit akarnak belőle csinálni. A troll ismét elmegy kiszabadítani. Zárás: a történet végére a troll</w:t>
+      </w:r>
+      <w:r>
+        <w:rPr>
+          <w:color w:val="000000"/>
+        </w:rPr>
+        <w:t xml:space="preserve"> otthonán elfogy az étel, de</w:t>
+      </w:r>
+      <w:r>
+        <w:rPr>
+          <w:color w:val="000000"/>
+        </w:rPr>
+        <w:t xml:space="preserve"> </w:t>
+      </w:r>
+      <w:r>
+        <w:rPr>
+          <w:color w:val="000000"/>
+        </w:rPr>
+        <w:t xml:space="preserve">így is </w:t>
+      </w:r>
+      <w:r>
+        <w:rPr>
+          <w:color w:val="000000"/>
+        </w:rPr>
+        <w:t>annyira</w:t>
+      </w:r>
+      <w:r>
+        <w:rPr>
+          <w:color w:val="000000"/>
+        </w:rPr>
+        <w:t xml:space="preserve"> éhes</w:t>
+      </w:r>
+      <w:r>
+        <w:rPr>
+          <w:color w:val="000000"/>
+        </w:rPr>
+        <w:t>, hogy összefog a</w:t>
+      </w:r>
+      <w:r>
+        <w:rPr>
+          <w:color w:val="000000"/>
+        </w:rPr>
+        <w:t>z étteremel</w:t>
+      </w:r>
+      <w:r>
+        <w:rPr>
+          <w:color w:val="000000"/>
+        </w:rPr>
+        <w:t>, és hagyja, hogy barátjából sültkrumplit csináljanak, cserébe megkapja a sültkrumpli felét.</w:t>
       </w:r>
     </w:p>
     <w:p>
@@ -235,7 +367,31 @@
         <w:rPr>
           <w:color w:val="000000"/>
         </w:rPr>
-        <w:t xml:space="preserve"> (main.py)</w:t>
+        <w:t xml:space="preserve"> (</w:t>
+      </w:r>
+      <w:r>
+        <w:rPr>
+          <w:color w:val="000000"/>
+        </w:rPr>
+        <w:t xml:space="preserve">a </w:t>
+      </w:r>
+      <w:r>
+        <w:rPr>
+          <w:color w:val="000000"/>
+        </w:rPr>
+        <w:t>main.py</w:t>
+      </w:r>
+      <w:r>
+        <w:rPr>
+          <w:color w:val="000000"/>
+        </w:rPr>
+        <w:t xml:space="preserve"> elindításához kell a requests és a pygame-ce modulok vagy main.exe</w:t>
+      </w:r>
+      <w:r>
+        <w:rPr>
+          <w:color w:val="000000"/>
+        </w:rPr>
+        <w:t>)</w:t>
       </w:r>
       <w:r>
         <w:rPr>
@@ -427,6 +583,7 @@
         <w:rPr>
           <w:color w:val="000000"/>
         </w:rPr>
+        <w:lastRenderedPageBreak/>
         <w:t>„Zene: van”, amivel be-ki kapcsoljuk a játék zenéjét.</w:t>
       </w:r>
     </w:p>
@@ -453,7 +610,6 @@
         <w:rPr>
           <w:color w:val="000000"/>
         </w:rPr>
-        <w:lastRenderedPageBreak/>
         <w:t>„Kilépés a játékból”, amivel kilépünk a játékból.</w:t>
       </w:r>
     </w:p>
@@ -597,16 +753,7 @@
         <w:rPr>
           <w:color w:val="000000"/>
         </w:rPr>
-        <w:t xml:space="preserve">Python nyelven, Pygame </w:t>
-      </w:r>
-      <w:r>
-        <w:t xml:space="preserve">modullal </w:t>
-      </w:r>
-      <w:r>
-        <w:rPr>
-          <w:color w:val="000000"/>
-        </w:rPr>
-        <w:t>készült Visual Studio Code fejlesztői környezetben.</w:t>
+        <w:t>Python nyelven, Visual Studio Code fejlesztői környezetben.</w:t>
       </w:r>
     </w:p>
     <w:p>
@@ -632,7 +779,95 @@
       <w:r>
         <w:rPr>
           <w:color w:val="000000"/>
-        </w:rPr>
+          <w:sz w:val="36"/>
+          <w:szCs w:val="36"/>
+        </w:rPr>
+        <w:t>Modulok</w:t>
+      </w:r>
+      <w:r>
+        <w:rPr>
+          <w:color w:val="000000"/>
+        </w:rPr>
+        <w:t>:</w:t>
+      </w:r>
+    </w:p>
+    <w:p>
+      <w:pPr>
+        <w:pStyle w:val="Listaszerbekezds"/>
+        <w:numPr>
+          <w:ilvl w:val="1"/>
+          <w:numId w:val="10"/>
+        </w:numPr>
+        <w:pBdr>
+          <w:top w:val="nil"/>
+          <w:left w:val="nil"/>
+          <w:bottom w:val="nil"/>
+          <w:right w:val="nil"/>
+          <w:between w:val="nil"/>
+        </w:pBdr>
+        <w:spacing w:after="360" w:line="360" w:lineRule="auto"/>
+        <w:rPr>
+          <w:color w:val="000000"/>
+        </w:rPr>
+      </w:pPr>
+      <w:r>
+        <w:rPr>
+          <w:color w:val="000000"/>
+        </w:rPr>
+        <w:t>requests: Ezzel küldünk HTTPS kéréseket.</w:t>
+      </w:r>
+    </w:p>
+    <w:p>
+      <w:pPr>
+        <w:pStyle w:val="Listaszerbekezds"/>
+        <w:numPr>
+          <w:ilvl w:val="1"/>
+          <w:numId w:val="10"/>
+        </w:numPr>
+        <w:pBdr>
+          <w:top w:val="nil"/>
+          <w:left w:val="nil"/>
+          <w:bottom w:val="nil"/>
+          <w:right w:val="nil"/>
+          <w:between w:val="nil"/>
+        </w:pBdr>
+        <w:spacing w:after="360" w:line="360" w:lineRule="auto"/>
+        <w:rPr>
+          <w:color w:val="000000"/>
+        </w:rPr>
+      </w:pPr>
+      <w:r>
+        <w:rPr>
+          <w:color w:val="000000"/>
+        </w:rPr>
+        <w:t>pygame-ce: A játék „motorja”, amivel készítettük el a játékot.</w:t>
+      </w:r>
+    </w:p>
+    <w:p>
+      <w:pPr>
+        <w:pStyle w:val="Listaszerbekezds"/>
+        <w:numPr>
+          <w:ilvl w:val="0"/>
+          <w:numId w:val="10"/>
+        </w:numPr>
+        <w:pBdr>
+          <w:top w:val="nil"/>
+          <w:left w:val="nil"/>
+          <w:bottom w:val="nil"/>
+          <w:right w:val="nil"/>
+          <w:between w:val="nil"/>
+        </w:pBdr>
+        <w:spacing w:after="360" w:line="360" w:lineRule="auto"/>
+        <w:ind w:left="714" w:hanging="357"/>
+        <w:rPr>
+          <w:color w:val="000000"/>
+        </w:rPr>
+      </w:pPr>
+      <w:r>
+        <w:rPr>
+          <w:color w:val="000000"/>
+        </w:rPr>
+        <w:lastRenderedPageBreak/>
         <w:t>A pályák mátrixokban vannak eltárolva, a program végigmegy az aktuális mátrixon, amiben minden számhoz egy adott block, entitás vagy a játékos van rendelve, ezt értelmezi, és megvalósítja.</w:t>
       </w:r>
     </w:p>
@@ -695,7 +930,6 @@
         <w:rPr>
           <w:color w:val="000000"/>
         </w:rPr>
-        <w:lastRenderedPageBreak/>
         <w:t>4-féle környezetben:</w:t>
       </w:r>
     </w:p>
@@ -1281,7 +1515,31 @@
         <w:rPr>
           <w:color w:val="000000"/>
         </w:rPr>
-        <w:t>Az adatbázist Xampp program által Mysql környezetben készítjük és fejlesztjük.</w:t>
+        <w:t>Az adatbázist Xampp</w:t>
+      </w:r>
+      <w:r>
+        <w:rPr>
+          <w:color w:val="000000"/>
+        </w:rPr>
+        <w:t>, illetve Docker</w:t>
+      </w:r>
+      <w:r>
+        <w:rPr>
+          <w:color w:val="000000"/>
+        </w:rPr>
+        <w:t xml:space="preserve"> program által Mysql</w:t>
+      </w:r>
+      <w:r>
+        <w:rPr>
+          <w:color w:val="000000"/>
+        </w:rPr>
+        <w:t>-ben</w:t>
+      </w:r>
+      <w:r>
+        <w:rPr>
+          <w:color w:val="000000"/>
+        </w:rPr>
+        <w:t xml:space="preserve"> készítjük és fejlesztjük.</w:t>
       </w:r>
     </w:p>
     <w:p>
@@ -1545,6 +1803,126 @@
       </w:r>
     </w:p>
     <w:p>
+      <w:r>
+        <w:rPr>
+          <w:b/>
+          <w:bCs/>
+        </w:rPr>
+        <w:lastRenderedPageBreak/>
+        <w:t xml:space="preserve">Technológia: </w:t>
+      </w:r>
+      <w:r>
+        <w:t>Bun-t használunk</w:t>
+      </w:r>
+      <w:r>
+        <w:t xml:space="preserve"> </w:t>
+      </w:r>
+      <w:hyperlink r:id="rId6" w:history="1">
+        <w:r>
+          <w:rPr>
+            <w:rStyle w:val="Hiperhivatkozs"/>
+          </w:rPr>
+          <w:t>https://bun.sh/</w:t>
+        </w:r>
+      </w:hyperlink>
+      <w:r>
+        <w:t xml:space="preserve"> </w:t>
+      </w:r>
+      <w:r>
+        <w:t>a React projekt létrehozásához, csomagok kezelését.</w:t>
+      </w:r>
+    </w:p>
+    <w:p>
+      <w:pPr>
+        <w:ind w:left="360"/>
+        <w:rPr>
+          <w:b/>
+          <w:bCs/>
+        </w:rPr>
+      </w:pPr>
+      <w:r>
+        <w:rPr>
+          <w:b/>
+          <w:bCs/>
+        </w:rPr>
+        <w:t>Használat</w:t>
+      </w:r>
+      <w:r>
+        <w:rPr>
+          <w:b/>
+          <w:bCs/>
+        </w:rPr>
+        <w:t>:</w:t>
+      </w:r>
+    </w:p>
+    <w:p>
+      <w:pPr>
+        <w:pStyle w:val="Listaszerbekezds"/>
+        <w:numPr>
+          <w:ilvl w:val="1"/>
+          <w:numId w:val="6"/>
+        </w:numPr>
+        <w:rPr>
+          <w:b/>
+          <w:bCs/>
+        </w:rPr>
+      </w:pPr>
+      <w:r>
+        <w:t>Ha le van telepítve a bun. Akkor projekt letöltése után a projektmappát Visual Studio Code-on nyissuk meg.</w:t>
+      </w:r>
+    </w:p>
+    <w:p>
+      <w:pPr>
+        <w:pStyle w:val="Listaszerbekezds"/>
+        <w:numPr>
+          <w:ilvl w:val="1"/>
+          <w:numId w:val="6"/>
+        </w:numPr>
+        <w:rPr>
+          <w:b/>
+          <w:bCs/>
+        </w:rPr>
+      </w:pPr>
+      <w:r>
+        <w:t>Indítsuk el a terminált nézzük, hogy a jelenlegi projektmappában vagyunk.</w:t>
+      </w:r>
+    </w:p>
+    <w:p>
+      <w:pPr>
+        <w:pStyle w:val="Listaszerbekezds"/>
+        <w:numPr>
+          <w:ilvl w:val="1"/>
+          <w:numId w:val="6"/>
+        </w:numPr>
+        <w:rPr>
+          <w:b/>
+          <w:bCs/>
+        </w:rPr>
+      </w:pPr>
+      <w:r>
+        <w:t>Írjuk be: „bun install” és letölti a projekthez szükséges könyvtárakat.</w:t>
+      </w:r>
+    </w:p>
+    <w:p>
+      <w:pPr>
+        <w:pStyle w:val="Listaszerbekezds"/>
+        <w:numPr>
+          <w:ilvl w:val="1"/>
+          <w:numId w:val="6"/>
+        </w:numPr>
+        <w:rPr>
+          <w:b/>
+          <w:bCs/>
+        </w:rPr>
+      </w:pPr>
+      <w:r>
+        <w:t xml:space="preserve">Indítsuk el a </w:t>
+      </w:r>
+      <w:r>
+        <w:t>weboldal szerverét, a „bun dev” paranccsal és menjünk a megadott linkre a weboldalhoz.</w:t>
+      </w:r>
+    </w:p>
+    <w:p>
       <w:pPr>
         <w:numPr>
           <w:ilvl w:val="0"/>
@@ -1567,7 +1945,6 @@
         <w:rPr>
           <w:color w:val="000000"/>
         </w:rPr>
-        <w:lastRenderedPageBreak/>
         <w:t>Ehhez HTML-t, CSS-t, Bootstrap 5-öt és Javascript</w:t>
       </w:r>
       <w:r>
@@ -1613,7 +1990,7 @@
       <w:r>
         <w:t xml:space="preserve">Dockerfile segítségével a </w:t>
       </w:r>
-      <w:hyperlink r:id="rId6">
+      <w:hyperlink r:id="rId7">
         <w:r>
           <w:rPr>
             <w:color w:val="1155CC"/>
@@ -1643,26 +2020,6 @@
         <w:jc w:val="both"/>
       </w:pPr>
       <w:r>
-        <w:t>Bun-t használunk a React projekt létrehozásához, csomagok kezelését.</w:t>
-      </w:r>
-    </w:p>
-    <w:p>
-      <w:pPr>
-        <w:numPr>
-          <w:ilvl w:val="0"/>
-          <w:numId w:val="6"/>
-        </w:numPr>
-        <w:pBdr>
-          <w:top w:val="nil"/>
-          <w:left w:val="nil"/>
-          <w:bottom w:val="nil"/>
-          <w:right w:val="nil"/>
-          <w:between w:val="nil"/>
-        </w:pBdr>
-        <w:spacing w:before="0" w:after="0" w:line="240" w:lineRule="auto"/>
-        <w:jc w:val="both"/>
-      </w:pPr>
-      <w:r>
         <w:t>React modulok:</w:t>
       </w:r>
     </w:p>
@@ -1745,6 +2102,7 @@
           <w:sz w:val="56"/>
           <w:szCs w:val="56"/>
         </w:rPr>
+        <w:lastRenderedPageBreak/>
         <w:t>Alkalmazás:</w:t>
       </w:r>
     </w:p>
@@ -1809,7 +2167,6 @@
         <w:spacing w:line="360" w:lineRule="auto"/>
       </w:pPr>
       <w:r>
-        <w:lastRenderedPageBreak/>
         <w:t>Adatbázis connectionString részeinek megadása. Most csak egy adatbázis miatt előre ki van töltve a Server name: localhost-ra, és a Database name: „for_the_potato”</w:t>
       </w:r>
       <w:r>
@@ -1906,7 +2263,11 @@
         <w:spacing w:line="360" w:lineRule="auto"/>
       </w:pPr>
       <w:r>
-        <w:t>„Új rekord”: A jelenlegi táblának egy új adat rekord hozzáadása.</w:t>
+        <w:lastRenderedPageBreak/>
+        <w:t>„Új rekord”: A jelenlegi táblának egy új adat rekord hozzáadása</w:t>
+      </w:r>
+      <w:r>
+        <w:t>, az elvárt JSON szerkezet szerint.</w:t>
       </w:r>
     </w:p>
     <w:p>
@@ -1931,7 +2292,13 @@
         <w:t>”: A jelenlegi tábla kiválasztott rekord módosítása</w:t>
       </w:r>
       <w:r>
-        <w:t>, ha nincsen kiválasztva, akkor nem elérhető.</w:t>
+        <w:t>,</w:t>
+      </w:r>
+      <w:r>
+        <w:t xml:space="preserve"> az elvárt JSON szerkezet szerint. H</w:t>
+      </w:r>
+      <w:r>
+        <w:t>a nincsen kiválasztva, akkor nem elérhető.</w:t>
       </w:r>
     </w:p>
     <w:p>
@@ -1956,7 +2323,10 @@
         <w:t>”: A jelenlegi tábla kiválasztott rekord törlése</w:t>
       </w:r>
       <w:r>
-        <w:t>, ha nincsen kiválasztva, akkor nem elérhető</w:t>
+        <w:t xml:space="preserve"> az Id-ja alapján. H</w:t>
+      </w:r>
+      <w:r>
+        <w:t>a nincsen kiválasztva, akkor nem elérhető</w:t>
       </w:r>
       <w:r>
         <w:t>.</w:t>
@@ -1972,8 +2342,13 @@
         <w:spacing w:line="360" w:lineRule="auto"/>
       </w:pPr>
       <w:r>
-        <w:lastRenderedPageBreak/>
-        <w:t>„Mégse”: A jelenlegi tábla kiválasztott rekord elfelejtése, és kikapcsolni, az egy rekordhoz kötött műveleteket</w:t>
+        <w:t xml:space="preserve">„Mégse”: A jelenlegi tábla kiválasztott rekord elfelejtése, és </w:t>
+      </w:r>
+      <w:r>
+        <w:t>visszavonni</w:t>
+      </w:r>
+      <w:r>
+        <w:t>, az egy rekordhoz kötött műveleteket</w:t>
       </w:r>
       <w:r>
         <w:t>.</w:t>
@@ -2867,7 +3242,7 @@
   <w:abstractNum w:abstractNumId="6" w15:restartNumberingAfterBreak="0">
     <w:nsid w:val="41243AE0"/>
     <w:multiLevelType w:val="multilevel"/>
-    <w:tmpl w:val="D6CE3398"/>
+    <w:tmpl w:val="0908B42A"/>
     <w:lvl w:ilvl="0">
       <w:start w:val="1"/>
       <w:numFmt w:val="bullet"/>
@@ -2882,14 +3257,15 @@
     </w:lvl>
     <w:lvl w:ilvl="1">
       <w:start w:val="1"/>
-      <w:numFmt w:val="bullet"/>
-      <w:lvlText w:val="○"/>
-      <w:lvlJc w:val="left"/>
-      <w:pPr>
-        <w:ind w:left="1440" w:hanging="360"/>
-      </w:pPr>
-      <w:rPr>
-        <w:u w:val="none"/>
+      <w:numFmt w:val="decimal"/>
+      <w:lvlText w:val="%2."/>
+      <w:lvlJc w:val="left"/>
+      <w:pPr>
+        <w:ind w:left="2204" w:hanging="360"/>
+      </w:pPr>
+      <w:rPr>
+        <w:b w:val="0"/>
+        <w:bCs w:val="0"/>
       </w:rPr>
     </w:lvl>
     <w:lvl w:ilvl="2">
@@ -4516,6 +4892,7 @@
   <w:style w:type="character" w:default="1" w:styleId="Bekezdsalapbettpusa">
     <w:name w:val="Default Paragraph Font"/>
     <w:uiPriority w:val="1"/>
+    <w:semiHidden/>
     <w:unhideWhenUsed/>
   </w:style>
   <w:style w:type="table" w:default="1" w:styleId="Normltblzat">
@@ -4590,6 +4967,29 @@
       <w:ind w:left="720"/>
       <w:contextualSpacing/>
     </w:pPr>
+  </w:style>
+  <w:style w:type="character" w:styleId="Hiperhivatkozs">
+    <w:name w:val="Hyperlink"/>
+    <w:basedOn w:val="Bekezdsalapbettpusa"/>
+    <w:uiPriority w:val="99"/>
+    <w:unhideWhenUsed/>
+    <w:rsid w:val="00BA6184"/>
+    <w:rPr>
+      <w:color w:val="0000FF" w:themeColor="hyperlink"/>
+      <w:u w:val="single"/>
+    </w:rPr>
+  </w:style>
+  <w:style w:type="character" w:styleId="Feloldatlanmegemlts">
+    <w:name w:val="Unresolved Mention"/>
+    <w:basedOn w:val="Bekezdsalapbettpusa"/>
+    <w:uiPriority w:val="99"/>
+    <w:semiHidden/>
+    <w:unhideWhenUsed/>
+    <w:rsid w:val="00BA6184"/>
+    <w:rPr>
+      <w:color w:val="605E5C"/>
+      <w:shd w:val="clear" w:color="auto" w:fill="E1DFDD"/>
+    </w:rPr>
   </w:style>
 </w:styles>
 </file>

</xml_diff>

<commit_message>
Teszt és Word dokumentum frisítése
</commit_message>
<xml_diff>
--- a/Borsod Coding - For the potato.docx
+++ b/Borsod Coding - For the potato.docx
@@ -249,7 +249,19 @@
         <w:rPr>
           <w:color w:val="000000"/>
         </w:rPr>
-        <w:t>z étteremel</w:t>
+        <w:t>z étterem</w:t>
+      </w:r>
+      <w:r>
+        <w:rPr>
+          <w:color w:val="000000"/>
+        </w:rPr>
+        <w:t>m</w:t>
+      </w:r>
+      <w:r>
+        <w:rPr>
+          <w:color w:val="000000"/>
+        </w:rPr>
+        <w:t>el</w:t>
       </w:r>
       <w:r>
         <w:rPr>
@@ -1530,6 +1542,81 @@
     </w:p>
     <w:p>
       <w:pPr>
+        <w:ind w:left="360"/>
+      </w:pPr>
+      <w:r>
+        <w:rPr>
+          <w:b/>
+          <w:bCs/>
+        </w:rPr>
+        <w:t>Használat:</w:t>
+      </w:r>
+    </w:p>
+    <w:p>
+      <w:pPr>
+        <w:pStyle w:val="Listaszerbekezds"/>
+        <w:numPr>
+          <w:ilvl w:val="0"/>
+          <w:numId w:val="20"/>
+        </w:numPr>
+      </w:pPr>
+      <w:r>
+        <w:t>Xampp alkalmazáson indíts</w:t>
+      </w:r>
+      <w:r>
+        <w:t>uk</w:t>
+      </w:r>
+      <w:r>
+        <w:t xml:space="preserve"> el Apache és MySQL modulokat, vagy Docker alkalmazáson a legfrissebb MySQL „image” letöltés</w:t>
+      </w:r>
+      <w:r>
+        <w:t>ét</w:t>
+      </w:r>
+      <w:r>
+        <w:t xml:space="preserve"> és hozz</w:t>
+      </w:r>
+      <w:r>
+        <w:t>unk</w:t>
+      </w:r>
+      <w:r>
+        <w:t xml:space="preserve"> létre egy olyan „container”-t, ahol MYSQL_ALLOW_EMPTY_PASSWORD kell megadni változónak!</w:t>
+      </w:r>
+    </w:p>
+    <w:p>
+      <w:pPr>
+        <w:pStyle w:val="Listaszerbekezds"/>
+        <w:numPr>
+          <w:ilvl w:val="0"/>
+          <w:numId w:val="20"/>
+        </w:numPr>
+      </w:pPr>
+      <w:r>
+        <w:t xml:space="preserve">A Visual Studio </w:t>
+      </w:r>
+      <w:r>
+        <w:t>Community-ben Package Manager konzolon írj</w:t>
+      </w:r>
+      <w:r>
+        <w:t>uk</w:t>
+      </w:r>
+      <w:r>
+        <w:t xml:space="preserve"> be „update-database”, így létrehozza az adatbázist.</w:t>
+      </w:r>
+    </w:p>
+    <w:p>
+      <w:pPr>
+        <w:pStyle w:val="Listaszerbekezds"/>
+        <w:numPr>
+          <w:ilvl w:val="0"/>
+          <w:numId w:val="20"/>
+        </w:numPr>
+      </w:pPr>
+      <w:r>
+        <w:t>Indítsuk el a szervert!</w:t>
+      </w:r>
+    </w:p>
+    <w:p>
+      <w:pPr>
         <w:pStyle w:val="Cmsor2"/>
         <w:spacing w:line="240" w:lineRule="auto"/>
         <w:rPr>
@@ -1729,6 +1816,7 @@
         <w:spacing w:after="120" w:line="240" w:lineRule="auto"/>
       </w:pPr>
       <w:r>
+        <w:lastRenderedPageBreak/>
         <w:t>mentesek</w:t>
       </w:r>
     </w:p>
@@ -1825,7 +1913,6 @@
           <w:sz w:val="56"/>
           <w:szCs w:val="56"/>
         </w:rPr>
-        <w:lastRenderedPageBreak/>
         <w:t>Frontend:</w:t>
       </w:r>
     </w:p>
@@ -1993,7 +2080,13 @@
         <w:t>Ehhez HTML-t, CSS-t, Bootstrap 5-öt és Javascript</w:t>
       </w:r>
       <w:r>
-        <w:t xml:space="preserve"> programozási nyelvet használunk React keretrendszerrel különböző Javascript könyvtárakkal.</w:t>
+        <w:t xml:space="preserve"> programozási nyelvet</w:t>
+      </w:r>
+      <w:r>
+        <w:t xml:space="preserve"> használunk</w:t>
+      </w:r>
+      <w:r>
+        <w:t>.</w:t>
       </w:r>
     </w:p>
     <w:p>
@@ -2013,7 +2106,13 @@
         <w:jc w:val="both"/>
       </w:pPr>
       <w:r>
-        <w:t>A weboldalt teljesen csak a regisztrálás vagy bejelentkezés után juthatnak el az összes weboldalra.</w:t>
+        <w:t>A weboldalt teljesen csak a regisztrálás vagy bejelentkezés után jut</w:t>
+      </w:r>
+      <w:r>
+        <w:t>hatunk</w:t>
+      </w:r>
+      <w:r>
+        <w:t xml:space="preserve"> el az összes weboldalra.</w:t>
       </w:r>
     </w:p>
     <w:p>
@@ -2033,6 +2132,7 @@
         <w:jc w:val="both"/>
       </w:pPr>
       <w:r>
+        <w:lastRenderedPageBreak/>
         <w:t xml:space="preserve">Dockerfile segítségével a </w:t>
       </w:r>
       <w:hyperlink r:id="rId7">
@@ -2089,9 +2189,6 @@
       <w:r>
         <w:t>Használatban: react-router-dom</w:t>
       </w:r>
-      <w:r>
-        <w:t>, axios</w:t>
-      </w:r>
     </w:p>
     <w:p>
       <w:pPr>
@@ -2101,7 +2198,6 @@
         </w:numPr>
       </w:pPr>
       <w:r>
-        <w:lastRenderedPageBreak/>
         <w:t>Vélemény oldalon lehet véleményt adni</w:t>
       </w:r>
       <w:r>
@@ -2237,6 +2333,7 @@
         <w:spacing w:line="360" w:lineRule="auto"/>
       </w:pPr>
       <w:r>
+        <w:lastRenderedPageBreak/>
         <w:t>Utána egy ablak jelenik meg, ahol egy Datagrid, k</w:t>
       </w:r>
       <w:r>
@@ -2282,7 +2379,6 @@
         <w:spacing w:line="360" w:lineRule="auto"/>
       </w:pPr>
       <w:r>
-        <w:lastRenderedPageBreak/>
         <w:t>MenuItemek: „Műveletek”, „Kijelentkezés”:</w:t>
       </w:r>
     </w:p>
@@ -2946,6 +3042,119 @@
     </w:lvl>
   </w:abstractNum>
   <w:abstractNum w:abstractNumId="3" w15:restartNumberingAfterBreak="0">
+    <w:nsid w:val="337D12C0"/>
+    <w:multiLevelType w:val="hybridMultilevel"/>
+    <w:tmpl w:val="06B803C8"/>
+    <w:lvl w:ilvl="0" w:tplc="040E0001">
+      <w:start w:val="1"/>
+      <w:numFmt w:val="bullet"/>
+      <w:lvlText w:val=""/>
+      <w:lvlJc w:val="left"/>
+      <w:pPr>
+        <w:ind w:left="1080" w:hanging="360"/>
+      </w:pPr>
+      <w:rPr>
+        <w:rFonts w:ascii="Symbol" w:hAnsi="Symbol" w:hint="default"/>
+      </w:rPr>
+    </w:lvl>
+    <w:lvl w:ilvl="1" w:tplc="040E0003" w:tentative="1">
+      <w:start w:val="1"/>
+      <w:numFmt w:val="bullet"/>
+      <w:lvlText w:val="o"/>
+      <w:lvlJc w:val="left"/>
+      <w:pPr>
+        <w:ind w:left="1800" w:hanging="360"/>
+      </w:pPr>
+      <w:rPr>
+        <w:rFonts w:ascii="Courier New" w:hAnsi="Courier New" w:cs="Courier New" w:hint="default"/>
+      </w:rPr>
+    </w:lvl>
+    <w:lvl w:ilvl="2" w:tplc="040E0005" w:tentative="1">
+      <w:start w:val="1"/>
+      <w:numFmt w:val="bullet"/>
+      <w:lvlText w:val=""/>
+      <w:lvlJc w:val="left"/>
+      <w:pPr>
+        <w:ind w:left="2520" w:hanging="360"/>
+      </w:pPr>
+      <w:rPr>
+        <w:rFonts w:ascii="Wingdings" w:hAnsi="Wingdings" w:hint="default"/>
+      </w:rPr>
+    </w:lvl>
+    <w:lvl w:ilvl="3" w:tplc="040E0001" w:tentative="1">
+      <w:start w:val="1"/>
+      <w:numFmt w:val="bullet"/>
+      <w:lvlText w:val=""/>
+      <w:lvlJc w:val="left"/>
+      <w:pPr>
+        <w:ind w:left="3240" w:hanging="360"/>
+      </w:pPr>
+      <w:rPr>
+        <w:rFonts w:ascii="Symbol" w:hAnsi="Symbol" w:hint="default"/>
+      </w:rPr>
+    </w:lvl>
+    <w:lvl w:ilvl="4" w:tplc="040E0003" w:tentative="1">
+      <w:start w:val="1"/>
+      <w:numFmt w:val="bullet"/>
+      <w:lvlText w:val="o"/>
+      <w:lvlJc w:val="left"/>
+      <w:pPr>
+        <w:ind w:left="3960" w:hanging="360"/>
+      </w:pPr>
+      <w:rPr>
+        <w:rFonts w:ascii="Courier New" w:hAnsi="Courier New" w:cs="Courier New" w:hint="default"/>
+      </w:rPr>
+    </w:lvl>
+    <w:lvl w:ilvl="5" w:tplc="040E0005" w:tentative="1">
+      <w:start w:val="1"/>
+      <w:numFmt w:val="bullet"/>
+      <w:lvlText w:val=""/>
+      <w:lvlJc w:val="left"/>
+      <w:pPr>
+        <w:ind w:left="4680" w:hanging="360"/>
+      </w:pPr>
+      <w:rPr>
+        <w:rFonts w:ascii="Wingdings" w:hAnsi="Wingdings" w:hint="default"/>
+      </w:rPr>
+    </w:lvl>
+    <w:lvl w:ilvl="6" w:tplc="040E0001" w:tentative="1">
+      <w:start w:val="1"/>
+      <w:numFmt w:val="bullet"/>
+      <w:lvlText w:val=""/>
+      <w:lvlJc w:val="left"/>
+      <w:pPr>
+        <w:ind w:left="5400" w:hanging="360"/>
+      </w:pPr>
+      <w:rPr>
+        <w:rFonts w:ascii="Symbol" w:hAnsi="Symbol" w:hint="default"/>
+      </w:rPr>
+    </w:lvl>
+    <w:lvl w:ilvl="7" w:tplc="040E0003" w:tentative="1">
+      <w:start w:val="1"/>
+      <w:numFmt w:val="bullet"/>
+      <w:lvlText w:val="o"/>
+      <w:lvlJc w:val="left"/>
+      <w:pPr>
+        <w:ind w:left="6120" w:hanging="360"/>
+      </w:pPr>
+      <w:rPr>
+        <w:rFonts w:ascii="Courier New" w:hAnsi="Courier New" w:cs="Courier New" w:hint="default"/>
+      </w:rPr>
+    </w:lvl>
+    <w:lvl w:ilvl="8" w:tplc="040E0005" w:tentative="1">
+      <w:start w:val="1"/>
+      <w:numFmt w:val="bullet"/>
+      <w:lvlText w:val=""/>
+      <w:lvlJc w:val="left"/>
+      <w:pPr>
+        <w:ind w:left="6840" w:hanging="360"/>
+      </w:pPr>
+      <w:rPr>
+        <w:rFonts w:ascii="Wingdings" w:hAnsi="Wingdings" w:hint="default"/>
+      </w:rPr>
+    </w:lvl>
+  </w:abstractNum>
+  <w:abstractNum w:abstractNumId="4" w15:restartNumberingAfterBreak="0">
     <w:nsid w:val="344339F1"/>
     <w:multiLevelType w:val="multilevel"/>
     <w:tmpl w:val="D6CE3398"/>
@@ -3058,7 +3267,7 @@
       </w:rPr>
     </w:lvl>
   </w:abstractNum>
-  <w:abstractNum w:abstractNumId="4" w15:restartNumberingAfterBreak="0">
+  <w:abstractNum w:abstractNumId="5" w15:restartNumberingAfterBreak="0">
     <w:nsid w:val="3EA91AC7"/>
     <w:multiLevelType w:val="multilevel"/>
     <w:tmpl w:val="D5804E5A"/>
@@ -3171,7 +3380,7 @@
       </w:rPr>
     </w:lvl>
   </w:abstractNum>
-  <w:abstractNum w:abstractNumId="5" w15:restartNumberingAfterBreak="0">
+  <w:abstractNum w:abstractNumId="6" w15:restartNumberingAfterBreak="0">
     <w:nsid w:val="3F096D61"/>
     <w:multiLevelType w:val="multilevel"/>
     <w:tmpl w:val="D6CE3398"/>
@@ -3284,7 +3493,7 @@
       </w:rPr>
     </w:lvl>
   </w:abstractNum>
-  <w:abstractNum w:abstractNumId="6" w15:restartNumberingAfterBreak="0">
+  <w:abstractNum w:abstractNumId="7" w15:restartNumberingAfterBreak="0">
     <w:nsid w:val="41243AE0"/>
     <w:multiLevelType w:val="multilevel"/>
     <w:tmpl w:val="0908B42A"/>
@@ -3398,7 +3607,7 @@
       </w:rPr>
     </w:lvl>
   </w:abstractNum>
-  <w:abstractNum w:abstractNumId="7" w15:restartNumberingAfterBreak="0">
+  <w:abstractNum w:abstractNumId="8" w15:restartNumberingAfterBreak="0">
     <w:nsid w:val="47275B3E"/>
     <w:multiLevelType w:val="multilevel"/>
     <w:tmpl w:val="D6CE3398"/>
@@ -3511,7 +3720,7 @@
       </w:rPr>
     </w:lvl>
   </w:abstractNum>
-  <w:abstractNum w:abstractNumId="8" w15:restartNumberingAfterBreak="0">
+  <w:abstractNum w:abstractNumId="9" w15:restartNumberingAfterBreak="0">
     <w:nsid w:val="499A6261"/>
     <w:multiLevelType w:val="hybridMultilevel"/>
     <w:tmpl w:val="E4145190"/>
@@ -3597,7 +3806,7 @@
       </w:pPr>
     </w:lvl>
   </w:abstractNum>
-  <w:abstractNum w:abstractNumId="9" w15:restartNumberingAfterBreak="0">
+  <w:abstractNum w:abstractNumId="10" w15:restartNumberingAfterBreak="0">
     <w:nsid w:val="51544A6C"/>
     <w:multiLevelType w:val="multilevel"/>
     <w:tmpl w:val="8D6AB54E"/>
@@ -3710,7 +3919,7 @@
       </w:rPr>
     </w:lvl>
   </w:abstractNum>
-  <w:abstractNum w:abstractNumId="10" w15:restartNumberingAfterBreak="0">
+  <w:abstractNum w:abstractNumId="11" w15:restartNumberingAfterBreak="0">
     <w:nsid w:val="51A979F3"/>
     <w:multiLevelType w:val="multilevel"/>
     <w:tmpl w:val="D6CE3398"/>
@@ -3823,7 +4032,93 @@
       </w:rPr>
     </w:lvl>
   </w:abstractNum>
-  <w:abstractNum w:abstractNumId="11" w15:restartNumberingAfterBreak="0">
+  <w:abstractNum w:abstractNumId="12" w15:restartNumberingAfterBreak="0">
+    <w:nsid w:val="552536BB"/>
+    <w:multiLevelType w:val="hybridMultilevel"/>
+    <w:tmpl w:val="A4889798"/>
+    <w:lvl w:ilvl="0" w:tplc="040E000F">
+      <w:start w:val="1"/>
+      <w:numFmt w:val="decimal"/>
+      <w:lvlText w:val="%1."/>
+      <w:lvlJc w:val="left"/>
+      <w:pPr>
+        <w:ind w:left="1080" w:hanging="360"/>
+      </w:pPr>
+    </w:lvl>
+    <w:lvl w:ilvl="1" w:tplc="040E0019" w:tentative="1">
+      <w:start w:val="1"/>
+      <w:numFmt w:val="lowerLetter"/>
+      <w:lvlText w:val="%2."/>
+      <w:lvlJc w:val="left"/>
+      <w:pPr>
+        <w:ind w:left="1800" w:hanging="360"/>
+      </w:pPr>
+    </w:lvl>
+    <w:lvl w:ilvl="2" w:tplc="040E001B" w:tentative="1">
+      <w:start w:val="1"/>
+      <w:numFmt w:val="lowerRoman"/>
+      <w:lvlText w:val="%3."/>
+      <w:lvlJc w:val="right"/>
+      <w:pPr>
+        <w:ind w:left="2520" w:hanging="180"/>
+      </w:pPr>
+    </w:lvl>
+    <w:lvl w:ilvl="3" w:tplc="040E000F" w:tentative="1">
+      <w:start w:val="1"/>
+      <w:numFmt w:val="decimal"/>
+      <w:lvlText w:val="%4."/>
+      <w:lvlJc w:val="left"/>
+      <w:pPr>
+        <w:ind w:left="3240" w:hanging="360"/>
+      </w:pPr>
+    </w:lvl>
+    <w:lvl w:ilvl="4" w:tplc="040E0019" w:tentative="1">
+      <w:start w:val="1"/>
+      <w:numFmt w:val="lowerLetter"/>
+      <w:lvlText w:val="%5."/>
+      <w:lvlJc w:val="left"/>
+      <w:pPr>
+        <w:ind w:left="3960" w:hanging="360"/>
+      </w:pPr>
+    </w:lvl>
+    <w:lvl w:ilvl="5" w:tplc="040E001B" w:tentative="1">
+      <w:start w:val="1"/>
+      <w:numFmt w:val="lowerRoman"/>
+      <w:lvlText w:val="%6."/>
+      <w:lvlJc w:val="right"/>
+      <w:pPr>
+        <w:ind w:left="4680" w:hanging="180"/>
+      </w:pPr>
+    </w:lvl>
+    <w:lvl w:ilvl="6" w:tplc="040E000F" w:tentative="1">
+      <w:start w:val="1"/>
+      <w:numFmt w:val="decimal"/>
+      <w:lvlText w:val="%7."/>
+      <w:lvlJc w:val="left"/>
+      <w:pPr>
+        <w:ind w:left="5400" w:hanging="360"/>
+      </w:pPr>
+    </w:lvl>
+    <w:lvl w:ilvl="7" w:tplc="040E0019" w:tentative="1">
+      <w:start w:val="1"/>
+      <w:numFmt w:val="lowerLetter"/>
+      <w:lvlText w:val="%8."/>
+      <w:lvlJc w:val="left"/>
+      <w:pPr>
+        <w:ind w:left="6120" w:hanging="360"/>
+      </w:pPr>
+    </w:lvl>
+    <w:lvl w:ilvl="8" w:tplc="040E001B" w:tentative="1">
+      <w:start w:val="1"/>
+      <w:numFmt w:val="lowerRoman"/>
+      <w:lvlText w:val="%9."/>
+      <w:lvlJc w:val="right"/>
+      <w:pPr>
+        <w:ind w:left="6840" w:hanging="180"/>
+      </w:pPr>
+    </w:lvl>
+  </w:abstractNum>
+  <w:abstractNum w:abstractNumId="13" w15:restartNumberingAfterBreak="0">
     <w:nsid w:val="59CE71A2"/>
     <w:multiLevelType w:val="hybridMultilevel"/>
     <w:tmpl w:val="2670065E"/>
@@ -3909,7 +4204,93 @@
       </w:pPr>
     </w:lvl>
   </w:abstractNum>
-  <w:abstractNum w:abstractNumId="12" w15:restartNumberingAfterBreak="0">
+  <w:abstractNum w:abstractNumId="14" w15:restartNumberingAfterBreak="0">
+    <w:nsid w:val="5F5E5318"/>
+    <w:multiLevelType w:val="hybridMultilevel"/>
+    <w:tmpl w:val="13C02D62"/>
+    <w:lvl w:ilvl="0" w:tplc="040E000F">
+      <w:start w:val="1"/>
+      <w:numFmt w:val="decimal"/>
+      <w:lvlText w:val="%1."/>
+      <w:lvlJc w:val="left"/>
+      <w:pPr>
+        <w:ind w:left="720" w:hanging="360"/>
+      </w:pPr>
+    </w:lvl>
+    <w:lvl w:ilvl="1" w:tplc="040E0019" w:tentative="1">
+      <w:start w:val="1"/>
+      <w:numFmt w:val="lowerLetter"/>
+      <w:lvlText w:val="%2."/>
+      <w:lvlJc w:val="left"/>
+      <w:pPr>
+        <w:ind w:left="1440" w:hanging="360"/>
+      </w:pPr>
+    </w:lvl>
+    <w:lvl w:ilvl="2" w:tplc="040E001B" w:tentative="1">
+      <w:start w:val="1"/>
+      <w:numFmt w:val="lowerRoman"/>
+      <w:lvlText w:val="%3."/>
+      <w:lvlJc w:val="right"/>
+      <w:pPr>
+        <w:ind w:left="2160" w:hanging="180"/>
+      </w:pPr>
+    </w:lvl>
+    <w:lvl w:ilvl="3" w:tplc="040E000F" w:tentative="1">
+      <w:start w:val="1"/>
+      <w:numFmt w:val="decimal"/>
+      <w:lvlText w:val="%4."/>
+      <w:lvlJc w:val="left"/>
+      <w:pPr>
+        <w:ind w:left="2880" w:hanging="360"/>
+      </w:pPr>
+    </w:lvl>
+    <w:lvl w:ilvl="4" w:tplc="040E0019" w:tentative="1">
+      <w:start w:val="1"/>
+      <w:numFmt w:val="lowerLetter"/>
+      <w:lvlText w:val="%5."/>
+      <w:lvlJc w:val="left"/>
+      <w:pPr>
+        <w:ind w:left="3600" w:hanging="360"/>
+      </w:pPr>
+    </w:lvl>
+    <w:lvl w:ilvl="5" w:tplc="040E001B" w:tentative="1">
+      <w:start w:val="1"/>
+      <w:numFmt w:val="lowerRoman"/>
+      <w:lvlText w:val="%6."/>
+      <w:lvlJc w:val="right"/>
+      <w:pPr>
+        <w:ind w:left="4320" w:hanging="180"/>
+      </w:pPr>
+    </w:lvl>
+    <w:lvl w:ilvl="6" w:tplc="040E000F" w:tentative="1">
+      <w:start w:val="1"/>
+      <w:numFmt w:val="decimal"/>
+      <w:lvlText w:val="%7."/>
+      <w:lvlJc w:val="left"/>
+      <w:pPr>
+        <w:ind w:left="5040" w:hanging="360"/>
+      </w:pPr>
+    </w:lvl>
+    <w:lvl w:ilvl="7" w:tplc="040E0019" w:tentative="1">
+      <w:start w:val="1"/>
+      <w:numFmt w:val="lowerLetter"/>
+      <w:lvlText w:val="%8."/>
+      <w:lvlJc w:val="left"/>
+      <w:pPr>
+        <w:ind w:left="5760" w:hanging="360"/>
+      </w:pPr>
+    </w:lvl>
+    <w:lvl w:ilvl="8" w:tplc="040E001B" w:tentative="1">
+      <w:start w:val="1"/>
+      <w:numFmt w:val="lowerRoman"/>
+      <w:lvlText w:val="%9."/>
+      <w:lvlJc w:val="right"/>
+      <w:pPr>
+        <w:ind w:left="6480" w:hanging="180"/>
+      </w:pPr>
+    </w:lvl>
+  </w:abstractNum>
+  <w:abstractNum w:abstractNumId="15" w15:restartNumberingAfterBreak="0">
     <w:nsid w:val="614569D6"/>
     <w:multiLevelType w:val="multilevel"/>
     <w:tmpl w:val="28384650"/>
@@ -4022,7 +4403,7 @@
       </w:rPr>
     </w:lvl>
   </w:abstractNum>
-  <w:abstractNum w:abstractNumId="13" w15:restartNumberingAfterBreak="0">
+  <w:abstractNum w:abstractNumId="16" w15:restartNumberingAfterBreak="0">
     <w:nsid w:val="664C348A"/>
     <w:multiLevelType w:val="multilevel"/>
     <w:tmpl w:val="D6CE3398"/>
@@ -4135,7 +4516,7 @@
       </w:rPr>
     </w:lvl>
   </w:abstractNum>
-  <w:abstractNum w:abstractNumId="14" w15:restartNumberingAfterBreak="0">
+  <w:abstractNum w:abstractNumId="17" w15:restartNumberingAfterBreak="0">
     <w:nsid w:val="67806B2F"/>
     <w:multiLevelType w:val="multilevel"/>
     <w:tmpl w:val="29CA7CD0"/>
@@ -4248,7 +4629,7 @@
       </w:rPr>
     </w:lvl>
   </w:abstractNum>
-  <w:abstractNum w:abstractNumId="15" w15:restartNumberingAfterBreak="0">
+  <w:abstractNum w:abstractNumId="18" w15:restartNumberingAfterBreak="0">
     <w:nsid w:val="6C7C1F9F"/>
     <w:multiLevelType w:val="multilevel"/>
     <w:tmpl w:val="D6CE3398"/>
@@ -4361,38 +4742,124 @@
       </w:rPr>
     </w:lvl>
   </w:abstractNum>
+  <w:abstractNum w:abstractNumId="19" w15:restartNumberingAfterBreak="0">
+    <w:nsid w:val="7E3D30A6"/>
+    <w:multiLevelType w:val="hybridMultilevel"/>
+    <w:tmpl w:val="261C66E4"/>
+    <w:lvl w:ilvl="0" w:tplc="040E000F">
+      <w:start w:val="1"/>
+      <w:numFmt w:val="decimal"/>
+      <w:lvlText w:val="%1."/>
+      <w:lvlJc w:val="left"/>
+      <w:pPr>
+        <w:ind w:left="1080" w:hanging="360"/>
+      </w:pPr>
+    </w:lvl>
+    <w:lvl w:ilvl="1" w:tplc="040E0019" w:tentative="1">
+      <w:start w:val="1"/>
+      <w:numFmt w:val="lowerLetter"/>
+      <w:lvlText w:val="%2."/>
+      <w:lvlJc w:val="left"/>
+      <w:pPr>
+        <w:ind w:left="1800" w:hanging="360"/>
+      </w:pPr>
+    </w:lvl>
+    <w:lvl w:ilvl="2" w:tplc="040E001B" w:tentative="1">
+      <w:start w:val="1"/>
+      <w:numFmt w:val="lowerRoman"/>
+      <w:lvlText w:val="%3."/>
+      <w:lvlJc w:val="right"/>
+      <w:pPr>
+        <w:ind w:left="2520" w:hanging="180"/>
+      </w:pPr>
+    </w:lvl>
+    <w:lvl w:ilvl="3" w:tplc="040E000F" w:tentative="1">
+      <w:start w:val="1"/>
+      <w:numFmt w:val="decimal"/>
+      <w:lvlText w:val="%4."/>
+      <w:lvlJc w:val="left"/>
+      <w:pPr>
+        <w:ind w:left="3240" w:hanging="360"/>
+      </w:pPr>
+    </w:lvl>
+    <w:lvl w:ilvl="4" w:tplc="040E0019" w:tentative="1">
+      <w:start w:val="1"/>
+      <w:numFmt w:val="lowerLetter"/>
+      <w:lvlText w:val="%5."/>
+      <w:lvlJc w:val="left"/>
+      <w:pPr>
+        <w:ind w:left="3960" w:hanging="360"/>
+      </w:pPr>
+    </w:lvl>
+    <w:lvl w:ilvl="5" w:tplc="040E001B" w:tentative="1">
+      <w:start w:val="1"/>
+      <w:numFmt w:val="lowerRoman"/>
+      <w:lvlText w:val="%6."/>
+      <w:lvlJc w:val="right"/>
+      <w:pPr>
+        <w:ind w:left="4680" w:hanging="180"/>
+      </w:pPr>
+    </w:lvl>
+    <w:lvl w:ilvl="6" w:tplc="040E000F" w:tentative="1">
+      <w:start w:val="1"/>
+      <w:numFmt w:val="decimal"/>
+      <w:lvlText w:val="%7."/>
+      <w:lvlJc w:val="left"/>
+      <w:pPr>
+        <w:ind w:left="5400" w:hanging="360"/>
+      </w:pPr>
+    </w:lvl>
+    <w:lvl w:ilvl="7" w:tplc="040E0019" w:tentative="1">
+      <w:start w:val="1"/>
+      <w:numFmt w:val="lowerLetter"/>
+      <w:lvlText w:val="%8."/>
+      <w:lvlJc w:val="left"/>
+      <w:pPr>
+        <w:ind w:left="6120" w:hanging="360"/>
+      </w:pPr>
+    </w:lvl>
+    <w:lvl w:ilvl="8" w:tplc="040E001B" w:tentative="1">
+      <w:start w:val="1"/>
+      <w:numFmt w:val="lowerRoman"/>
+      <w:lvlText w:val="%9."/>
+      <w:lvlJc w:val="right"/>
+      <w:pPr>
+        <w:ind w:left="6840" w:hanging="180"/>
+      </w:pPr>
+    </w:lvl>
+  </w:abstractNum>
   <w:num w:numId="1" w16cid:durableId="1233076023">
-    <w:abstractNumId w:val="14"/>
+    <w:abstractNumId w:val="17"/>
   </w:num>
   <w:num w:numId="2" w16cid:durableId="1414087422">
     <w:abstractNumId w:val="2"/>
   </w:num>
   <w:num w:numId="3" w16cid:durableId="1123037156">
-    <w:abstractNumId w:val="12"/>
+    <w:abstractNumId w:val="15"/>
   </w:num>
   <w:num w:numId="4" w16cid:durableId="444154542">
-    <w:abstractNumId w:val="9"/>
+    <w:abstractNumId w:val="10"/>
   </w:num>
   <w:num w:numId="5" w16cid:durableId="1761179973">
+    <w:abstractNumId w:val="5"/>
+  </w:num>
+  <w:num w:numId="6" w16cid:durableId="967398896">
+    <w:abstractNumId w:val="7"/>
+  </w:num>
+  <w:num w:numId="7" w16cid:durableId="1673608718">
+    <w:abstractNumId w:val="18"/>
+  </w:num>
+  <w:num w:numId="8" w16cid:durableId="1762413007">
+    <w:abstractNumId w:val="11"/>
+  </w:num>
+  <w:num w:numId="9" w16cid:durableId="477116714">
+    <w:abstractNumId w:val="6"/>
+  </w:num>
+  <w:num w:numId="10" w16cid:durableId="421411527">
     <w:abstractNumId w:val="4"/>
   </w:num>
-  <w:num w:numId="6" w16cid:durableId="967398896">
-    <w:abstractNumId w:val="6"/>
-  </w:num>
-  <w:num w:numId="7" w16cid:durableId="1673608718">
-    <w:abstractNumId w:val="15"/>
-  </w:num>
-  <w:num w:numId="8" w16cid:durableId="1762413007">
-    <w:abstractNumId w:val="10"/>
-  </w:num>
-  <w:num w:numId="9" w16cid:durableId="477116714">
-    <w:abstractNumId w:val="5"/>
-  </w:num>
-  <w:num w:numId="10" w16cid:durableId="421411527">
-    <w:abstractNumId w:val="3"/>
-  </w:num>
   <w:num w:numId="11" w16cid:durableId="1893493311">
-    <w:abstractNumId w:val="7"/>
+    <w:abstractNumId w:val="8"/>
   </w:num>
   <w:num w:numId="12" w16cid:durableId="396054200">
     <w:abstractNumId w:val="1"/>
@@ -4401,13 +4868,25 @@
     <w:abstractNumId w:val="0"/>
   </w:num>
   <w:num w:numId="14" w16cid:durableId="455678179">
+    <w:abstractNumId w:val="16"/>
+  </w:num>
+  <w:num w:numId="15" w16cid:durableId="2119986652">
     <w:abstractNumId w:val="13"/>
   </w:num>
-  <w:num w:numId="15" w16cid:durableId="2119986652">
-    <w:abstractNumId w:val="11"/>
+  <w:num w:numId="16" w16cid:durableId="2101952073">
+    <w:abstractNumId w:val="9"/>
   </w:num>
-  <w:num w:numId="16" w16cid:durableId="2101952073">
-    <w:abstractNumId w:val="8"/>
+  <w:num w:numId="17" w16cid:durableId="1398016576">
+    <w:abstractNumId w:val="14"/>
+  </w:num>
+  <w:num w:numId="18" w16cid:durableId="647169071">
+    <w:abstractNumId w:val="3"/>
+  </w:num>
+  <w:num w:numId="19" w16cid:durableId="799887241">
+    <w:abstractNumId w:val="19"/>
+  </w:num>
+  <w:num w:numId="20" w16cid:durableId="1297565942">
+    <w:abstractNumId w:val="12"/>
   </w:num>
 </w:numbering>
 </file>

</xml_diff>

<commit_message>
Tesztdokumenáció teljesítve, a dokumentáció módosítása
</commit_message>
<xml_diff>
--- a/Borsod Coding - For the potato.docx
+++ b/Borsod Coding - For the potato.docx
@@ -1,6 +1,6 @@
 
 <file path=word/document.xml><?xml version="1.0" encoding="utf-8"?>
-<w:document xmlns:wpc="http://schemas.microsoft.com/office/word/2010/wordprocessingCanvas" xmlns:cx="http://schemas.microsoft.com/office/drawing/2014/chartex" xmlns:cx1="http://schemas.microsoft.com/office/drawing/2015/9/8/chartex" xmlns:mc="http://schemas.openxmlformats.org/markup-compatibility/2006" xmlns:o="urn:schemas-microsoft-com:office:office" xmlns:r="http://schemas.openxmlformats.org/officeDocument/2006/relationships" xmlns:m="http://schemas.openxmlformats.org/officeDocument/2006/math" xmlns:v="urn:schemas-microsoft-com:vml" xmlns:wp14="http://schemas.microsoft.com/office/word/2010/wordprocessingDrawing" xmlns:wp="http://schemas.openxmlformats.org/drawingml/2006/wordprocessingDrawing" xmlns:w10="urn:schemas-microsoft-com:office:word" xmlns:w="http://schemas.openxmlformats.org/wordprocessingml/2006/main" xmlns:w14="http://schemas.microsoft.com/office/word/2010/wordml" xmlns:w15="http://schemas.microsoft.com/office/word/2012/wordml" xmlns:w16se="http://schemas.microsoft.com/office/word/2015/wordml/symex" xmlns:wpg="http://schemas.microsoft.com/office/word/2010/wordprocessingGroup" xmlns:wpi="http://schemas.microsoft.com/office/word/2010/wordprocessingInk" xmlns:wne="http://schemas.microsoft.com/office/word/2006/wordml" xmlns:wps="http://schemas.microsoft.com/office/word/2010/wordprocessingShape" mc:Ignorable="w14 w15 w16se wp14">
+<w:document xmlns:wpc="http://schemas.microsoft.com/office/word/2010/wordprocessingCanvas" xmlns:cx="http://schemas.microsoft.com/office/drawing/2014/chartex" xmlns:cx1="http://schemas.microsoft.com/office/drawing/2015/9/8/chartex" xmlns:cx2="http://schemas.microsoft.com/office/drawing/2015/10/21/chartex" xmlns:cx3="http://schemas.microsoft.com/office/drawing/2016/5/9/chartex" xmlns:cx4="http://schemas.microsoft.com/office/drawing/2016/5/10/chartex" xmlns:cx5="http://schemas.microsoft.com/office/drawing/2016/5/11/chartex" xmlns:cx6="http://schemas.microsoft.com/office/drawing/2016/5/12/chartex" xmlns:cx7="http://schemas.microsoft.com/office/drawing/2016/5/13/chartex" xmlns:cx8="http://schemas.microsoft.com/office/drawing/2016/5/14/chartex" xmlns:mc="http://schemas.openxmlformats.org/markup-compatibility/2006" xmlns:aink="http://schemas.microsoft.com/office/drawing/2016/ink" xmlns:am3d="http://schemas.microsoft.com/office/drawing/2017/model3d" xmlns:o="urn:schemas-microsoft-com:office:office" xmlns:oel="http://schemas.microsoft.com/office/2019/extlst" xmlns:r="http://schemas.openxmlformats.org/officeDocument/2006/relationships" xmlns:m="http://schemas.openxmlformats.org/officeDocument/2006/math" xmlns:v="urn:schemas-microsoft-com:vml" xmlns:wp14="http://schemas.microsoft.com/office/word/2010/wordprocessingDrawing" xmlns:wp="http://schemas.openxmlformats.org/drawingml/2006/wordprocessingDrawing" xmlns:w10="urn:schemas-microsoft-com:office:word" xmlns:w="http://schemas.openxmlformats.org/wordprocessingml/2006/main" xmlns:w14="http://schemas.microsoft.com/office/word/2010/wordml" xmlns:w15="http://schemas.microsoft.com/office/word/2012/wordml" xmlns:w16cex="http://schemas.microsoft.com/office/word/2018/wordml/cex" xmlns:w16cid="http://schemas.microsoft.com/office/word/2016/wordml/cid" xmlns:w16="http://schemas.microsoft.com/office/word/2018/wordml" xmlns:w16du="http://schemas.microsoft.com/office/word/2023/wordml/word16du" xmlns:w16sdtdh="http://schemas.microsoft.com/office/word/2020/wordml/sdtdatahash" xmlns:w16sdtfl="http://schemas.microsoft.com/office/word/2024/wordml/sdtformatlock" xmlns:w16se="http://schemas.microsoft.com/office/word/2015/wordml/symex" xmlns:wpg="http://schemas.microsoft.com/office/word/2010/wordprocessingGroup" xmlns:wpi="http://schemas.microsoft.com/office/word/2010/wordprocessingInk" xmlns:wne="http://schemas.microsoft.com/office/word/2006/wordml" xmlns:wps="http://schemas.microsoft.com/office/word/2010/wordprocessingShape" mc:Ignorable="w14 w15 w16se w16cid w16 w16cex w16sdtdh w16sdtfl w16du wp14">
   <w:body>
     <w:p>
       <w:pPr>
@@ -756,7 +756,6 @@
           <w:lang w:val="hu-HU"/>
         </w:rPr>
       </w:pPr>
-      <w:proofErr w:type="gramStart"/>
       <w:r>
         <w:rPr>
           <w:rFonts w:ascii="Times New Roman" w:hAnsi="Times New Roman" w:cs="Times New Roman"/>
@@ -765,18 +764,7 @@
           <w:szCs w:val="48"/>
           <w:lang w:val="hu-HU"/>
         </w:rPr>
-        <w:t>tudnivalók</w:t>
-      </w:r>
-      <w:proofErr w:type="gramEnd"/>
-      <w:r>
-        <w:rPr>
-          <w:rFonts w:ascii="Times New Roman" w:hAnsi="Times New Roman" w:cs="Times New Roman"/>
-          <w:snapToGrid w:val="0"/>
-          <w:sz w:val="48"/>
-          <w:szCs w:val="48"/>
-          <w:lang w:val="hu-HU"/>
-        </w:rPr>
-        <w:t xml:space="preserve"> a záródolgozathoz</w:t>
+        <w:t>tudnivalók a záródolgozathoz</w:t>
       </w:r>
     </w:p>
     <w:p>
@@ -958,7 +946,7 @@
             </w:rPr>
             <w:fldChar w:fldCharType="separate"/>
           </w:r>
-          <w:hyperlink w:anchor="_Toc227053844" w:history="1">
+          <w:hyperlink w:anchor="_Toc227104184" w:history="1">
             <w:r>
               <w:rPr>
                 <w:rStyle w:val="Hiperhivatkozs"/>
@@ -987,7 +975,7 @@
                 <w:noProof/>
                 <w:webHidden/>
               </w:rPr>
-              <w:instrText xml:space="preserve"> PAGEREF _Toc227053844 \h </w:instrText>
+              <w:instrText xml:space="preserve"> PAGEREF _Toc227104184 \h </w:instrText>
             </w:r>
             <w:r>
               <w:rPr>
@@ -1033,7 +1021,7 @@
               <w14:ligatures w14:val="standardContextual"/>
             </w:rPr>
           </w:pPr>
-          <w:hyperlink w:anchor="_Toc227053845" w:history="1">
+          <w:hyperlink w:anchor="_Toc227104185" w:history="1">
             <w:r>
               <w:rPr>
                 <w:rStyle w:val="Hiperhivatkozs"/>
@@ -1062,7 +1050,7 @@
                 <w:noProof/>
                 <w:webHidden/>
               </w:rPr>
-              <w:instrText xml:space="preserve"> PAGEREF _Toc227053845 \h </w:instrText>
+              <w:instrText xml:space="preserve"> PAGEREF _Toc227104185 \h </w:instrText>
             </w:r>
             <w:r>
               <w:rPr>
@@ -1108,7 +1096,7 @@
               <w14:ligatures w14:val="standardContextual"/>
             </w:rPr>
           </w:pPr>
-          <w:hyperlink w:anchor="_Toc227053846" w:history="1">
+          <w:hyperlink w:anchor="_Toc227104186" w:history="1">
             <w:r>
               <w:rPr>
                 <w:rStyle w:val="Hiperhivatkozs"/>
@@ -1137,7 +1125,7 @@
                 <w:noProof/>
                 <w:webHidden/>
               </w:rPr>
-              <w:instrText xml:space="preserve"> PAGEREF _Toc227053846 \h </w:instrText>
+              <w:instrText xml:space="preserve"> PAGEREF _Toc227104186 \h </w:instrText>
             </w:r>
             <w:r>
               <w:rPr>
@@ -1183,7 +1171,7 @@
               <w14:ligatures w14:val="standardContextual"/>
             </w:rPr>
           </w:pPr>
-          <w:hyperlink w:anchor="_Toc227053847" w:history="1">
+          <w:hyperlink w:anchor="_Toc227104187" w:history="1">
             <w:r>
               <w:rPr>
                 <w:rStyle w:val="Hiperhivatkozs"/>
@@ -1212,7 +1200,7 @@
                 <w:noProof/>
                 <w:webHidden/>
               </w:rPr>
-              <w:instrText xml:space="preserve"> PAGEREF _Toc227053847 \h </w:instrText>
+              <w:instrText xml:space="preserve"> PAGEREF _Toc227104187 \h </w:instrText>
             </w:r>
             <w:r>
               <w:rPr>
@@ -1258,7 +1246,7 @@
               <w14:ligatures w14:val="standardContextual"/>
             </w:rPr>
           </w:pPr>
-          <w:hyperlink w:anchor="_Toc227053848" w:history="1">
+          <w:hyperlink w:anchor="_Toc227104188" w:history="1">
             <w:r>
               <w:rPr>
                 <w:rStyle w:val="Hiperhivatkozs"/>
@@ -1287,7 +1275,7 @@
                 <w:noProof/>
                 <w:webHidden/>
               </w:rPr>
-              <w:instrText xml:space="preserve"> PAGEREF _Toc227053848 \h </w:instrText>
+              <w:instrText xml:space="preserve"> PAGEREF _Toc227104188 \h </w:instrText>
             </w:r>
             <w:r>
               <w:rPr>
@@ -1333,7 +1321,7 @@
               <w14:ligatures w14:val="standardContextual"/>
             </w:rPr>
           </w:pPr>
-          <w:hyperlink w:anchor="_Toc227053849" w:history="1">
+          <w:hyperlink w:anchor="_Toc227104189" w:history="1">
             <w:r>
               <w:rPr>
                 <w:rStyle w:val="Hiperhivatkozs"/>
@@ -1362,7 +1350,81 @@
                 <w:noProof/>
                 <w:webHidden/>
               </w:rPr>
-              <w:instrText xml:space="preserve"> PAGEREF _Toc227053849 \h </w:instrText>
+              <w:instrText xml:space="preserve"> PAGEREF _Toc227104189 \h </w:instrText>
+            </w:r>
+            <w:r>
+              <w:rPr>
+                <w:noProof/>
+                <w:webHidden/>
+              </w:rPr>
+            </w:r>
+            <w:r>
+              <w:rPr>
+                <w:noProof/>
+                <w:webHidden/>
+              </w:rPr>
+              <w:fldChar w:fldCharType="separate"/>
+            </w:r>
+            <w:r>
+              <w:rPr>
+                <w:noProof/>
+                <w:webHidden/>
+              </w:rPr>
+              <w:t>9</w:t>
+            </w:r>
+            <w:r>
+              <w:rPr>
+                <w:noProof/>
+                <w:webHidden/>
+              </w:rPr>
+              <w:fldChar w:fldCharType="end"/>
+            </w:r>
+          </w:hyperlink>
+        </w:p>
+        <w:p>
+          <w:pPr>
+            <w:pStyle w:val="TJ1"/>
+            <w:tabs>
+              <w:tab w:val="right" w:leader="dot" w:pos="9062"/>
+            </w:tabs>
+            <w:rPr>
+              <w:rFonts w:asciiTheme="minorHAnsi" w:eastAsiaTheme="minorEastAsia" w:hAnsiTheme="minorHAnsi" w:cstheme="minorBidi"/>
+              <w:noProof/>
+              <w:kern w:val="2"/>
+              <w:szCs w:val="24"/>
+              <w:lang w:val="hu-HU" w:eastAsia="hu-HU"/>
+              <w14:ligatures w14:val="standardContextual"/>
+            </w:rPr>
+          </w:pPr>
+          <w:hyperlink w:anchor="_Toc227104190" w:history="1">
+            <w:r>
+              <w:rPr>
+                <w:rStyle w:val="Hiperhivatkozs"/>
+                <w:rFonts w:ascii="Times New Roman" w:hAnsi="Times New Roman" w:cs="Times New Roman"/>
+                <w:noProof/>
+              </w:rPr>
+              <w:t>Irodalomjegyzék</w:t>
+            </w:r>
+            <w:r>
+              <w:rPr>
+                <w:noProof/>
+                <w:webHidden/>
+              </w:rPr>
+              <w:tab/>
+            </w:r>
+            <w:r>
+              <w:rPr>
+                <w:noProof/>
+                <w:webHidden/>
+              </w:rPr>
+              <w:fldChar w:fldCharType="begin"/>
+            </w:r>
+            <w:r>
+              <w:rPr>
+                <w:noProof/>
+                <w:webHidden/>
+              </w:rPr>
+              <w:instrText xml:space="preserve"> PAGEREF _Toc227104190 \h </w:instrText>
             </w:r>
             <w:r>
               <w:rPr>
@@ -1408,81 +1470,7 @@
               <w14:ligatures w14:val="standardContextual"/>
             </w:rPr>
           </w:pPr>
-          <w:hyperlink w:anchor="_Toc227053850" w:history="1">
-            <w:r>
-              <w:rPr>
-                <w:rStyle w:val="Hiperhivatkozs"/>
-                <w:rFonts w:ascii="Times New Roman" w:hAnsi="Times New Roman" w:cs="Times New Roman"/>
-                <w:noProof/>
-              </w:rPr>
-              <w:t>Irodalomjegyzék</w:t>
-            </w:r>
-            <w:r>
-              <w:rPr>
-                <w:noProof/>
-                <w:webHidden/>
-              </w:rPr>
-              <w:tab/>
-            </w:r>
-            <w:r>
-              <w:rPr>
-                <w:noProof/>
-                <w:webHidden/>
-              </w:rPr>
-              <w:fldChar w:fldCharType="begin"/>
-            </w:r>
-            <w:r>
-              <w:rPr>
-                <w:noProof/>
-                <w:webHidden/>
-              </w:rPr>
-              <w:instrText xml:space="preserve"> PAGEREF _Toc227053850 \h </w:instrText>
-            </w:r>
-            <w:r>
-              <w:rPr>
-                <w:noProof/>
-                <w:webHidden/>
-              </w:rPr>
-            </w:r>
-            <w:r>
-              <w:rPr>
-                <w:noProof/>
-                <w:webHidden/>
-              </w:rPr>
-              <w:fldChar w:fldCharType="separate"/>
-            </w:r>
-            <w:r>
-              <w:rPr>
-                <w:noProof/>
-                <w:webHidden/>
-              </w:rPr>
-              <w:t>11</w:t>
-            </w:r>
-            <w:r>
-              <w:rPr>
-                <w:noProof/>
-                <w:webHidden/>
-              </w:rPr>
-              <w:fldChar w:fldCharType="end"/>
-            </w:r>
-          </w:hyperlink>
-        </w:p>
-        <w:p>
-          <w:pPr>
-            <w:pStyle w:val="TJ1"/>
-            <w:tabs>
-              <w:tab w:val="right" w:leader="dot" w:pos="9062"/>
-            </w:tabs>
-            <w:rPr>
-              <w:rFonts w:asciiTheme="minorHAnsi" w:eastAsiaTheme="minorEastAsia" w:hAnsiTheme="minorHAnsi" w:cstheme="minorBidi"/>
-              <w:noProof/>
-              <w:kern w:val="2"/>
-              <w:szCs w:val="24"/>
-              <w:lang w:val="hu-HU" w:eastAsia="hu-HU"/>
-              <w14:ligatures w14:val="standardContextual"/>
-            </w:rPr>
-          </w:pPr>
-          <w:hyperlink w:anchor="_Toc227053851" w:history="1">
+          <w:hyperlink w:anchor="_Toc227104191" w:history="1">
             <w:r>
               <w:rPr>
                 <w:rStyle w:val="Hiperhivatkozs"/>
@@ -1511,7 +1499,7 @@
                 <w:noProof/>
                 <w:webHidden/>
               </w:rPr>
-              <w:instrText xml:space="preserve"> PAGEREF _Toc227053851 \h </w:instrText>
+              <w:instrText xml:space="preserve"> PAGEREF _Toc227104191 \h </w:instrText>
             </w:r>
             <w:r>
               <w:rPr>
@@ -1557,7 +1545,7 @@
               <w14:ligatures w14:val="standardContextual"/>
             </w:rPr>
           </w:pPr>
-          <w:hyperlink w:anchor="_Toc227053852" w:history="1">
+          <w:hyperlink w:anchor="_Toc227104192" w:history="1">
             <w:r>
               <w:rPr>
                 <w:rStyle w:val="Hiperhivatkozs"/>
@@ -1586,7 +1574,7 @@
                 <w:noProof/>
                 <w:webHidden/>
               </w:rPr>
-              <w:instrText xml:space="preserve"> PAGEREF _Toc227053852 \h </w:instrText>
+              <w:instrText xml:space="preserve"> PAGEREF _Toc227104192 \h </w:instrText>
             </w:r>
             <w:r>
               <w:rPr>
@@ -1632,7 +1620,7 @@
               <w14:ligatures w14:val="standardContextual"/>
             </w:rPr>
           </w:pPr>
-          <w:hyperlink w:anchor="_Toc227053853" w:history="1">
+          <w:hyperlink w:anchor="_Toc227104193" w:history="1">
             <w:r>
               <w:rPr>
                 <w:rStyle w:val="Hiperhivatkozs"/>
@@ -1661,7 +1649,7 @@
                 <w:noProof/>
                 <w:webHidden/>
               </w:rPr>
-              <w:instrText xml:space="preserve"> PAGEREF _Toc227053853 \h </w:instrText>
+              <w:instrText xml:space="preserve"> PAGEREF _Toc227104193 \h </w:instrText>
             </w:r>
             <w:r>
               <w:rPr>
@@ -1707,7 +1695,7 @@
               <w14:ligatures w14:val="standardContextual"/>
             </w:rPr>
           </w:pPr>
-          <w:hyperlink w:anchor="_Toc227053854" w:history="1">
+          <w:hyperlink w:anchor="_Toc227104194" w:history="1">
             <w:r>
               <w:rPr>
                 <w:rStyle w:val="Hiperhivatkozs"/>
@@ -1736,7 +1724,7 @@
                 <w:noProof/>
                 <w:webHidden/>
               </w:rPr>
-              <w:instrText xml:space="preserve"> PAGEREF _Toc227053854 \h </w:instrText>
+              <w:instrText xml:space="preserve"> PAGEREF _Toc227104194 \h </w:instrText>
             </w:r>
             <w:r>
               <w:rPr>
@@ -1782,7 +1770,7 @@
               <w14:ligatures w14:val="standardContextual"/>
             </w:rPr>
           </w:pPr>
-          <w:hyperlink w:anchor="_Toc227053855" w:history="1">
+          <w:hyperlink w:anchor="_Toc227104195" w:history="1">
             <w:r>
               <w:rPr>
                 <w:rStyle w:val="Hiperhivatkozs"/>
@@ -1811,7 +1799,7 @@
                 <w:noProof/>
                 <w:webHidden/>
               </w:rPr>
-              <w:instrText xml:space="preserve"> PAGEREF _Toc227053855 \h </w:instrText>
+              <w:instrText xml:space="preserve"> PAGEREF _Toc227104195 \h </w:instrText>
             </w:r>
             <w:r>
               <w:rPr>
@@ -1844,6 +1832,228 @@
         </w:p>
         <w:p>
           <w:pPr>
+            <w:pStyle w:val="TJ1"/>
+            <w:tabs>
+              <w:tab w:val="right" w:leader="dot" w:pos="9062"/>
+            </w:tabs>
+            <w:rPr>
+              <w:rFonts w:asciiTheme="minorHAnsi" w:eastAsiaTheme="minorEastAsia" w:hAnsiTheme="minorHAnsi" w:cstheme="minorBidi"/>
+              <w:noProof/>
+              <w:kern w:val="2"/>
+              <w:szCs w:val="24"/>
+              <w:lang w:val="hu-HU" w:eastAsia="hu-HU"/>
+              <w14:ligatures w14:val="standardContextual"/>
+            </w:rPr>
+          </w:pPr>
+          <w:hyperlink w:anchor="_Toc227104196" w:history="1">
+            <w:r>
+              <w:rPr>
+                <w:rStyle w:val="Hiperhivatkozs"/>
+                <w:noProof/>
+                <w:lang w:val="hu-HU"/>
+              </w:rPr>
+              <w:t>Sweagger UI</w:t>
+            </w:r>
+            <w:r>
+              <w:rPr>
+                <w:noProof/>
+                <w:webHidden/>
+              </w:rPr>
+              <w:tab/>
+            </w:r>
+            <w:r>
+              <w:rPr>
+                <w:noProof/>
+                <w:webHidden/>
+              </w:rPr>
+              <w:fldChar w:fldCharType="begin"/>
+            </w:r>
+            <w:r>
+              <w:rPr>
+                <w:noProof/>
+                <w:webHidden/>
+              </w:rPr>
+              <w:instrText xml:space="preserve"> PAGEREF _Toc227104196 \h </w:instrText>
+            </w:r>
+            <w:r>
+              <w:rPr>
+                <w:noProof/>
+                <w:webHidden/>
+              </w:rPr>
+            </w:r>
+            <w:r>
+              <w:rPr>
+                <w:noProof/>
+                <w:webHidden/>
+              </w:rPr>
+              <w:fldChar w:fldCharType="separate"/>
+            </w:r>
+            <w:r>
+              <w:rPr>
+                <w:noProof/>
+                <w:webHidden/>
+              </w:rPr>
+              <w:t>VI</w:t>
+            </w:r>
+            <w:r>
+              <w:rPr>
+                <w:noProof/>
+                <w:webHidden/>
+              </w:rPr>
+              <w:fldChar w:fldCharType="end"/>
+            </w:r>
+          </w:hyperlink>
+        </w:p>
+        <w:p>
+          <w:pPr>
+            <w:pStyle w:val="TJ1"/>
+            <w:tabs>
+              <w:tab w:val="right" w:leader="dot" w:pos="9062"/>
+            </w:tabs>
+            <w:rPr>
+              <w:rFonts w:asciiTheme="minorHAnsi" w:eastAsiaTheme="minorEastAsia" w:hAnsiTheme="minorHAnsi" w:cstheme="minorBidi"/>
+              <w:noProof/>
+              <w:kern w:val="2"/>
+              <w:szCs w:val="24"/>
+              <w:lang w:val="hu-HU" w:eastAsia="hu-HU"/>
+              <w14:ligatures w14:val="standardContextual"/>
+            </w:rPr>
+          </w:pPr>
+          <w:hyperlink w:anchor="_Toc227104197" w:history="1">
+            <w:r>
+              <w:rPr>
+                <w:rStyle w:val="Hiperhivatkozs"/>
+                <w:noProof/>
+                <w:lang w:val="hu-HU"/>
+              </w:rPr>
+              <w:t>Xampp MySQL</w:t>
+            </w:r>
+            <w:r>
+              <w:rPr>
+                <w:noProof/>
+                <w:webHidden/>
+              </w:rPr>
+              <w:tab/>
+            </w:r>
+            <w:r>
+              <w:rPr>
+                <w:noProof/>
+                <w:webHidden/>
+              </w:rPr>
+              <w:fldChar w:fldCharType="begin"/>
+            </w:r>
+            <w:r>
+              <w:rPr>
+                <w:noProof/>
+                <w:webHidden/>
+              </w:rPr>
+              <w:instrText xml:space="preserve"> PAGEREF _Toc227104197 \h </w:instrText>
+            </w:r>
+            <w:r>
+              <w:rPr>
+                <w:noProof/>
+                <w:webHidden/>
+              </w:rPr>
+            </w:r>
+            <w:r>
+              <w:rPr>
+                <w:noProof/>
+                <w:webHidden/>
+              </w:rPr>
+              <w:fldChar w:fldCharType="separate"/>
+            </w:r>
+            <w:r>
+              <w:rPr>
+                <w:noProof/>
+                <w:webHidden/>
+              </w:rPr>
+              <w:t>VII</w:t>
+            </w:r>
+            <w:r>
+              <w:rPr>
+                <w:noProof/>
+                <w:webHidden/>
+              </w:rPr>
+              <w:fldChar w:fldCharType="end"/>
+            </w:r>
+          </w:hyperlink>
+        </w:p>
+        <w:p>
+          <w:pPr>
+            <w:pStyle w:val="TJ1"/>
+            <w:tabs>
+              <w:tab w:val="right" w:leader="dot" w:pos="9062"/>
+            </w:tabs>
+            <w:rPr>
+              <w:rFonts w:asciiTheme="minorHAnsi" w:eastAsiaTheme="minorEastAsia" w:hAnsiTheme="minorHAnsi" w:cstheme="minorBidi"/>
+              <w:noProof/>
+              <w:kern w:val="2"/>
+              <w:szCs w:val="24"/>
+              <w:lang w:val="hu-HU" w:eastAsia="hu-HU"/>
+              <w14:ligatures w14:val="standardContextual"/>
+            </w:rPr>
+          </w:pPr>
+          <w:hyperlink w:anchor="_Toc227104198" w:history="1">
+            <w:r>
+              <w:rPr>
+                <w:rStyle w:val="Hiperhivatkozs"/>
+                <w:noProof/>
+                <w:lang w:val="hu-HU"/>
+              </w:rPr>
+              <w:t>Index.jsx</w:t>
+            </w:r>
+            <w:r>
+              <w:rPr>
+                <w:noProof/>
+                <w:webHidden/>
+              </w:rPr>
+              <w:tab/>
+            </w:r>
+            <w:r>
+              <w:rPr>
+                <w:noProof/>
+                <w:webHidden/>
+              </w:rPr>
+              <w:fldChar w:fldCharType="begin"/>
+            </w:r>
+            <w:r>
+              <w:rPr>
+                <w:noProof/>
+                <w:webHidden/>
+              </w:rPr>
+              <w:instrText xml:space="preserve"> PAGEREF _Toc227104198 \h </w:instrText>
+            </w:r>
+            <w:r>
+              <w:rPr>
+                <w:noProof/>
+                <w:webHidden/>
+              </w:rPr>
+            </w:r>
+            <w:r>
+              <w:rPr>
+                <w:noProof/>
+                <w:webHidden/>
+              </w:rPr>
+              <w:fldChar w:fldCharType="separate"/>
+            </w:r>
+            <w:r>
+              <w:rPr>
+                <w:noProof/>
+                <w:webHidden/>
+              </w:rPr>
+              <w:t>VIII</w:t>
+            </w:r>
+            <w:r>
+              <w:rPr>
+                <w:noProof/>
+                <w:webHidden/>
+              </w:rPr>
+              <w:fldChar w:fldCharType="end"/>
+            </w:r>
+          </w:hyperlink>
+        </w:p>
+        <w:p>
+          <w:pPr>
             <w:rPr>
               <w:rFonts w:ascii="Times New Roman" w:hAnsi="Times New Roman" w:cs="Times New Roman"/>
             </w:rPr>
@@ -1899,7 +2109,7 @@
           <w:lang w:val="hu-HU"/>
         </w:rPr>
       </w:pPr>
-      <w:bookmarkStart w:id="0" w:name="_Toc227053844"/>
+      <w:bookmarkStart w:id="0" w:name="_Toc227104184"/>
       <w:r>
         <w:rPr>
           <w:rFonts w:ascii="Times New Roman" w:hAnsi="Times New Roman" w:cs="Times New Roman"/>
@@ -2497,19 +2707,8 @@
           <w:szCs w:val="24"/>
           <w:lang w:val="hu" w:eastAsia="hu-HU"/>
         </w:rPr>
-        <w:t xml:space="preserve"> lesz éhes</w:t>
-      </w:r>
-      <w:proofErr w:type="gramStart"/>
-      <w:r>
-        <w:rPr>
-          <w:rFonts w:ascii="Times New Roman" w:eastAsia="Calibri" w:hAnsi="Times New Roman" w:cs="Times New Roman"/>
-          <w:color w:val="000000"/>
-          <w:szCs w:val="24"/>
-          <w:lang w:val="hu" w:eastAsia="hu-HU"/>
-        </w:rPr>
-        <w:t>...</w:t>
-      </w:r>
-      <w:proofErr w:type="gramEnd"/>
+        <w:t xml:space="preserve"> lesz éhes...</w:t>
+      </w:r>
     </w:p>
     <w:p>
       <w:pPr>
@@ -2734,19 +2933,8 @@
           <w:szCs w:val="24"/>
           <w:lang w:val="hu" w:eastAsia="hu-HU"/>
         </w:rPr>
-        <w:t xml:space="preserve">Ezután megjelenik a játék </w:t>
-      </w:r>
-      <w:proofErr w:type="spellStart"/>
-      <w:r>
-        <w:rPr>
-          <w:rFonts w:ascii="Times New Roman" w:eastAsia="Calibri" w:hAnsi="Times New Roman" w:cs="Times New Roman"/>
-          <w:color w:val="000000"/>
-          <w:szCs w:val="24"/>
-          <w:lang w:val="hu" w:eastAsia="hu-HU"/>
-        </w:rPr>
-        <w:t>főmenüje</w:t>
-      </w:r>
-      <w:proofErr w:type="spellEnd"/>
+        <w:t>Ezután megjelenik a játék főmenüje</w:t>
+      </w:r>
       <w:r>
         <w:rPr>
           <w:rFonts w:ascii="Times New Roman" w:eastAsia="Calibri" w:hAnsi="Times New Roman" w:cs="Times New Roman"/>
@@ -3810,7 +3998,7 @@
           <w:lang w:val="hu-HU"/>
         </w:rPr>
       </w:pPr>
-      <w:bookmarkStart w:id="1" w:name="_Toc227053845"/>
+      <w:bookmarkStart w:id="1" w:name="_Toc227104185"/>
       <w:r>
         <w:rPr>
           <w:rFonts w:ascii="Times New Roman" w:hAnsi="Times New Roman" w:cs="Times New Roman"/>
@@ -4059,7 +4247,7 @@
           <w:szCs w:val="24"/>
           <w:lang w:val="hu" w:eastAsia="hu-HU"/>
         </w:rPr>
-        <w:t xml:space="preserve"> fordítóprogramnak a </w:t>
+        <w:t xml:space="preserve"> fordítóprogram </w:t>
       </w:r>
       <w:proofErr w:type="spellStart"/>
       <w:r>
@@ -4079,7 +4267,34 @@
           <w:szCs w:val="24"/>
           <w:lang w:val="hu" w:eastAsia="hu-HU"/>
         </w:rPr>
-        <w:t xml:space="preserve">, és a játékunknak a felépítője is, ami a </w:t>
+        <w:t xml:space="preserve"> által </w:t>
+      </w:r>
+      <w:r>
+        <w:rPr>
+          <w:rFonts w:ascii="Times New Roman" w:eastAsia="Calibri" w:hAnsi="Times New Roman" w:cs="Times New Roman"/>
+          <w:color w:val="000000"/>
+          <w:szCs w:val="24"/>
+          <w:lang w:val="hu" w:eastAsia="hu-HU"/>
+        </w:rPr>
+        <w:t>a játékunk felépítője</w:t>
+      </w:r>
+      <w:r>
+        <w:rPr>
+          <w:rFonts w:ascii="Times New Roman" w:eastAsia="Calibri" w:hAnsi="Times New Roman" w:cs="Times New Roman"/>
+          <w:color w:val="000000"/>
+          <w:szCs w:val="24"/>
+          <w:lang w:val="hu" w:eastAsia="hu-HU"/>
+        </w:rPr>
+        <w:t>,</w:t>
+      </w:r>
+      <w:r>
+        <w:rPr>
+          <w:rFonts w:ascii="Times New Roman" w:eastAsia="Calibri" w:hAnsi="Times New Roman" w:cs="Times New Roman"/>
+          <w:color w:val="000000"/>
+          <w:szCs w:val="24"/>
+          <w:lang w:val="hu" w:eastAsia="hu-HU"/>
+        </w:rPr>
+        <w:t xml:space="preserve"> ami a </w:t>
       </w:r>
       <w:proofErr w:type="spellStart"/>
       <w:r>
@@ -4332,14 +4547,6 @@
         </w:rPr>
       </w:pPr>
       <w:proofErr w:type="spellStart"/>
-      <w:r>
-        <w:rPr>
-          <w:rFonts w:ascii="Times New Roman" w:eastAsia="Calibri" w:hAnsi="Times New Roman" w:cs="Times New Roman"/>
-          <w:szCs w:val="24"/>
-          <w:lang w:val="hu" w:eastAsia="hu-HU"/>
-        </w:rPr>
-        <w:t>Microsoft</w:t>
-      </w:r>
       <w:proofErr w:type="gramStart"/>
       <w:r>
         <w:rPr>
@@ -4347,18 +4554,10 @@
           <w:szCs w:val="24"/>
           <w:lang w:val="hu" w:eastAsia="hu-HU"/>
         </w:rPr>
-        <w:t>.AspNetCore</w:t>
-      </w:r>
+        <w:t>Microsoft.AspNetCore.Authentication.JwtBearer</w:t>
+      </w:r>
+      <w:proofErr w:type="spellEnd"/>
       <w:proofErr w:type="gramEnd"/>
-      <w:r>
-        <w:rPr>
-          <w:rFonts w:ascii="Times New Roman" w:eastAsia="Calibri" w:hAnsi="Times New Roman" w:cs="Times New Roman"/>
-          <w:szCs w:val="24"/>
-          <w:lang w:val="hu" w:eastAsia="hu-HU"/>
-        </w:rPr>
-        <w:t>.Authentication.JwtBearer</w:t>
-      </w:r>
-      <w:proofErr w:type="spellEnd"/>
       <w:r>
         <w:rPr>
           <w:rFonts w:ascii="Times New Roman" w:eastAsia="Calibri" w:hAnsi="Times New Roman" w:cs="Times New Roman"/>
@@ -4390,14 +4589,6 @@
         </w:rPr>
       </w:pPr>
       <w:proofErr w:type="spellStart"/>
-      <w:r>
-        <w:rPr>
-          <w:rFonts w:ascii="Times New Roman" w:eastAsia="Calibri" w:hAnsi="Times New Roman" w:cs="Times New Roman"/>
-          <w:szCs w:val="24"/>
-          <w:lang w:val="hu" w:eastAsia="hu-HU"/>
-        </w:rPr>
-        <w:t>Microsoft</w:t>
-      </w:r>
       <w:proofErr w:type="gramStart"/>
       <w:r>
         <w:rPr>
@@ -4405,18 +4596,10 @@
           <w:szCs w:val="24"/>
           <w:lang w:val="hu" w:eastAsia="hu-HU"/>
         </w:rPr>
-        <w:t>.AspNetCore</w:t>
-      </w:r>
+        <w:t>Microsoft.AspNetCore.Identity.EntityFrameworkCore</w:t>
+      </w:r>
+      <w:proofErr w:type="spellEnd"/>
       <w:proofErr w:type="gramEnd"/>
-      <w:r>
-        <w:rPr>
-          <w:rFonts w:ascii="Times New Roman" w:eastAsia="Calibri" w:hAnsi="Times New Roman" w:cs="Times New Roman"/>
-          <w:szCs w:val="24"/>
-          <w:lang w:val="hu" w:eastAsia="hu-HU"/>
-        </w:rPr>
-        <w:t>.Identity.EntityFrameworkCore</w:t>
-      </w:r>
-      <w:proofErr w:type="spellEnd"/>
       <w:r>
         <w:rPr>
           <w:rFonts w:ascii="Times New Roman" w:eastAsia="Calibri" w:hAnsi="Times New Roman" w:cs="Times New Roman"/>
@@ -4448,14 +4631,6 @@
         </w:rPr>
       </w:pPr>
       <w:proofErr w:type="spellStart"/>
-      <w:r>
-        <w:rPr>
-          <w:rFonts w:ascii="Times New Roman" w:eastAsia="Calibri" w:hAnsi="Times New Roman" w:cs="Times New Roman"/>
-          <w:szCs w:val="24"/>
-          <w:lang w:val="hu" w:eastAsia="hu-HU"/>
-        </w:rPr>
-        <w:t>Microsoft</w:t>
-      </w:r>
       <w:proofErr w:type="gramStart"/>
       <w:r>
         <w:rPr>
@@ -4463,18 +4638,10 @@
           <w:szCs w:val="24"/>
           <w:lang w:val="hu" w:eastAsia="hu-HU"/>
         </w:rPr>
-        <w:t>.EntityFrameworkCore</w:t>
-      </w:r>
+        <w:t>Microsoft.EntityFrameworkCore.Tools</w:t>
+      </w:r>
+      <w:proofErr w:type="spellEnd"/>
       <w:proofErr w:type="gramEnd"/>
-      <w:r>
-        <w:rPr>
-          <w:rFonts w:ascii="Times New Roman" w:eastAsia="Calibri" w:hAnsi="Times New Roman" w:cs="Times New Roman"/>
-          <w:szCs w:val="24"/>
-          <w:lang w:val="hu" w:eastAsia="hu-HU"/>
-        </w:rPr>
-        <w:t>.Tools</w:t>
-      </w:r>
-      <w:proofErr w:type="spellEnd"/>
       <w:r>
         <w:rPr>
           <w:rFonts w:ascii="Times New Roman" w:eastAsia="Calibri" w:hAnsi="Times New Roman" w:cs="Times New Roman"/>
@@ -4512,19 +4679,9 @@
           <w:szCs w:val="24"/>
           <w:lang w:val="hu" w:eastAsia="hu-HU"/>
         </w:rPr>
-        <w:t>MySql</w:t>
-      </w:r>
-      <w:proofErr w:type="gramStart"/>
-      <w:r>
-        <w:rPr>
-          <w:rFonts w:ascii="Times New Roman" w:eastAsia="Calibri" w:hAnsi="Times New Roman" w:cs="Times New Roman"/>
-          <w:szCs w:val="24"/>
-          <w:lang w:val="hu" w:eastAsia="hu-HU"/>
-        </w:rPr>
-        <w:t>.EntityFrameworkCore</w:t>
-      </w:r>
-      <w:proofErr w:type="spellEnd"/>
-      <w:proofErr w:type="gramEnd"/>
+        <w:t>MySql.EntityFrameworkCore</w:t>
+      </w:r>
+      <w:proofErr w:type="spellEnd"/>
       <w:r>
         <w:rPr>
           <w:rFonts w:ascii="Times New Roman" w:eastAsia="Calibri" w:hAnsi="Times New Roman" w:cs="Times New Roman"/>
@@ -4842,25 +4999,14 @@
           <w:lang w:val="hu" w:eastAsia="hu-HU"/>
         </w:rPr>
       </w:pPr>
-      <w:proofErr w:type="spellStart"/>
-      <w:r>
-        <w:rPr>
-          <w:rFonts w:ascii="Times New Roman" w:eastAsia="Calibri" w:hAnsi="Times New Roman" w:cs="Times New Roman"/>
-          <w:color w:val="000000"/>
-          <w:szCs w:val="24"/>
-          <w:lang w:val="hu" w:eastAsia="hu-HU"/>
-        </w:rPr>
-        <w:t>Docker</w:t>
-      </w:r>
-      <w:proofErr w:type="spellEnd"/>
-      <w:r>
-        <w:rPr>
-          <w:rFonts w:ascii="Times New Roman" w:eastAsia="Calibri" w:hAnsi="Times New Roman" w:cs="Times New Roman"/>
-          <w:color w:val="000000"/>
-          <w:szCs w:val="24"/>
-          <w:lang w:val="hu" w:eastAsia="hu-HU"/>
-        </w:rPr>
-        <w:t xml:space="preserve"> alkalmazáson a legfrissebb </w:t>
+      <w:r>
+        <w:rPr>
+          <w:rFonts w:ascii="Times New Roman" w:eastAsia="Calibri" w:hAnsi="Times New Roman" w:cs="Times New Roman"/>
+          <w:color w:val="000000"/>
+          <w:szCs w:val="24"/>
+          <w:lang w:val="hu" w:eastAsia="hu-HU"/>
+        </w:rPr>
+        <w:t xml:space="preserve">Docker alkalmazáson a legfrissebb </w:t>
       </w:r>
       <w:proofErr w:type="spellStart"/>
       <w:r>
@@ -5112,17 +5258,17 @@
           <w:szCs w:val="24"/>
           <w:lang w:val="hu" w:eastAsia="hu-HU"/>
         </w:rPr>
-        <w:t>Community-ben</w:t>
-      </w:r>
-      <w:proofErr w:type="spellEnd"/>
-      <w:r>
-        <w:rPr>
-          <w:rFonts w:ascii="Times New Roman" w:eastAsia="Calibri" w:hAnsi="Times New Roman" w:cs="Times New Roman"/>
-          <w:color w:val="000000"/>
-          <w:szCs w:val="24"/>
-          <w:lang w:val="hu" w:eastAsia="hu-HU"/>
-        </w:rPr>
-        <w:t xml:space="preserve"> </w:t>
+        <w:t>Community</w:t>
+      </w:r>
+      <w:proofErr w:type="spellEnd"/>
+      <w:r>
+        <w:rPr>
+          <w:rFonts w:ascii="Times New Roman" w:eastAsia="Calibri" w:hAnsi="Times New Roman" w:cs="Times New Roman"/>
+          <w:color w:val="000000"/>
+          <w:szCs w:val="24"/>
+          <w:lang w:val="hu" w:eastAsia="hu-HU"/>
+        </w:rPr>
+        <w:t xml:space="preserve">-ben </w:t>
       </w:r>
       <w:proofErr w:type="spellStart"/>
       <w:r>
@@ -5466,6 +5612,104 @@
         </w:rPr>
         <w:t>: „String123!”</w:t>
       </w:r>
+      <w:r>
+        <w:rPr>
+          <w:rFonts w:ascii="Times New Roman" w:eastAsia="Calibri" w:hAnsi="Times New Roman" w:cs="Times New Roman"/>
+          <w:color w:val="000000"/>
+          <w:szCs w:val="24"/>
+          <w:lang w:val="hu" w:eastAsia="hu-HU"/>
+        </w:rPr>
+        <w:t xml:space="preserve">. Utána azt a JWT </w:t>
+      </w:r>
+      <w:proofErr w:type="spellStart"/>
+      <w:r>
+        <w:rPr>
+          <w:rFonts w:ascii="Times New Roman" w:eastAsia="Calibri" w:hAnsi="Times New Roman" w:cs="Times New Roman"/>
+          <w:color w:val="000000"/>
+          <w:szCs w:val="24"/>
+          <w:lang w:val="hu" w:eastAsia="hu-HU"/>
+        </w:rPr>
+        <w:t>tokent</w:t>
+      </w:r>
+      <w:proofErr w:type="spellEnd"/>
+      <w:r>
+        <w:rPr>
+          <w:rFonts w:ascii="Times New Roman" w:eastAsia="Calibri" w:hAnsi="Times New Roman" w:cs="Times New Roman"/>
+          <w:color w:val="000000"/>
+          <w:szCs w:val="24"/>
+          <w:lang w:val="hu" w:eastAsia="hu-HU"/>
+        </w:rPr>
+        <w:t xml:space="preserve"> beilleszteni az </w:t>
+      </w:r>
+      <w:proofErr w:type="spellStart"/>
+      <w:r>
+        <w:rPr>
+          <w:rFonts w:ascii="Times New Roman" w:eastAsia="Calibri" w:hAnsi="Times New Roman" w:cs="Times New Roman"/>
+          <w:color w:val="000000"/>
+          <w:szCs w:val="24"/>
+          <w:lang w:val="hu" w:eastAsia="hu-HU"/>
+        </w:rPr>
+        <w:t>Authorize</w:t>
+      </w:r>
+      <w:proofErr w:type="spellEnd"/>
+      <w:r>
+        <w:rPr>
+          <w:rFonts w:ascii="Times New Roman" w:eastAsia="Calibri" w:hAnsi="Times New Roman" w:cs="Times New Roman"/>
+          <w:color w:val="000000"/>
+          <w:szCs w:val="24"/>
+          <w:lang w:val="hu" w:eastAsia="hu-HU"/>
+        </w:rPr>
+        <w:t xml:space="preserve"> gombnak a </w:t>
+      </w:r>
+      <w:proofErr w:type="spellStart"/>
+      <w:r>
+        <w:rPr>
+          <w:rFonts w:ascii="Times New Roman" w:eastAsia="Calibri" w:hAnsi="Times New Roman" w:cs="Times New Roman"/>
+          <w:color w:val="000000"/>
+          <w:szCs w:val="24"/>
+          <w:lang w:val="hu" w:eastAsia="hu-HU"/>
+        </w:rPr>
+        <w:t>Value</w:t>
+      </w:r>
+      <w:proofErr w:type="spellEnd"/>
+      <w:r>
+        <w:rPr>
+          <w:rFonts w:ascii="Times New Roman" w:eastAsia="Calibri" w:hAnsi="Times New Roman" w:cs="Times New Roman"/>
+          <w:color w:val="000000"/>
+          <w:szCs w:val="24"/>
+          <w:lang w:val="hu" w:eastAsia="hu-HU"/>
+        </w:rPr>
+        <w:t xml:space="preserve"> mezőjébe. (</w:t>
+      </w:r>
+      <w:hyperlink w:anchor="_Sweagger_UI" w:history="1">
+        <w:r>
+          <w:rPr>
+            <w:rStyle w:val="Hiperhivatkozs"/>
+            <w:rFonts w:ascii="Times New Roman" w:eastAsia="Calibri" w:hAnsi="Times New Roman" w:cs="Times New Roman"/>
+            <w:szCs w:val="24"/>
+            <w:lang w:val="hu" w:eastAsia="hu-HU"/>
+          </w:rPr>
+          <w:t>5. ábr</w:t>
+        </w:r>
+        <w:r>
+          <w:rPr>
+            <w:rStyle w:val="Hiperhivatkozs"/>
+            <w:rFonts w:ascii="Times New Roman" w:eastAsia="Calibri" w:hAnsi="Times New Roman" w:cs="Times New Roman"/>
+            <w:szCs w:val="24"/>
+            <w:lang w:val="hu" w:eastAsia="hu-HU"/>
+          </w:rPr>
+          <w:t>a</w:t>
+        </w:r>
+      </w:hyperlink>
+      <w:r>
+        <w:rPr>
+          <w:rFonts w:ascii="Times New Roman" w:eastAsia="Calibri" w:hAnsi="Times New Roman" w:cs="Times New Roman"/>
+          <w:color w:val="000000"/>
+          <w:szCs w:val="24"/>
+          <w:lang w:val="hu" w:eastAsia="hu-HU"/>
+        </w:rPr>
+        <w:t>)</w:t>
+      </w:r>
     </w:p>
     <w:p>
       <w:pPr>
@@ -5495,7 +5739,7 @@
           <w:lang w:val="hu-HU"/>
         </w:rPr>
       </w:pPr>
-      <w:bookmarkStart w:id="2" w:name="_Toc227053846"/>
+      <w:bookmarkStart w:id="2" w:name="_Toc227104186"/>
       <w:r>
         <w:rPr>
           <w:rFonts w:ascii="Times New Roman" w:hAnsi="Times New Roman" w:cs="Times New Roman"/>
@@ -5556,27 +5800,7 @@
           <w:szCs w:val="24"/>
           <w:lang w:val="hu" w:eastAsia="hu-HU"/>
         </w:rPr>
-        <w:t xml:space="preserve">, illetve </w:t>
-      </w:r>
-      <w:proofErr w:type="spellStart"/>
-      <w:r>
-        <w:rPr>
-          <w:rFonts w:ascii="Times New Roman" w:eastAsia="Calibri" w:hAnsi="Times New Roman" w:cs="Times New Roman"/>
-          <w:color w:val="000000"/>
-          <w:szCs w:val="24"/>
-          <w:lang w:val="hu" w:eastAsia="hu-HU"/>
-        </w:rPr>
-        <w:t>Docker</w:t>
-      </w:r>
-      <w:proofErr w:type="spellEnd"/>
-      <w:r>
-        <w:rPr>
-          <w:rFonts w:ascii="Times New Roman" w:eastAsia="Calibri" w:hAnsi="Times New Roman" w:cs="Times New Roman"/>
-          <w:color w:val="000000"/>
-          <w:szCs w:val="24"/>
-          <w:lang w:val="hu" w:eastAsia="hu-HU"/>
-        </w:rPr>
-        <w:t xml:space="preserve"> alkalmazással </w:t>
+        <w:t xml:space="preserve">, illetve Docker alkalmazással </w:t>
       </w:r>
       <w:proofErr w:type="spellStart"/>
       <w:r>
@@ -5655,7 +5879,54 @@
           <w:rFonts w:ascii="Times New Roman" w:eastAsia="Calibri" w:hAnsi="Times New Roman" w:cs="Times New Roman"/>
           <w:lang w:val="hu" w:eastAsia="hu-HU"/>
         </w:rPr>
-        <w:t>Táblák:</w:t>
+        <w:t>Táblák</w:t>
+      </w:r>
+      <w:r>
+        <w:rPr>
+          <w:rFonts w:ascii="Times New Roman" w:eastAsia="Calibri" w:hAnsi="Times New Roman" w:cs="Times New Roman"/>
+          <w:lang w:val="hu" w:eastAsia="hu-HU"/>
+        </w:rPr>
+        <w:t xml:space="preserve"> (</w:t>
+      </w:r>
+      <w:hyperlink w:anchor="_Xampp_MySQL" w:history="1">
+        <w:r>
+          <w:rPr>
+            <w:rStyle w:val="Hiperhivatkozs"/>
+            <w:rFonts w:ascii="Times New Roman" w:eastAsia="Calibri" w:hAnsi="Times New Roman" w:cs="Times New Roman"/>
+            <w:lang w:val="hu" w:eastAsia="hu-HU"/>
+          </w:rPr>
+          <w:t>6. á</w:t>
+        </w:r>
+        <w:r>
+          <w:rPr>
+            <w:rStyle w:val="Hiperhivatkozs"/>
+            <w:rFonts w:ascii="Times New Roman" w:eastAsia="Calibri" w:hAnsi="Times New Roman" w:cs="Times New Roman"/>
+            <w:lang w:val="hu" w:eastAsia="hu-HU"/>
+          </w:rPr>
+          <w:t>b</w:t>
+        </w:r>
+        <w:r>
+          <w:rPr>
+            <w:rStyle w:val="Hiperhivatkozs"/>
+            <w:rFonts w:ascii="Times New Roman" w:eastAsia="Calibri" w:hAnsi="Times New Roman" w:cs="Times New Roman"/>
+            <w:lang w:val="hu" w:eastAsia="hu-HU"/>
+          </w:rPr>
+          <w:t>ra</w:t>
+        </w:r>
+      </w:hyperlink>
+      <w:r>
+        <w:rPr>
+          <w:rFonts w:ascii="Times New Roman" w:eastAsia="Calibri" w:hAnsi="Times New Roman" w:cs="Times New Roman"/>
+          <w:lang w:val="hu" w:eastAsia="hu-HU"/>
+        </w:rPr>
+        <w:t>)</w:t>
+      </w:r>
+      <w:r>
+        <w:rPr>
+          <w:rFonts w:ascii="Times New Roman" w:eastAsia="Calibri" w:hAnsi="Times New Roman" w:cs="Times New Roman"/>
+          <w:lang w:val="hu" w:eastAsia="hu-HU"/>
+        </w:rPr>
+        <w:t>:</w:t>
       </w:r>
     </w:p>
     <w:p>
@@ -5686,19 +5957,9 @@
           <w:szCs w:val="24"/>
           <w:lang w:val="hu" w:eastAsia="hu-HU"/>
         </w:rPr>
-        <w:t>Identity</w:t>
-      </w:r>
-      <w:proofErr w:type="gramStart"/>
-      <w:r>
-        <w:rPr>
-          <w:rFonts w:ascii="Times New Roman" w:eastAsia="Calibri" w:hAnsi="Times New Roman" w:cs="Times New Roman"/>
-          <w:szCs w:val="24"/>
-          <w:lang w:val="hu" w:eastAsia="hu-HU"/>
-        </w:rPr>
-        <w:t>.FrameWorkCore</w:t>
-      </w:r>
-      <w:proofErr w:type="spellEnd"/>
-      <w:proofErr w:type="gramEnd"/>
+        <w:t>Identity.FrameWorkCore</w:t>
+      </w:r>
+      <w:proofErr w:type="spellEnd"/>
       <w:r>
         <w:rPr>
           <w:rFonts w:ascii="Times New Roman" w:eastAsia="Calibri" w:hAnsi="Times New Roman" w:cs="Times New Roman"/>
@@ -5983,7 +6244,7 @@
           <w:lang w:val="hu-HU"/>
         </w:rPr>
       </w:pPr>
-      <w:bookmarkStart w:id="3" w:name="_Toc227053847"/>
+      <w:bookmarkStart w:id="3" w:name="_Toc227104187"/>
       <w:r>
         <w:rPr>
           <w:rFonts w:ascii="Times New Roman" w:hAnsi="Times New Roman" w:cs="Times New Roman"/>
@@ -6263,9 +6524,18 @@
           <w:szCs w:val="24"/>
           <w:lang w:val="hu" w:eastAsia="hu-HU"/>
         </w:rPr>
-        <w:t>Code-ban</w:t>
-      </w:r>
-      <w:proofErr w:type="spellEnd"/>
+        <w:t>Code</w:t>
+      </w:r>
+      <w:proofErr w:type="spellEnd"/>
+      <w:r>
+        <w:rPr>
+          <w:rFonts w:ascii="Times New Roman" w:eastAsia="Calibri" w:hAnsi="Times New Roman" w:cs="Times New Roman"/>
+          <w:color w:val="000000"/>
+          <w:szCs w:val="24"/>
+          <w:lang w:val="hu" w:eastAsia="hu-HU"/>
+        </w:rPr>
+        <w:t>-ban</w:t>
+      </w:r>
       <w:r>
         <w:rPr>
           <w:rFonts w:ascii="Times New Roman" w:eastAsia="Calibri" w:hAnsi="Times New Roman" w:cs="Times New Roman"/>
@@ -6707,23 +6977,13 @@
           <w:lang w:val="hu" w:eastAsia="hu-HU"/>
         </w:rPr>
       </w:pPr>
-      <w:proofErr w:type="spellStart"/>
-      <w:r>
-        <w:rPr>
-          <w:rFonts w:ascii="Times New Roman" w:eastAsia="Calibri" w:hAnsi="Times New Roman" w:cs="Times New Roman"/>
-          <w:szCs w:val="24"/>
-          <w:lang w:val="hu" w:eastAsia="hu-HU"/>
-        </w:rPr>
-        <w:t>Dockerfile</w:t>
-      </w:r>
-      <w:proofErr w:type="spellEnd"/>
-      <w:r>
-        <w:rPr>
-          <w:rFonts w:ascii="Times New Roman" w:eastAsia="Calibri" w:hAnsi="Times New Roman" w:cs="Times New Roman"/>
-          <w:szCs w:val="24"/>
-          <w:lang w:val="hu" w:eastAsia="hu-HU"/>
-        </w:rPr>
-        <w:t xml:space="preserve"> segítségével a </w:t>
+      <w:r>
+        <w:rPr>
+          <w:rFonts w:ascii="Times New Roman" w:eastAsia="Calibri" w:hAnsi="Times New Roman" w:cs="Times New Roman"/>
+          <w:szCs w:val="24"/>
+          <w:lang w:val="hu" w:eastAsia="hu-HU"/>
+        </w:rPr>
+        <w:t xml:space="preserve">Dockerfile segítségével a </w:t>
       </w:r>
       <w:proofErr w:type="spellStart"/>
       <w:r>
@@ -6804,80 +7064,16 @@
           <w:szCs w:val="24"/>
           <w:lang w:val="hu" w:eastAsia="hu-HU"/>
         </w:rPr>
-        <w:t>Teszteléshez: @testing-</w:t>
-      </w:r>
-      <w:proofErr w:type="spellStart"/>
-      <w:r>
-        <w:rPr>
-          <w:rFonts w:ascii="Times New Roman" w:eastAsia="Calibri" w:hAnsi="Times New Roman" w:cs="Times New Roman"/>
-          <w:szCs w:val="24"/>
-          <w:lang w:val="hu" w:eastAsia="hu-HU"/>
-        </w:rPr>
-        <w:t>library</w:t>
-      </w:r>
-      <w:proofErr w:type="spellEnd"/>
-      <w:r>
-        <w:rPr>
-          <w:rFonts w:ascii="Times New Roman" w:eastAsia="Calibri" w:hAnsi="Times New Roman" w:cs="Times New Roman"/>
-          <w:szCs w:val="24"/>
-          <w:lang w:val="hu" w:eastAsia="hu-HU"/>
-        </w:rPr>
-        <w:t>/</w:t>
-      </w:r>
-      <w:proofErr w:type="spellStart"/>
-      <w:r>
-        <w:rPr>
-          <w:rFonts w:ascii="Times New Roman" w:eastAsia="Calibri" w:hAnsi="Times New Roman" w:cs="Times New Roman"/>
-          <w:szCs w:val="24"/>
-          <w:lang w:val="hu" w:eastAsia="hu-HU"/>
-        </w:rPr>
-        <w:t>react</w:t>
-      </w:r>
-      <w:proofErr w:type="spellEnd"/>
-      <w:r>
-        <w:rPr>
-          <w:rFonts w:ascii="Times New Roman" w:eastAsia="Calibri" w:hAnsi="Times New Roman" w:cs="Times New Roman"/>
-          <w:szCs w:val="24"/>
-          <w:lang w:val="hu" w:eastAsia="hu-HU"/>
-        </w:rPr>
-        <w:t xml:space="preserve">, </w:t>
-      </w:r>
-      <w:proofErr w:type="spellStart"/>
-      <w:r>
-        <w:rPr>
-          <w:rFonts w:ascii="Times New Roman" w:eastAsia="Calibri" w:hAnsi="Times New Roman" w:cs="Times New Roman"/>
-          <w:szCs w:val="24"/>
-          <w:lang w:val="hu" w:eastAsia="hu-HU"/>
-        </w:rPr>
-        <w:t>bun</w:t>
-      </w:r>
-      <w:proofErr w:type="gramStart"/>
-      <w:r>
-        <w:rPr>
-          <w:rFonts w:ascii="Times New Roman" w:eastAsia="Calibri" w:hAnsi="Times New Roman" w:cs="Times New Roman"/>
-          <w:szCs w:val="24"/>
-          <w:lang w:val="hu" w:eastAsia="hu-HU"/>
-        </w:rPr>
-        <w:t>:test</w:t>
-      </w:r>
-      <w:proofErr w:type="spellEnd"/>
-      <w:proofErr w:type="gramEnd"/>
-      <w:r>
-        <w:rPr>
-          <w:rFonts w:ascii="Times New Roman" w:eastAsia="Calibri" w:hAnsi="Times New Roman" w:cs="Times New Roman"/>
-          <w:szCs w:val="24"/>
-          <w:lang w:val="hu" w:eastAsia="hu-HU"/>
-        </w:rPr>
-        <w:t xml:space="preserve">, </w:t>
-      </w:r>
-      <w:proofErr w:type="spellStart"/>
-      <w:r>
-        <w:rPr>
-          <w:rFonts w:ascii="Times New Roman" w:eastAsia="Calibri" w:hAnsi="Times New Roman" w:cs="Times New Roman"/>
-          <w:szCs w:val="24"/>
-          <w:lang w:val="hu" w:eastAsia="hu-HU"/>
-        </w:rPr>
-        <w:t>jsdom</w:t>
+        <w:t xml:space="preserve">Teszteléshez: @testing-library/react, </w:t>
+      </w:r>
+      <w:proofErr w:type="spellStart"/>
+      <w:r>
+        <w:rPr>
+          <w:rFonts w:ascii="Times New Roman" w:eastAsia="Calibri" w:hAnsi="Times New Roman" w:cs="Times New Roman"/>
+          <w:szCs w:val="24"/>
+          <w:lang w:val="hu" w:eastAsia="hu-HU"/>
+        </w:rPr>
+        <w:t>bun:test</w:t>
       </w:r>
       <w:proofErr w:type="spellEnd"/>
     </w:p>
@@ -6892,7 +7088,7 @@
         <w:rPr>
           <w:rFonts w:ascii="Times New Roman" w:eastAsia="Calibri" w:hAnsi="Times New Roman" w:cs="Times New Roman"/>
           <w:szCs w:val="24"/>
-          <w:lang w:val="hu" w:eastAsia="hu-HU"/>
+          <w:lang w:val="hu-HU" w:eastAsia="hu-HU"/>
         </w:rPr>
       </w:pPr>
       <w:r>
@@ -6910,7 +7106,79 @@
           <w:szCs w:val="24"/>
           <w:lang w:val="hu" w:eastAsia="hu-HU"/>
         </w:rPr>
-        <w:t>react-router-dom</w:t>
+        <w:t>react</w:t>
+      </w:r>
+      <w:proofErr w:type="spellEnd"/>
+      <w:r>
+        <w:rPr>
+          <w:rFonts w:ascii="Times New Roman" w:eastAsia="Calibri" w:hAnsi="Times New Roman" w:cs="Times New Roman"/>
+          <w:szCs w:val="24"/>
+          <w:lang w:val="hu" w:eastAsia="hu-HU"/>
+        </w:rPr>
+        <w:t>-router-</w:t>
+      </w:r>
+      <w:proofErr w:type="spellStart"/>
+      <w:r>
+        <w:rPr>
+          <w:rFonts w:ascii="Times New Roman" w:eastAsia="Calibri" w:hAnsi="Times New Roman" w:cs="Times New Roman"/>
+          <w:szCs w:val="24"/>
+          <w:lang w:val="hu" w:eastAsia="hu-HU"/>
+        </w:rPr>
+        <w:t>dom</w:t>
+      </w:r>
+      <w:proofErr w:type="spellEnd"/>
+      <w:r>
+        <w:rPr>
+          <w:rFonts w:ascii="Times New Roman" w:eastAsia="Calibri" w:hAnsi="Times New Roman" w:cs="Times New Roman"/>
+          <w:szCs w:val="24"/>
+          <w:lang w:val="hu" w:eastAsia="hu-HU"/>
+        </w:rPr>
+        <w:t xml:space="preserve">, </w:t>
+      </w:r>
+      <w:proofErr w:type="spellStart"/>
+      <w:r>
+        <w:rPr>
+          <w:rFonts w:ascii="Times New Roman" w:eastAsia="Calibri" w:hAnsi="Times New Roman" w:cs="Times New Roman"/>
+          <w:szCs w:val="24"/>
+          <w:lang w:val="hu" w:eastAsia="hu-HU"/>
+        </w:rPr>
+        <w:t>react</w:t>
+      </w:r>
+      <w:proofErr w:type="spellEnd"/>
+      <w:r>
+        <w:rPr>
+          <w:rFonts w:ascii="Times New Roman" w:eastAsia="Calibri" w:hAnsi="Times New Roman" w:cs="Times New Roman"/>
+          <w:szCs w:val="24"/>
+          <w:lang w:val="hu" w:eastAsia="hu-HU"/>
+        </w:rPr>
+        <w:t xml:space="preserve">, </w:t>
+      </w:r>
+      <w:proofErr w:type="spellStart"/>
+      <w:r>
+        <w:rPr>
+          <w:rFonts w:ascii="Times New Roman" w:eastAsia="Calibri" w:hAnsi="Times New Roman" w:cs="Times New Roman"/>
+          <w:szCs w:val="24"/>
+          <w:lang w:val="hu-HU" w:eastAsia="hu-HU"/>
+        </w:rPr>
+        <w:t>react-dom</w:t>
+      </w:r>
+      <w:proofErr w:type="spellEnd"/>
+      <w:r>
+        <w:rPr>
+          <w:rFonts w:ascii="Times New Roman" w:eastAsia="Calibri" w:hAnsi="Times New Roman" w:cs="Times New Roman"/>
+          <w:szCs w:val="24"/>
+          <w:lang w:val="hu-HU" w:eastAsia="hu-HU"/>
+        </w:rPr>
+        <w:t>/</w:t>
+      </w:r>
+      <w:proofErr w:type="spellStart"/>
+      <w:r>
+        <w:rPr>
+          <w:rFonts w:ascii="Times New Roman" w:eastAsia="Calibri" w:hAnsi="Times New Roman" w:cs="Times New Roman"/>
+          <w:szCs w:val="24"/>
+          <w:lang w:val="hu-HU" w:eastAsia="hu-HU"/>
+        </w:rPr>
+        <w:t>client</w:t>
       </w:r>
       <w:proofErr w:type="spellEnd"/>
     </w:p>
@@ -7142,6 +7410,51 @@
         </w:rPr>
         <w:t>i linkjét.</w:t>
       </w:r>
+      <w:r>
+        <w:rPr>
+          <w:rFonts w:ascii="Times New Roman" w:eastAsia="Calibri" w:hAnsi="Times New Roman" w:cs="Times New Roman"/>
+          <w:szCs w:val="24"/>
+          <w:lang w:val="hu" w:eastAsia="hu-HU"/>
+        </w:rPr>
+        <w:t xml:space="preserve"> (</w:t>
+      </w:r>
+      <w:hyperlink w:anchor="_Index.jsx" w:history="1">
+        <w:r>
+          <w:rPr>
+            <w:rStyle w:val="Hiperhivatkozs"/>
+            <w:rFonts w:ascii="Times New Roman" w:eastAsia="Calibri" w:hAnsi="Times New Roman" w:cs="Times New Roman"/>
+            <w:szCs w:val="24"/>
+            <w:lang w:val="hu" w:eastAsia="hu-HU"/>
+          </w:rPr>
+          <w:t>7. áb</w:t>
+        </w:r>
+        <w:r>
+          <w:rPr>
+            <w:rStyle w:val="Hiperhivatkozs"/>
+            <w:rFonts w:ascii="Times New Roman" w:eastAsia="Calibri" w:hAnsi="Times New Roman" w:cs="Times New Roman"/>
+            <w:szCs w:val="24"/>
+            <w:lang w:val="hu" w:eastAsia="hu-HU"/>
+          </w:rPr>
+          <w:t>r</w:t>
+        </w:r>
+        <w:r>
+          <w:rPr>
+            <w:rStyle w:val="Hiperhivatkozs"/>
+            <w:rFonts w:ascii="Times New Roman" w:eastAsia="Calibri" w:hAnsi="Times New Roman" w:cs="Times New Roman"/>
+            <w:szCs w:val="24"/>
+            <w:lang w:val="hu" w:eastAsia="hu-HU"/>
+          </w:rPr>
+          <w:t>a</w:t>
+        </w:r>
+      </w:hyperlink>
+      <w:r>
+        <w:rPr>
+          <w:rFonts w:ascii="Times New Roman" w:eastAsia="Calibri" w:hAnsi="Times New Roman" w:cs="Times New Roman"/>
+          <w:szCs w:val="24"/>
+          <w:lang w:val="hu" w:eastAsia="hu-HU"/>
+        </w:rPr>
+        <w:t>)</w:t>
+      </w:r>
     </w:p>
     <w:p>
       <w:pPr>
@@ -7172,7 +7485,7 @@
           <w:lang w:val="hu-HU"/>
         </w:rPr>
       </w:pPr>
-      <w:bookmarkStart w:id="4" w:name="_Toc227053848"/>
+      <w:bookmarkStart w:id="4" w:name="_Toc227104188"/>
       <w:r>
         <w:rPr>
           <w:rFonts w:ascii="Times New Roman" w:hAnsi="Times New Roman" w:cs="Times New Roman"/>
@@ -7252,44 +7565,26 @@
           <w:szCs w:val="24"/>
           <w:lang w:val="hu" w:eastAsia="hu-HU"/>
         </w:rPr>
+        <w:t xml:space="preserve"> 2022 .NET 8.0 WPF alkalmazás. További kód eszköz a </w:t>
+      </w:r>
+      <w:proofErr w:type="spellStart"/>
+      <w:r>
+        <w:rPr>
+          <w:rFonts w:ascii="Times New Roman" w:eastAsia="Calibri" w:hAnsi="Times New Roman" w:cs="Times New Roman"/>
+          <w:szCs w:val="24"/>
+          <w:lang w:val="hu" w:eastAsia="hu-HU"/>
+        </w:rPr>
+        <w:t>Class</w:t>
+      </w:r>
+      <w:proofErr w:type="spellEnd"/>
+      <w:r>
+        <w:rPr>
+          <w:rFonts w:ascii="Times New Roman" w:eastAsia="Calibri" w:hAnsi="Times New Roman" w:cs="Times New Roman"/>
+          <w:szCs w:val="24"/>
+          <w:lang w:val="hu" w:eastAsia="hu-HU"/>
+        </w:rPr>
         <w:t xml:space="preserve"> </w:t>
       </w:r>
-      <w:proofErr w:type="gramStart"/>
-      <w:r>
-        <w:rPr>
-          <w:rFonts w:ascii="Times New Roman" w:eastAsia="Calibri" w:hAnsi="Times New Roman" w:cs="Times New Roman"/>
-          <w:szCs w:val="24"/>
-          <w:lang w:val="hu" w:eastAsia="hu-HU"/>
-        </w:rPr>
-        <w:t>2022 .NET</w:t>
-      </w:r>
-      <w:proofErr w:type="gramEnd"/>
-      <w:r>
-        <w:rPr>
-          <w:rFonts w:ascii="Times New Roman" w:eastAsia="Calibri" w:hAnsi="Times New Roman" w:cs="Times New Roman"/>
-          <w:szCs w:val="24"/>
-          <w:lang w:val="hu" w:eastAsia="hu-HU"/>
-        </w:rPr>
-        <w:t xml:space="preserve"> 8.0 WPF alkalmazás. További kód eszköz a </w:t>
-      </w:r>
-      <w:proofErr w:type="spellStart"/>
-      <w:r>
-        <w:rPr>
-          <w:rFonts w:ascii="Times New Roman" w:eastAsia="Calibri" w:hAnsi="Times New Roman" w:cs="Times New Roman"/>
-          <w:szCs w:val="24"/>
-          <w:lang w:val="hu" w:eastAsia="hu-HU"/>
-        </w:rPr>
-        <w:t>Class</w:t>
-      </w:r>
-      <w:proofErr w:type="spellEnd"/>
-      <w:r>
-        <w:rPr>
-          <w:rFonts w:ascii="Times New Roman" w:eastAsia="Calibri" w:hAnsi="Times New Roman" w:cs="Times New Roman"/>
-          <w:szCs w:val="24"/>
-          <w:lang w:val="hu" w:eastAsia="hu-HU"/>
-        </w:rPr>
-        <w:t xml:space="preserve"> </w:t>
-      </w:r>
       <w:proofErr w:type="spellStart"/>
       <w:r>
         <w:rPr>
@@ -7306,25 +7601,7 @@
           <w:szCs w:val="24"/>
           <w:lang w:val="hu" w:eastAsia="hu-HU"/>
         </w:rPr>
-        <w:t xml:space="preserve"> azaz </w:t>
-      </w:r>
-      <w:proofErr w:type="gramStart"/>
-      <w:r>
-        <w:rPr>
-          <w:rFonts w:ascii="Times New Roman" w:eastAsia="Calibri" w:hAnsi="Times New Roman" w:cs="Times New Roman"/>
-          <w:szCs w:val="24"/>
-          <w:lang w:val="hu" w:eastAsia="hu-HU"/>
-        </w:rPr>
-        <w:t>a .cd</w:t>
-      </w:r>
-      <w:proofErr w:type="gramEnd"/>
-      <w:r>
-        <w:rPr>
-          <w:rFonts w:ascii="Times New Roman" w:eastAsia="Calibri" w:hAnsi="Times New Roman" w:cs="Times New Roman"/>
-          <w:szCs w:val="24"/>
-          <w:lang w:val="hu" w:eastAsia="hu-HU"/>
-        </w:rPr>
-        <w:t xml:space="preserve"> típusú fájl.</w:t>
+        <w:t xml:space="preserve"> azaz a .cd típusú fájl.</w:t>
       </w:r>
     </w:p>
     <w:p>
@@ -7570,27 +7847,7 @@
           <w:szCs w:val="24"/>
           <w:lang w:val="hu" w:eastAsia="hu-HU"/>
         </w:rPr>
-        <w:t xml:space="preserve">”. A kitöltendő </w:t>
-      </w:r>
-      <w:proofErr w:type="spellStart"/>
-      <w:r>
-        <w:rPr>
-          <w:rFonts w:ascii="Times New Roman" w:eastAsia="Calibri" w:hAnsi="Times New Roman" w:cs="Times New Roman"/>
-          <w:color w:val="000000"/>
-          <w:szCs w:val="24"/>
-          <w:lang w:val="hu" w:eastAsia="hu-HU"/>
-        </w:rPr>
-        <w:t>mezőkbe</w:t>
-      </w:r>
-      <w:proofErr w:type="spellEnd"/>
-      <w:r>
-        <w:rPr>
-          <w:rFonts w:ascii="Times New Roman" w:eastAsia="Calibri" w:hAnsi="Times New Roman" w:cs="Times New Roman"/>
-          <w:color w:val="000000"/>
-          <w:szCs w:val="24"/>
-          <w:lang w:val="hu" w:eastAsia="hu-HU"/>
-        </w:rPr>
-        <w:t xml:space="preserve"> a kódba megírt </w:t>
+        <w:t xml:space="preserve">”. A kitöltendő mezőkbe a kódba megírt </w:t>
       </w:r>
       <w:proofErr w:type="spellStart"/>
       <w:r>
@@ -8009,27 +8266,7 @@
           <w:szCs w:val="24"/>
           <w:lang w:val="hu" w:eastAsia="hu-HU"/>
         </w:rPr>
-        <w:t xml:space="preserve">„Új rekord”: A jelenlegi táblának egy </w:t>
-      </w:r>
-      <w:proofErr w:type="gramStart"/>
-      <w:r>
-        <w:rPr>
-          <w:rFonts w:ascii="Times New Roman" w:eastAsia="Calibri" w:hAnsi="Times New Roman" w:cs="Times New Roman"/>
-          <w:color w:val="000000"/>
-          <w:szCs w:val="24"/>
-          <w:lang w:val="hu" w:eastAsia="hu-HU"/>
-        </w:rPr>
-        <w:t>új adat</w:t>
-      </w:r>
-      <w:proofErr w:type="gramEnd"/>
-      <w:r>
-        <w:rPr>
-          <w:rFonts w:ascii="Times New Roman" w:eastAsia="Calibri" w:hAnsi="Times New Roman" w:cs="Times New Roman"/>
-          <w:color w:val="000000"/>
-          <w:szCs w:val="24"/>
-          <w:lang w:val="hu" w:eastAsia="hu-HU"/>
-        </w:rPr>
-        <w:t xml:space="preserve"> rekord hozzáadása, az elvárt JSON </w:t>
+        <w:t xml:space="preserve">„Új rekord”: A jelenlegi táblának egy új adat rekord hozzáadása, az elvárt JSON </w:t>
       </w:r>
       <w:r>
         <w:rPr>
@@ -8229,7 +8466,7 @@
           <w:lang w:val="hu-HU"/>
         </w:rPr>
       </w:pPr>
-      <w:bookmarkStart w:id="5" w:name="_Toc227053849"/>
+      <w:bookmarkStart w:id="5" w:name="_Toc227104189"/>
       <w:r>
         <w:rPr>
           <w:rFonts w:ascii="Times New Roman" w:hAnsi="Times New Roman" w:cs="Times New Roman"/>
@@ -8816,8 +9053,6 @@
         </w:rPr>
         <w:t xml:space="preserve"> felelős</w:t>
       </w:r>
-      <w:bookmarkStart w:id="7" w:name="_GoBack"/>
-      <w:bookmarkEnd w:id="7"/>
     </w:p>
     <w:p>
       <w:pPr>
@@ -8868,7 +9103,7 @@
           <w:szCs w:val="44"/>
         </w:rPr>
       </w:pPr>
-      <w:bookmarkStart w:id="8" w:name="_Toc227053850"/>
+      <w:bookmarkStart w:id="7" w:name="_Toc227104190"/>
       <w:proofErr w:type="spellStart"/>
       <w:r>
         <w:rPr>
@@ -8877,7 +9112,7 @@
         </w:rPr>
         <w:t>Irodalomjegyzék</w:t>
       </w:r>
-      <w:bookmarkEnd w:id="8"/>
+      <w:bookmarkEnd w:id="7"/>
       <w:proofErr w:type="spellEnd"/>
     </w:p>
     <w:p>
@@ -8928,19 +9163,11 @@
           <w:rFonts w:ascii="Times New Roman" w:hAnsi="Times New Roman" w:cs="Times New Roman"/>
         </w:rPr>
       </w:pPr>
-      <w:proofErr w:type="spellStart"/>
-      <w:r>
-        <w:rPr>
-          <w:rFonts w:ascii="Times New Roman" w:hAnsi="Times New Roman" w:cs="Times New Roman"/>
-        </w:rPr>
-        <w:t>Forrás</w:t>
-      </w:r>
-      <w:proofErr w:type="spellEnd"/>
-      <w:r>
-        <w:rPr>
-          <w:rFonts w:ascii="Times New Roman" w:hAnsi="Times New Roman" w:cs="Times New Roman"/>
-        </w:rPr>
-        <w:t xml:space="preserve">: </w:t>
+      <w:r>
+        <w:rPr>
+          <w:rFonts w:ascii="Times New Roman" w:hAnsi="Times New Roman" w:cs="Times New Roman"/>
+        </w:rPr>
+        <w:t xml:space="preserve">Forrás: </w:t>
       </w:r>
       <w:proofErr w:type="spellStart"/>
       <w:r>
@@ -9053,19 +9280,11 @@
           <w:rFonts w:ascii="Times New Roman" w:hAnsi="Times New Roman" w:cs="Times New Roman"/>
         </w:rPr>
       </w:pPr>
-      <w:proofErr w:type="spellStart"/>
-      <w:r>
-        <w:rPr>
-          <w:rFonts w:ascii="Times New Roman" w:hAnsi="Times New Roman" w:cs="Times New Roman"/>
-        </w:rPr>
-        <w:t>Forrás</w:t>
-      </w:r>
-      <w:proofErr w:type="spellEnd"/>
-      <w:r>
-        <w:rPr>
-          <w:rFonts w:ascii="Times New Roman" w:hAnsi="Times New Roman" w:cs="Times New Roman"/>
-        </w:rPr>
-        <w:t xml:space="preserve">: </w:t>
+      <w:r>
+        <w:rPr>
+          <w:rFonts w:ascii="Times New Roman" w:hAnsi="Times New Roman" w:cs="Times New Roman"/>
+        </w:rPr>
+        <w:t xml:space="preserve">Forrás: </w:t>
       </w:r>
       <w:r>
         <w:rPr>
@@ -9182,33 +9401,11 @@
           <w:rFonts w:ascii="Times New Roman" w:hAnsi="Times New Roman" w:cs="Times New Roman"/>
         </w:rPr>
       </w:pPr>
-      <w:proofErr w:type="spellStart"/>
-      <w:r>
-        <w:rPr>
-          <w:rFonts w:ascii="Times New Roman" w:hAnsi="Times New Roman" w:cs="Times New Roman"/>
-        </w:rPr>
-        <w:t>Forrás</w:t>
-      </w:r>
-      <w:proofErr w:type="spellEnd"/>
-      <w:r>
-        <w:rPr>
-          <w:rFonts w:ascii="Times New Roman" w:hAnsi="Times New Roman" w:cs="Times New Roman"/>
-        </w:rPr>
-        <w:t xml:space="preserve">: </w:t>
-      </w:r>
-      <w:proofErr w:type="spellStart"/>
-      <w:r>
-        <w:rPr>
-          <w:rFonts w:ascii="Times New Roman" w:hAnsi="Times New Roman" w:cs="Times New Roman"/>
-        </w:rPr>
-        <w:t>Inno</w:t>
-      </w:r>
-      <w:proofErr w:type="spellEnd"/>
-      <w:r>
-        <w:rPr>
-          <w:rFonts w:ascii="Times New Roman" w:hAnsi="Times New Roman" w:cs="Times New Roman"/>
-        </w:rPr>
-        <w:t xml:space="preserve"> Setup </w:t>
+      <w:r>
+        <w:rPr>
+          <w:rFonts w:ascii="Times New Roman" w:hAnsi="Times New Roman" w:cs="Times New Roman"/>
+        </w:rPr>
+        <w:t xml:space="preserve">Forrás: Inno Setup </w:t>
       </w:r>
       <w:proofErr w:type="spellStart"/>
       <w:r>
@@ -9449,7 +9646,7 @@
           <w:lang w:val="hu-HU"/>
         </w:rPr>
       </w:pPr>
-      <w:bookmarkStart w:id="9" w:name="_Toc227053851"/>
+      <w:bookmarkStart w:id="8" w:name="_Toc227104191"/>
       <w:r>
         <w:rPr>
           <w:rFonts w:ascii="Times New Roman" w:hAnsi="Times New Roman" w:cs="Times New Roman"/>
@@ -9457,7 +9654,7 @@
         </w:rPr>
         <w:t>Mellékletek</w:t>
       </w:r>
-      <w:bookmarkEnd w:id="9"/>
+      <w:bookmarkEnd w:id="8"/>
     </w:p>
     <w:p>
       <w:pPr>
@@ -9468,8 +9665,8 @@
           <w:lang w:val="hu-HU"/>
         </w:rPr>
       </w:pPr>
-      <w:bookmarkStart w:id="10" w:name="_worlds.py"/>
-      <w:bookmarkEnd w:id="10"/>
+      <w:bookmarkStart w:id="9" w:name="_worlds.py"/>
+      <w:bookmarkEnd w:id="9"/>
       <w:r>
         <w:rPr>
           <w:rFonts w:ascii="Times New Roman" w:hAnsi="Times New Roman" w:cs="Times New Roman"/>
@@ -9477,8 +9674,7 @@
         </w:rPr>
         <w:br w:type="page"/>
       </w:r>
-      <w:bookmarkStart w:id="11" w:name="_Toc227053852"/>
-      <w:proofErr w:type="gramStart"/>
+      <w:bookmarkStart w:id="10" w:name="_Toc227104192"/>
       <w:r>
         <w:rPr>
           <w:rFonts w:ascii="Times New Roman" w:hAnsi="Times New Roman" w:cs="Times New Roman"/>
@@ -9501,8 +9697,7 @@
         </w:rPr>
         <w:t>py</w:t>
       </w:r>
-      <w:bookmarkEnd w:id="11"/>
-      <w:proofErr w:type="gramEnd"/>
+      <w:bookmarkEnd w:id="10"/>
     </w:p>
     <w:p>
       <w:pPr>
@@ -9569,9 +9764,9 @@
           <w:lang w:val="hu-HU"/>
         </w:rPr>
       </w:pPr>
-      <w:bookmarkStart w:id="12" w:name="_MainWindow.xaml.cs"/>
-      <w:bookmarkStart w:id="13" w:name="_Toc227053853"/>
-      <w:bookmarkEnd w:id="12"/>
+      <w:bookmarkStart w:id="11" w:name="_MainWindow.xaml.cs"/>
+      <w:bookmarkStart w:id="12" w:name="_Toc227104193"/>
+      <w:bookmarkEnd w:id="11"/>
       <w:r>
         <w:rPr>
           <w:rFonts w:ascii="Times New Roman" w:hAnsi="Times New Roman" w:cs="Times New Roman"/>
@@ -9580,13 +9775,13 @@
         </w:rPr>
         <w:lastRenderedPageBreak/>
         <w:drawing>
-          <wp:anchor distT="0" distB="0" distL="114300" distR="114300" simplePos="0" relativeHeight="251663360" behindDoc="0" locked="0" layoutInCell="1" allowOverlap="1" wp14:anchorId="482A2827" wp14:editId="1C0B843E">
+          <wp:anchor distT="0" distB="0" distL="114300" distR="114300" simplePos="0" relativeHeight="251663360" behindDoc="0" locked="0" layoutInCell="1" allowOverlap="1" wp14:anchorId="482A2827" wp14:editId="367692E9">
             <wp:simplePos x="0" y="0"/>
             <wp:positionH relativeFrom="margin">
               <wp:align>center</wp:align>
             </wp:positionH>
             <wp:positionV relativeFrom="paragraph">
-              <wp:posOffset>762635</wp:posOffset>
+              <wp:posOffset>659268</wp:posOffset>
             </wp:positionV>
             <wp:extent cx="7048500" cy="7553325"/>
             <wp:effectExtent l="0" t="0" r="0" b="9525"/>
@@ -9657,7 +9852,7 @@
         </w:rPr>
         <w:t>s</w:t>
       </w:r>
-      <w:bookmarkEnd w:id="13"/>
+      <w:bookmarkEnd w:id="12"/>
       <w:proofErr w:type="spellEnd"/>
     </w:p>
     <w:p>
@@ -9669,9 +9864,9 @@
           <w:lang w:val="hu-HU"/>
         </w:rPr>
       </w:pPr>
-      <w:bookmarkStart w:id="14" w:name="_AddWindow.xaml.cs"/>
-      <w:bookmarkStart w:id="15" w:name="_Toc227053854"/>
-      <w:bookmarkEnd w:id="14"/>
+      <w:bookmarkStart w:id="13" w:name="_AddWindow.xaml.cs"/>
+      <w:bookmarkStart w:id="14" w:name="_Toc227104194"/>
+      <w:bookmarkEnd w:id="13"/>
       <w:r>
         <w:rPr>
           <w:rFonts w:ascii="Times New Roman" w:hAnsi="Times New Roman" w:cs="Times New Roman"/>
@@ -9743,7 +9938,7 @@
         </w:rPr>
         <w:t>AddWindow.xaml.cs</w:t>
       </w:r>
-      <w:bookmarkEnd w:id="15"/>
+      <w:bookmarkEnd w:id="14"/>
       <w:proofErr w:type="spellEnd"/>
     </w:p>
     <w:p>
@@ -9770,9 +9965,9 @@
           <w:lang w:val="hu-HU"/>
         </w:rPr>
       </w:pPr>
-      <w:bookmarkStart w:id="16" w:name="_menu.py"/>
-      <w:bookmarkStart w:id="17" w:name="_Toc227053855"/>
-      <w:bookmarkEnd w:id="16"/>
+      <w:bookmarkStart w:id="15" w:name="_menu.py"/>
+      <w:bookmarkStart w:id="16" w:name="_Toc227104195"/>
+      <w:bookmarkEnd w:id="15"/>
       <w:r>
         <w:rPr>
           <w:rFonts w:ascii="Times New Roman" w:hAnsi="Times New Roman" w:cs="Times New Roman"/>
@@ -9781,13 +9976,13 @@
         </w:rPr>
         <w:lastRenderedPageBreak/>
         <w:drawing>
-          <wp:anchor distT="0" distB="0" distL="114300" distR="114300" simplePos="0" relativeHeight="251665408" behindDoc="0" locked="0" layoutInCell="1" allowOverlap="1" wp14:anchorId="217EA455" wp14:editId="5AD49B05">
+          <wp:anchor distT="0" distB="0" distL="114300" distR="114300" simplePos="0" relativeHeight="251665408" behindDoc="0" locked="0" layoutInCell="1" allowOverlap="1" wp14:anchorId="217EA455" wp14:editId="2CA49329">
             <wp:simplePos x="0" y="0"/>
             <wp:positionH relativeFrom="margin">
               <wp:align>center</wp:align>
             </wp:positionH>
             <wp:positionV relativeFrom="paragraph">
-              <wp:posOffset>757555</wp:posOffset>
+              <wp:posOffset>494555</wp:posOffset>
             </wp:positionV>
             <wp:extent cx="6666230" cy="7905750"/>
             <wp:effectExtent l="0" t="0" r="1270" b="0"/>
@@ -9818,7 +10013,7 @@
                   <pic:spPr>
                     <a:xfrm>
                       <a:off x="0" y="0"/>
-                      <a:ext cx="6669043" cy="7908656"/>
+                      <a:ext cx="6666230" cy="7905750"/>
                     </a:xfrm>
                     <a:prstGeom prst="rect">
                       <a:avLst/>
@@ -9836,7 +10031,6 @@
           </wp:anchor>
         </w:drawing>
       </w:r>
-      <w:proofErr w:type="gramStart"/>
       <w:r>
         <w:rPr>
           <w:rFonts w:ascii="Times New Roman" w:hAnsi="Times New Roman" w:cs="Times New Roman"/>
@@ -9844,11 +10038,325 @@
         </w:rPr>
         <w:t>menu.py</w:t>
       </w:r>
+      <w:bookmarkEnd w:id="16"/>
+    </w:p>
+    <w:p>
+      <w:pPr>
+        <w:rPr>
+          <w:lang w:val="hu-HU"/>
+        </w:rPr>
+      </w:pPr>
+      <w:r>
+        <w:rPr>
+          <w:lang w:val="hu-HU"/>
+        </w:rPr>
+        <w:br w:type="page"/>
+      </w:r>
+    </w:p>
+    <w:p>
+      <w:pPr>
+        <w:pStyle w:val="Cmsor1"/>
+        <w:jc w:val="center"/>
+        <w:rPr>
+          <w:lang w:val="hu-HU"/>
+        </w:rPr>
+      </w:pPr>
+      <w:bookmarkStart w:id="17" w:name="_Sweagger_UI"/>
+      <w:bookmarkStart w:id="18" w:name="_Toc227104196"/>
       <w:bookmarkEnd w:id="17"/>
-      <w:proofErr w:type="gramEnd"/>
+      <w:r>
+        <w:rPr>
+          <w:noProof/>
+          <w:lang w:val="hu-HU"/>
+        </w:rPr>
+        <w:lastRenderedPageBreak/>
+        <w:drawing>
+          <wp:anchor distT="0" distB="0" distL="114300" distR="114300" simplePos="0" relativeHeight="251666432" behindDoc="0" locked="0" layoutInCell="1" allowOverlap="1" wp14:anchorId="506B29EC" wp14:editId="04F3CEAA">
+            <wp:simplePos x="0" y="0"/>
+            <wp:positionH relativeFrom="margin">
+              <wp:align>center</wp:align>
+            </wp:positionH>
+            <wp:positionV relativeFrom="paragraph">
+              <wp:posOffset>531053</wp:posOffset>
+            </wp:positionV>
+            <wp:extent cx="7214235" cy="5852160"/>
+            <wp:effectExtent l="0" t="0" r="5715" b="0"/>
+            <wp:wrapSquare wrapText="bothSides"/>
+            <wp:docPr id="1188917690" name="Kép 2"/>
+            <wp:cNvGraphicFramePr>
+              <a:graphicFrameLocks xmlns:a="http://schemas.openxmlformats.org/drawingml/2006/main" noChangeAspect="1"/>
+            </wp:cNvGraphicFramePr>
+            <a:graphic xmlns:a="http://schemas.openxmlformats.org/drawingml/2006/main">
+              <a:graphicData uri="http://schemas.openxmlformats.org/drawingml/2006/picture">
+                <pic:pic xmlns:pic="http://schemas.openxmlformats.org/drawingml/2006/picture">
+                  <pic:nvPicPr>
+                    <pic:cNvPr id="1188917690" name="Kép 1188917690"/>
+                    <pic:cNvPicPr/>
+                  </pic:nvPicPr>
+                  <pic:blipFill>
+                    <a:blip r:embed="rId21">
+                      <a:extLst>
+                        <a:ext uri="{28A0092B-C50C-407E-A947-70E740481C1C}">
+                          <a14:useLocalDpi xmlns:a14="http://schemas.microsoft.com/office/drawing/2010/main" val="0"/>
+                        </a:ext>
+                      </a:extLst>
+                    </a:blip>
+                    <a:stretch>
+                      <a:fillRect/>
+                    </a:stretch>
+                  </pic:blipFill>
+                  <pic:spPr>
+                    <a:xfrm>
+                      <a:off x="0" y="0"/>
+                      <a:ext cx="7230204" cy="5864931"/>
+                    </a:xfrm>
+                    <a:prstGeom prst="rect">
+                      <a:avLst/>
+                    </a:prstGeom>
+                  </pic:spPr>
+                </pic:pic>
+              </a:graphicData>
+            </a:graphic>
+            <wp14:sizeRelH relativeFrom="margin">
+              <wp14:pctWidth>0</wp14:pctWidth>
+            </wp14:sizeRelH>
+            <wp14:sizeRelV relativeFrom="margin">
+              <wp14:pctHeight>0</wp14:pctHeight>
+            </wp14:sizeRelV>
+          </wp:anchor>
+        </w:drawing>
+      </w:r>
+      <w:proofErr w:type="spellStart"/>
+      <w:r>
+        <w:rPr>
+          <w:lang w:val="hu-HU"/>
+        </w:rPr>
+        <w:t>Sweagger</w:t>
+      </w:r>
+      <w:proofErr w:type="spellEnd"/>
+      <w:r>
+        <w:rPr>
+          <w:lang w:val="hu-HU"/>
+        </w:rPr>
+        <w:t xml:space="preserve"> UI</w:t>
+      </w:r>
+      <w:bookmarkEnd w:id="18"/>
+    </w:p>
+    <w:p>
+      <w:pPr>
+        <w:rPr>
+          <w:lang w:val="hu-HU"/>
+        </w:rPr>
+      </w:pPr>
+      <w:r>
+        <w:rPr>
+          <w:lang w:val="hu-HU"/>
+        </w:rPr>
+        <w:br w:type="page"/>
+      </w:r>
+    </w:p>
+    <w:p>
+      <w:pPr>
+        <w:pStyle w:val="Cmsor1"/>
+        <w:jc w:val="center"/>
+        <w:rPr>
+          <w:lang w:val="hu-HU"/>
+        </w:rPr>
+      </w:pPr>
+      <w:bookmarkStart w:id="19" w:name="_Xampp_MySQL"/>
+      <w:bookmarkStart w:id="20" w:name="_Toc227104197"/>
+      <w:bookmarkEnd w:id="19"/>
+      <w:r>
+        <w:rPr>
+          <w:noProof/>
+          <w:lang w:val="hu-HU"/>
+        </w:rPr>
+        <w:lastRenderedPageBreak/>
+        <w:drawing>
+          <wp:anchor distT="0" distB="0" distL="114300" distR="114300" simplePos="0" relativeHeight="251667456" behindDoc="0" locked="0" layoutInCell="1" allowOverlap="1" wp14:anchorId="7CBDBA70" wp14:editId="5F01E55C">
+            <wp:simplePos x="0" y="0"/>
+            <wp:positionH relativeFrom="margin">
+              <wp:align>center</wp:align>
+            </wp:positionH>
+            <wp:positionV relativeFrom="paragraph">
+              <wp:posOffset>467222</wp:posOffset>
+            </wp:positionV>
+            <wp:extent cx="7044055" cy="4531995"/>
+            <wp:effectExtent l="0" t="0" r="4445" b="1905"/>
+            <wp:wrapSquare wrapText="bothSides"/>
+            <wp:docPr id="1212946816" name="Kép 3"/>
+            <wp:cNvGraphicFramePr>
+              <a:graphicFrameLocks xmlns:a="http://schemas.openxmlformats.org/drawingml/2006/main" noChangeAspect="1"/>
+            </wp:cNvGraphicFramePr>
+            <a:graphic xmlns:a="http://schemas.openxmlformats.org/drawingml/2006/main">
+              <a:graphicData uri="http://schemas.openxmlformats.org/drawingml/2006/picture">
+                <pic:pic xmlns:pic="http://schemas.openxmlformats.org/drawingml/2006/picture">
+                  <pic:nvPicPr>
+                    <pic:cNvPr id="1212946816" name="Kép 1212946816"/>
+                    <pic:cNvPicPr/>
+                  </pic:nvPicPr>
+                  <pic:blipFill>
+                    <a:blip r:embed="rId22" cstate="print">
+                      <a:extLst>
+                        <a:ext uri="{28A0092B-C50C-407E-A947-70E740481C1C}">
+                          <a14:useLocalDpi xmlns:a14="http://schemas.microsoft.com/office/drawing/2010/main" val="0"/>
+                        </a:ext>
+                      </a:extLst>
+                    </a:blip>
+                    <a:stretch>
+                      <a:fillRect/>
+                    </a:stretch>
+                  </pic:blipFill>
+                  <pic:spPr>
+                    <a:xfrm>
+                      <a:off x="0" y="0"/>
+                      <a:ext cx="7069388" cy="4548262"/>
+                    </a:xfrm>
+                    <a:prstGeom prst="rect">
+                      <a:avLst/>
+                    </a:prstGeom>
+                  </pic:spPr>
+                </pic:pic>
+              </a:graphicData>
+            </a:graphic>
+            <wp14:sizeRelH relativeFrom="margin">
+              <wp14:pctWidth>0</wp14:pctWidth>
+            </wp14:sizeRelH>
+            <wp14:sizeRelV relativeFrom="margin">
+              <wp14:pctHeight>0</wp14:pctHeight>
+            </wp14:sizeRelV>
+          </wp:anchor>
+        </w:drawing>
+      </w:r>
+      <w:proofErr w:type="spellStart"/>
+      <w:r>
+        <w:rPr>
+          <w:lang w:val="hu-HU"/>
+        </w:rPr>
+        <w:t>Xampp</w:t>
+      </w:r>
+      <w:proofErr w:type="spellEnd"/>
+      <w:r>
+        <w:rPr>
+          <w:lang w:val="hu-HU"/>
+        </w:rPr>
+        <w:t xml:space="preserve"> </w:t>
+      </w:r>
+      <w:proofErr w:type="spellStart"/>
+      <w:r>
+        <w:rPr>
+          <w:lang w:val="hu-HU"/>
+        </w:rPr>
+        <w:t>MySQL</w:t>
+      </w:r>
+      <w:bookmarkEnd w:id="20"/>
+      <w:proofErr w:type="spellEnd"/>
+    </w:p>
+    <w:p>
+      <w:pPr>
+        <w:rPr>
+          <w:lang w:val="hu-HU"/>
+        </w:rPr>
+      </w:pPr>
+      <w:r>
+        <w:rPr>
+          <w:lang w:val="hu-HU"/>
+        </w:rPr>
+        <w:br w:type="page"/>
+      </w:r>
+    </w:p>
+    <w:p>
+      <w:pPr>
+        <w:pStyle w:val="Cmsor1"/>
+        <w:jc w:val="center"/>
+        <w:rPr>
+          <w:lang w:val="hu-HU"/>
+        </w:rPr>
+      </w:pPr>
+      <w:bookmarkStart w:id="21" w:name="_Index.jsx"/>
+      <w:bookmarkStart w:id="22" w:name="_Toc227104198"/>
+      <w:bookmarkEnd w:id="21"/>
+      <w:r>
+        <w:rPr>
+          <w:noProof/>
+          <w:lang w:val="hu-HU"/>
+        </w:rPr>
+        <w:lastRenderedPageBreak/>
+        <w:drawing>
+          <wp:anchor distT="0" distB="0" distL="114300" distR="114300" simplePos="0" relativeHeight="251668480" behindDoc="0" locked="0" layoutInCell="1" allowOverlap="1" wp14:anchorId="118766BC" wp14:editId="6D8DB178">
+            <wp:simplePos x="0" y="0"/>
+            <wp:positionH relativeFrom="page">
+              <wp:align>right</wp:align>
+            </wp:positionH>
+            <wp:positionV relativeFrom="paragraph">
+              <wp:posOffset>546597</wp:posOffset>
+            </wp:positionV>
+            <wp:extent cx="7489825" cy="3211830"/>
+            <wp:effectExtent l="0" t="0" r="0" b="7620"/>
+            <wp:wrapSquare wrapText="bothSides"/>
+            <wp:docPr id="387182555" name="Kép 4"/>
+            <wp:cNvGraphicFramePr>
+              <a:graphicFrameLocks xmlns:a="http://schemas.openxmlformats.org/drawingml/2006/main" noChangeAspect="1"/>
+            </wp:cNvGraphicFramePr>
+            <a:graphic xmlns:a="http://schemas.openxmlformats.org/drawingml/2006/main">
+              <a:graphicData uri="http://schemas.openxmlformats.org/drawingml/2006/picture">
+                <pic:pic xmlns:pic="http://schemas.openxmlformats.org/drawingml/2006/picture">
+                  <pic:nvPicPr>
+                    <pic:cNvPr id="387182555" name="Kép 387182555"/>
+                    <pic:cNvPicPr/>
+                  </pic:nvPicPr>
+                  <pic:blipFill>
+                    <a:blip r:embed="rId23">
+                      <a:extLst>
+                        <a:ext uri="{28A0092B-C50C-407E-A947-70E740481C1C}">
+                          <a14:useLocalDpi xmlns:a14="http://schemas.microsoft.com/office/drawing/2010/main" val="0"/>
+                        </a:ext>
+                      </a:extLst>
+                    </a:blip>
+                    <a:stretch>
+                      <a:fillRect/>
+                    </a:stretch>
+                  </pic:blipFill>
+                  <pic:spPr>
+                    <a:xfrm>
+                      <a:off x="0" y="0"/>
+                      <a:ext cx="7492898" cy="3213390"/>
+                    </a:xfrm>
+                    <a:prstGeom prst="rect">
+                      <a:avLst/>
+                    </a:prstGeom>
+                  </pic:spPr>
+                </pic:pic>
+              </a:graphicData>
+            </a:graphic>
+            <wp14:sizeRelH relativeFrom="margin">
+              <wp14:pctWidth>0</wp14:pctWidth>
+            </wp14:sizeRelH>
+            <wp14:sizeRelV relativeFrom="margin">
+              <wp14:pctHeight>0</wp14:pctHeight>
+            </wp14:sizeRelV>
+          </wp:anchor>
+        </w:drawing>
+      </w:r>
+      <w:proofErr w:type="spellStart"/>
+      <w:r>
+        <w:rPr>
+          <w:lang w:val="hu-HU"/>
+        </w:rPr>
+        <w:t>Index.jsx</w:t>
+      </w:r>
+      <w:bookmarkEnd w:id="22"/>
+      <w:proofErr w:type="spellEnd"/>
+    </w:p>
+    <w:p>
+      <w:pPr>
+        <w:rPr>
+          <w:lang w:val="hu-HU"/>
+        </w:rPr>
+      </w:pPr>
     </w:p>
     <w:sectPr>
-      <w:footerReference w:type="default" r:id="rId21"/>
+      <w:footerReference w:type="default" r:id="rId24"/>
       <w:pgSz w:w="11906" w:h="16838"/>
       <w:pgMar w:top="1417" w:right="1417" w:bottom="1417" w:left="1417" w:header="708" w:footer="708" w:gutter="0"/>
       <w:pgNumType w:fmt="upperRoman" w:start="1"/>
@@ -9860,7 +10368,7 @@
 </file>
 
 <file path=word/endnotes.xml><?xml version="1.0" encoding="utf-8"?>
-<w:endnotes xmlns:wpc="http://schemas.microsoft.com/office/word/2010/wordprocessingCanvas" xmlns:cx="http://schemas.microsoft.com/office/drawing/2014/chartex" xmlns:cx1="http://schemas.microsoft.com/office/drawing/2015/9/8/chartex" xmlns:mc="http://schemas.openxmlformats.org/markup-compatibility/2006" xmlns:o="urn:schemas-microsoft-com:office:office" xmlns:r="http://schemas.openxmlformats.org/officeDocument/2006/relationships" xmlns:m="http://schemas.openxmlformats.org/officeDocument/2006/math" xmlns:v="urn:schemas-microsoft-com:vml" xmlns:wp14="http://schemas.microsoft.com/office/word/2010/wordprocessingDrawing" xmlns:wp="http://schemas.openxmlformats.org/drawingml/2006/wordprocessingDrawing" xmlns:w10="urn:schemas-microsoft-com:office:word" xmlns:w="http://schemas.openxmlformats.org/wordprocessingml/2006/main" xmlns:w14="http://schemas.microsoft.com/office/word/2010/wordml" xmlns:w15="http://schemas.microsoft.com/office/word/2012/wordml" xmlns:w16se="http://schemas.microsoft.com/office/word/2015/wordml/symex" xmlns:wpg="http://schemas.microsoft.com/office/word/2010/wordprocessingGroup" xmlns:wpi="http://schemas.microsoft.com/office/word/2010/wordprocessingInk" xmlns:wne="http://schemas.microsoft.com/office/word/2006/wordml" xmlns:wps="http://schemas.microsoft.com/office/word/2010/wordprocessingShape" mc:Ignorable="w14 w15 w16se wp14">
+<w:endnotes xmlns:wpc="http://schemas.microsoft.com/office/word/2010/wordprocessingCanvas" xmlns:cx="http://schemas.microsoft.com/office/drawing/2014/chartex" xmlns:cx1="http://schemas.microsoft.com/office/drawing/2015/9/8/chartex" xmlns:cx2="http://schemas.microsoft.com/office/drawing/2015/10/21/chartex" xmlns:cx3="http://schemas.microsoft.com/office/drawing/2016/5/9/chartex" xmlns:cx4="http://schemas.microsoft.com/office/drawing/2016/5/10/chartex" xmlns:cx5="http://schemas.microsoft.com/office/drawing/2016/5/11/chartex" xmlns:cx6="http://schemas.microsoft.com/office/drawing/2016/5/12/chartex" xmlns:cx7="http://schemas.microsoft.com/office/drawing/2016/5/13/chartex" xmlns:cx8="http://schemas.microsoft.com/office/drawing/2016/5/14/chartex" xmlns:mc="http://schemas.openxmlformats.org/markup-compatibility/2006" xmlns:aink="http://schemas.microsoft.com/office/drawing/2016/ink" xmlns:am3d="http://schemas.microsoft.com/office/drawing/2017/model3d" xmlns:o="urn:schemas-microsoft-com:office:office" xmlns:oel="http://schemas.microsoft.com/office/2019/extlst" xmlns:r="http://schemas.openxmlformats.org/officeDocument/2006/relationships" xmlns:m="http://schemas.openxmlformats.org/officeDocument/2006/math" xmlns:v="urn:schemas-microsoft-com:vml" xmlns:wp14="http://schemas.microsoft.com/office/word/2010/wordprocessingDrawing" xmlns:wp="http://schemas.openxmlformats.org/drawingml/2006/wordprocessingDrawing" xmlns:w10="urn:schemas-microsoft-com:office:word" xmlns:w="http://schemas.openxmlformats.org/wordprocessingml/2006/main" xmlns:w14="http://schemas.microsoft.com/office/word/2010/wordml" xmlns:w15="http://schemas.microsoft.com/office/word/2012/wordml" xmlns:w16cex="http://schemas.microsoft.com/office/word/2018/wordml/cex" xmlns:w16cid="http://schemas.microsoft.com/office/word/2016/wordml/cid" xmlns:w16="http://schemas.microsoft.com/office/word/2018/wordml" xmlns:w16du="http://schemas.microsoft.com/office/word/2023/wordml/word16du" xmlns:w16sdtdh="http://schemas.microsoft.com/office/word/2020/wordml/sdtdatahash" xmlns:w16sdtfl="http://schemas.microsoft.com/office/word/2024/wordml/sdtformatlock" xmlns:w16se="http://schemas.microsoft.com/office/word/2015/wordml/symex" xmlns:wpg="http://schemas.microsoft.com/office/word/2010/wordprocessingGroup" xmlns:wpi="http://schemas.microsoft.com/office/word/2010/wordprocessingInk" xmlns:wne="http://schemas.microsoft.com/office/word/2006/wordml" xmlns:wps="http://schemas.microsoft.com/office/word/2010/wordprocessingShape" mc:Ignorable="w14 w15 w16se w16cid w16 w16cex w16sdtdh w16sdtfl w16du wp14">
   <w:endnote w:type="separator" w:id="-1">
     <w:p>
       <w:pPr>
@@ -9885,7 +10393,7 @@
 </file>
 
 <file path=word/footer1.xml><?xml version="1.0" encoding="utf-8"?>
-<w:ftr xmlns:wpc="http://schemas.microsoft.com/office/word/2010/wordprocessingCanvas" xmlns:cx="http://schemas.microsoft.com/office/drawing/2014/chartex" xmlns:cx1="http://schemas.microsoft.com/office/drawing/2015/9/8/chartex" xmlns:mc="http://schemas.openxmlformats.org/markup-compatibility/2006" xmlns:o="urn:schemas-microsoft-com:office:office" xmlns:r="http://schemas.openxmlformats.org/officeDocument/2006/relationships" xmlns:m="http://schemas.openxmlformats.org/officeDocument/2006/math" xmlns:v="urn:schemas-microsoft-com:vml" xmlns:wp14="http://schemas.microsoft.com/office/word/2010/wordprocessingDrawing" xmlns:wp="http://schemas.openxmlformats.org/drawingml/2006/wordprocessingDrawing" xmlns:w10="urn:schemas-microsoft-com:office:word" xmlns:w="http://schemas.openxmlformats.org/wordprocessingml/2006/main" xmlns:w14="http://schemas.microsoft.com/office/word/2010/wordml" xmlns:w15="http://schemas.microsoft.com/office/word/2012/wordml" xmlns:w16se="http://schemas.microsoft.com/office/word/2015/wordml/symex" xmlns:wpg="http://schemas.microsoft.com/office/word/2010/wordprocessingGroup" xmlns:wpi="http://schemas.microsoft.com/office/word/2010/wordprocessingInk" xmlns:wne="http://schemas.microsoft.com/office/word/2006/wordml" xmlns:wps="http://schemas.microsoft.com/office/word/2010/wordprocessingShape" mc:Ignorable="w14 w15 w16se wp14">
+<w:ftr xmlns:wpc="http://schemas.microsoft.com/office/word/2010/wordprocessingCanvas" xmlns:cx="http://schemas.microsoft.com/office/drawing/2014/chartex" xmlns:cx1="http://schemas.microsoft.com/office/drawing/2015/9/8/chartex" xmlns:cx2="http://schemas.microsoft.com/office/drawing/2015/10/21/chartex" xmlns:cx3="http://schemas.microsoft.com/office/drawing/2016/5/9/chartex" xmlns:cx4="http://schemas.microsoft.com/office/drawing/2016/5/10/chartex" xmlns:cx5="http://schemas.microsoft.com/office/drawing/2016/5/11/chartex" xmlns:cx6="http://schemas.microsoft.com/office/drawing/2016/5/12/chartex" xmlns:cx7="http://schemas.microsoft.com/office/drawing/2016/5/13/chartex" xmlns:cx8="http://schemas.microsoft.com/office/drawing/2016/5/14/chartex" xmlns:mc="http://schemas.openxmlformats.org/markup-compatibility/2006" xmlns:aink="http://schemas.microsoft.com/office/drawing/2016/ink" xmlns:am3d="http://schemas.microsoft.com/office/drawing/2017/model3d" xmlns:o="urn:schemas-microsoft-com:office:office" xmlns:oel="http://schemas.microsoft.com/office/2019/extlst" xmlns:r="http://schemas.openxmlformats.org/officeDocument/2006/relationships" xmlns:m="http://schemas.openxmlformats.org/officeDocument/2006/math" xmlns:v="urn:schemas-microsoft-com:vml" xmlns:wp14="http://schemas.microsoft.com/office/word/2010/wordprocessingDrawing" xmlns:wp="http://schemas.openxmlformats.org/drawingml/2006/wordprocessingDrawing" xmlns:w10="urn:schemas-microsoft-com:office:word" xmlns:w="http://schemas.openxmlformats.org/wordprocessingml/2006/main" xmlns:w14="http://schemas.microsoft.com/office/word/2010/wordml" xmlns:w15="http://schemas.microsoft.com/office/word/2012/wordml" xmlns:w16cex="http://schemas.microsoft.com/office/word/2018/wordml/cex" xmlns:w16cid="http://schemas.microsoft.com/office/word/2016/wordml/cid" xmlns:w16="http://schemas.microsoft.com/office/word/2018/wordml" xmlns:w16du="http://schemas.microsoft.com/office/word/2023/wordml/word16du" xmlns:w16sdtdh="http://schemas.microsoft.com/office/word/2020/wordml/sdtdatahash" xmlns:w16sdtfl="http://schemas.microsoft.com/office/word/2024/wordml/sdtformatlock" xmlns:w16se="http://schemas.microsoft.com/office/word/2015/wordml/symex" xmlns:wpg="http://schemas.microsoft.com/office/word/2010/wordprocessingGroup" xmlns:wpi="http://schemas.microsoft.com/office/word/2010/wordprocessingInk" xmlns:wne="http://schemas.microsoft.com/office/word/2006/wordml" xmlns:wps="http://schemas.microsoft.com/office/word/2010/wordprocessingShape" mc:Ignorable="w14 w15 w16se w16cid w16 w16cex w16sdtdh w16sdtfl w16du wp14">
   <w:sdt>
     <w:sdtPr>
       <w:rPr>
@@ -9897,11 +10405,6 @@
         <w:docPartUnique/>
       </w:docPartObj>
     </w:sdtPr>
-    <w:sdtEndPr>
-      <w:rPr>
-        <w:rStyle w:val="Oldalszm"/>
-      </w:rPr>
-    </w:sdtEndPr>
     <w:sdtContent>
       <w:p>
         <w:pPr>
@@ -9943,11 +10446,6 @@
         <w:docPartUnique/>
       </w:docPartObj>
     </w:sdtPr>
-    <w:sdtEndPr>
-      <w:rPr>
-        <w:rStyle w:val="Oldalszm"/>
-      </w:rPr>
-    </w:sdtEndPr>
     <w:sdtContent>
       <w:p>
         <w:pPr>
@@ -9989,11 +10487,6 @@
         <w:docPartUnique/>
       </w:docPartObj>
     </w:sdtPr>
-    <w:sdtEndPr>
-      <w:rPr>
-        <w:rStyle w:val="Oldalszm"/>
-      </w:rPr>
-    </w:sdtEndPr>
     <w:sdtContent>
       <w:p>
         <w:pPr>
@@ -10033,7 +10526,7 @@
 </file>
 
 <file path=word/footer2.xml><?xml version="1.0" encoding="utf-8"?>
-<w:ftr xmlns:wpc="http://schemas.microsoft.com/office/word/2010/wordprocessingCanvas" xmlns:cx="http://schemas.microsoft.com/office/drawing/2014/chartex" xmlns:cx1="http://schemas.microsoft.com/office/drawing/2015/9/8/chartex" xmlns:mc="http://schemas.openxmlformats.org/markup-compatibility/2006" xmlns:o="urn:schemas-microsoft-com:office:office" xmlns:r="http://schemas.openxmlformats.org/officeDocument/2006/relationships" xmlns:m="http://schemas.openxmlformats.org/officeDocument/2006/math" xmlns:v="urn:schemas-microsoft-com:vml" xmlns:wp14="http://schemas.microsoft.com/office/word/2010/wordprocessingDrawing" xmlns:wp="http://schemas.openxmlformats.org/drawingml/2006/wordprocessingDrawing" xmlns:w10="urn:schemas-microsoft-com:office:word" xmlns:w="http://schemas.openxmlformats.org/wordprocessingml/2006/main" xmlns:w14="http://schemas.microsoft.com/office/word/2010/wordml" xmlns:w15="http://schemas.microsoft.com/office/word/2012/wordml" xmlns:w16se="http://schemas.microsoft.com/office/word/2015/wordml/symex" xmlns:wpg="http://schemas.microsoft.com/office/word/2010/wordprocessingGroup" xmlns:wpi="http://schemas.microsoft.com/office/word/2010/wordprocessingInk" xmlns:wne="http://schemas.microsoft.com/office/word/2006/wordml" xmlns:wps="http://schemas.microsoft.com/office/word/2010/wordprocessingShape" mc:Ignorable="w14 w15 w16se wp14">
+<w:ftr xmlns:wpc="http://schemas.microsoft.com/office/word/2010/wordprocessingCanvas" xmlns:cx="http://schemas.microsoft.com/office/drawing/2014/chartex" xmlns:cx1="http://schemas.microsoft.com/office/drawing/2015/9/8/chartex" xmlns:cx2="http://schemas.microsoft.com/office/drawing/2015/10/21/chartex" xmlns:cx3="http://schemas.microsoft.com/office/drawing/2016/5/9/chartex" xmlns:cx4="http://schemas.microsoft.com/office/drawing/2016/5/10/chartex" xmlns:cx5="http://schemas.microsoft.com/office/drawing/2016/5/11/chartex" xmlns:cx6="http://schemas.microsoft.com/office/drawing/2016/5/12/chartex" xmlns:cx7="http://schemas.microsoft.com/office/drawing/2016/5/13/chartex" xmlns:cx8="http://schemas.microsoft.com/office/drawing/2016/5/14/chartex" xmlns:mc="http://schemas.openxmlformats.org/markup-compatibility/2006" xmlns:aink="http://schemas.microsoft.com/office/drawing/2016/ink" xmlns:am3d="http://schemas.microsoft.com/office/drawing/2017/model3d" xmlns:o="urn:schemas-microsoft-com:office:office" xmlns:oel="http://schemas.microsoft.com/office/2019/extlst" xmlns:r="http://schemas.openxmlformats.org/officeDocument/2006/relationships" xmlns:m="http://schemas.openxmlformats.org/officeDocument/2006/math" xmlns:v="urn:schemas-microsoft-com:vml" xmlns:wp14="http://schemas.microsoft.com/office/word/2010/wordprocessingDrawing" xmlns:wp="http://schemas.openxmlformats.org/drawingml/2006/wordprocessingDrawing" xmlns:w10="urn:schemas-microsoft-com:office:word" xmlns:w="http://schemas.openxmlformats.org/wordprocessingml/2006/main" xmlns:w14="http://schemas.microsoft.com/office/word/2010/wordml" xmlns:w15="http://schemas.microsoft.com/office/word/2012/wordml" xmlns:w16cex="http://schemas.microsoft.com/office/word/2018/wordml/cex" xmlns:w16cid="http://schemas.microsoft.com/office/word/2016/wordml/cid" xmlns:w16="http://schemas.microsoft.com/office/word/2018/wordml" xmlns:w16du="http://schemas.microsoft.com/office/word/2023/wordml/word16du" xmlns:w16sdtdh="http://schemas.microsoft.com/office/word/2020/wordml/sdtdatahash" xmlns:w16sdtfl="http://schemas.microsoft.com/office/word/2024/wordml/sdtformatlock" xmlns:w16se="http://schemas.microsoft.com/office/word/2015/wordml/symex" xmlns:wpg="http://schemas.microsoft.com/office/word/2010/wordprocessingGroup" xmlns:wpi="http://schemas.microsoft.com/office/word/2010/wordprocessingInk" xmlns:wne="http://schemas.microsoft.com/office/word/2006/wordml" xmlns:wps="http://schemas.microsoft.com/office/word/2010/wordprocessingShape" mc:Ignorable="w14 w15 w16se w16cid w16 w16cex w16sdtdh w16sdtfl w16du wp14">
   <w:p>
     <w:pPr>
       <w:pStyle w:val="llb"/>
@@ -10053,7 +10546,7 @@
 </file>
 
 <file path=word/footer3.xml><?xml version="1.0" encoding="utf-8"?>
-<w:ftr xmlns:wpc="http://schemas.microsoft.com/office/word/2010/wordprocessingCanvas" xmlns:cx="http://schemas.microsoft.com/office/drawing/2014/chartex" xmlns:cx1="http://schemas.microsoft.com/office/drawing/2015/9/8/chartex" xmlns:mc="http://schemas.openxmlformats.org/markup-compatibility/2006" xmlns:o="urn:schemas-microsoft-com:office:office" xmlns:r="http://schemas.openxmlformats.org/officeDocument/2006/relationships" xmlns:m="http://schemas.openxmlformats.org/officeDocument/2006/math" xmlns:v="urn:schemas-microsoft-com:vml" xmlns:wp14="http://schemas.microsoft.com/office/word/2010/wordprocessingDrawing" xmlns:wp="http://schemas.openxmlformats.org/drawingml/2006/wordprocessingDrawing" xmlns:w10="urn:schemas-microsoft-com:office:word" xmlns:w="http://schemas.openxmlformats.org/wordprocessingml/2006/main" xmlns:w14="http://schemas.microsoft.com/office/word/2010/wordml" xmlns:w15="http://schemas.microsoft.com/office/word/2012/wordml" xmlns:w16se="http://schemas.microsoft.com/office/word/2015/wordml/symex" xmlns:wpg="http://schemas.microsoft.com/office/word/2010/wordprocessingGroup" xmlns:wpi="http://schemas.microsoft.com/office/word/2010/wordprocessingInk" xmlns:wne="http://schemas.microsoft.com/office/word/2006/wordml" xmlns:wps="http://schemas.microsoft.com/office/word/2010/wordprocessingShape" mc:Ignorable="w14 w15 w16se wp14">
+<w:ftr xmlns:wpc="http://schemas.microsoft.com/office/word/2010/wordprocessingCanvas" xmlns:cx="http://schemas.microsoft.com/office/drawing/2014/chartex" xmlns:cx1="http://schemas.microsoft.com/office/drawing/2015/9/8/chartex" xmlns:cx2="http://schemas.microsoft.com/office/drawing/2015/10/21/chartex" xmlns:cx3="http://schemas.microsoft.com/office/drawing/2016/5/9/chartex" xmlns:cx4="http://schemas.microsoft.com/office/drawing/2016/5/10/chartex" xmlns:cx5="http://schemas.microsoft.com/office/drawing/2016/5/11/chartex" xmlns:cx6="http://schemas.microsoft.com/office/drawing/2016/5/12/chartex" xmlns:cx7="http://schemas.microsoft.com/office/drawing/2016/5/13/chartex" xmlns:cx8="http://schemas.microsoft.com/office/drawing/2016/5/14/chartex" xmlns:mc="http://schemas.openxmlformats.org/markup-compatibility/2006" xmlns:aink="http://schemas.microsoft.com/office/drawing/2016/ink" xmlns:am3d="http://schemas.microsoft.com/office/drawing/2017/model3d" xmlns:o="urn:schemas-microsoft-com:office:office" xmlns:oel="http://schemas.microsoft.com/office/2019/extlst" xmlns:r="http://schemas.openxmlformats.org/officeDocument/2006/relationships" xmlns:m="http://schemas.openxmlformats.org/officeDocument/2006/math" xmlns:v="urn:schemas-microsoft-com:vml" xmlns:wp14="http://schemas.microsoft.com/office/word/2010/wordprocessingDrawing" xmlns:wp="http://schemas.openxmlformats.org/drawingml/2006/wordprocessingDrawing" xmlns:w10="urn:schemas-microsoft-com:office:word" xmlns:w="http://schemas.openxmlformats.org/wordprocessingml/2006/main" xmlns:w14="http://schemas.microsoft.com/office/word/2010/wordml" xmlns:w15="http://schemas.microsoft.com/office/word/2012/wordml" xmlns:w16cex="http://schemas.microsoft.com/office/word/2018/wordml/cex" xmlns:w16cid="http://schemas.microsoft.com/office/word/2016/wordml/cid" xmlns:w16="http://schemas.microsoft.com/office/word/2018/wordml" xmlns:w16du="http://schemas.microsoft.com/office/word/2023/wordml/word16du" xmlns:w16sdtdh="http://schemas.microsoft.com/office/word/2020/wordml/sdtdatahash" xmlns:w16sdtfl="http://schemas.microsoft.com/office/word/2024/wordml/sdtformatlock" xmlns:w16se="http://schemas.microsoft.com/office/word/2015/wordml/symex" xmlns:wpg="http://schemas.microsoft.com/office/word/2010/wordprocessingGroup" xmlns:wpi="http://schemas.microsoft.com/office/word/2010/wordprocessingInk" xmlns:wne="http://schemas.microsoft.com/office/word/2006/wordml" xmlns:wps="http://schemas.microsoft.com/office/word/2010/wordprocessingShape" mc:Ignorable="w14 w15 w16se w16cid w16 w16cex w16sdtdh w16sdtfl w16du wp14">
   <w:sdt>
     <w:sdtPr>
       <w:rPr>
@@ -10065,11 +10558,6 @@
         <w:docPartUnique/>
       </w:docPartObj>
     </w:sdtPr>
-    <w:sdtEndPr>
-      <w:rPr>
-        <w:rStyle w:val="Oldalszm"/>
-      </w:rPr>
-    </w:sdtEndPr>
     <w:sdtContent>
       <w:p>
         <w:pPr>
@@ -10133,7 +10621,7 @@
 </file>
 
 <file path=word/footer4.xml><?xml version="1.0" encoding="utf-8"?>
-<w:ftr xmlns:wpc="http://schemas.microsoft.com/office/word/2010/wordprocessingCanvas" xmlns:cx="http://schemas.microsoft.com/office/drawing/2014/chartex" xmlns:cx1="http://schemas.microsoft.com/office/drawing/2015/9/8/chartex" xmlns:mc="http://schemas.openxmlformats.org/markup-compatibility/2006" xmlns:o="urn:schemas-microsoft-com:office:office" xmlns:r="http://schemas.openxmlformats.org/officeDocument/2006/relationships" xmlns:m="http://schemas.openxmlformats.org/officeDocument/2006/math" xmlns:v="urn:schemas-microsoft-com:vml" xmlns:wp14="http://schemas.microsoft.com/office/word/2010/wordprocessingDrawing" xmlns:wp="http://schemas.openxmlformats.org/drawingml/2006/wordprocessingDrawing" xmlns:w10="urn:schemas-microsoft-com:office:word" xmlns:w="http://schemas.openxmlformats.org/wordprocessingml/2006/main" xmlns:w14="http://schemas.microsoft.com/office/word/2010/wordml" xmlns:w15="http://schemas.microsoft.com/office/word/2012/wordml" xmlns:w16se="http://schemas.microsoft.com/office/word/2015/wordml/symex" xmlns:wpg="http://schemas.microsoft.com/office/word/2010/wordprocessingGroup" xmlns:wpi="http://schemas.microsoft.com/office/word/2010/wordprocessingInk" xmlns:wne="http://schemas.microsoft.com/office/word/2006/wordml" xmlns:wps="http://schemas.microsoft.com/office/word/2010/wordprocessingShape" mc:Ignorable="w14 w15 w16se wp14">
+<w:ftr xmlns:wpc="http://schemas.microsoft.com/office/word/2010/wordprocessingCanvas" xmlns:cx="http://schemas.microsoft.com/office/drawing/2014/chartex" xmlns:cx1="http://schemas.microsoft.com/office/drawing/2015/9/8/chartex" xmlns:cx2="http://schemas.microsoft.com/office/drawing/2015/10/21/chartex" xmlns:cx3="http://schemas.microsoft.com/office/drawing/2016/5/9/chartex" xmlns:cx4="http://schemas.microsoft.com/office/drawing/2016/5/10/chartex" xmlns:cx5="http://schemas.microsoft.com/office/drawing/2016/5/11/chartex" xmlns:cx6="http://schemas.microsoft.com/office/drawing/2016/5/12/chartex" xmlns:cx7="http://schemas.microsoft.com/office/drawing/2016/5/13/chartex" xmlns:cx8="http://schemas.microsoft.com/office/drawing/2016/5/14/chartex" xmlns:mc="http://schemas.openxmlformats.org/markup-compatibility/2006" xmlns:aink="http://schemas.microsoft.com/office/drawing/2016/ink" xmlns:am3d="http://schemas.microsoft.com/office/drawing/2017/model3d" xmlns:o="urn:schemas-microsoft-com:office:office" xmlns:oel="http://schemas.microsoft.com/office/2019/extlst" xmlns:r="http://schemas.openxmlformats.org/officeDocument/2006/relationships" xmlns:m="http://schemas.openxmlformats.org/officeDocument/2006/math" xmlns:v="urn:schemas-microsoft-com:vml" xmlns:wp14="http://schemas.microsoft.com/office/word/2010/wordprocessingDrawing" xmlns:wp="http://schemas.openxmlformats.org/drawingml/2006/wordprocessingDrawing" xmlns:w10="urn:schemas-microsoft-com:office:word" xmlns:w="http://schemas.openxmlformats.org/wordprocessingml/2006/main" xmlns:w14="http://schemas.microsoft.com/office/word/2010/wordml" xmlns:w15="http://schemas.microsoft.com/office/word/2012/wordml" xmlns:w16cex="http://schemas.microsoft.com/office/word/2018/wordml/cex" xmlns:w16cid="http://schemas.microsoft.com/office/word/2016/wordml/cid" xmlns:w16="http://schemas.microsoft.com/office/word/2018/wordml" xmlns:w16du="http://schemas.microsoft.com/office/word/2023/wordml/word16du" xmlns:w16sdtdh="http://schemas.microsoft.com/office/word/2020/wordml/sdtdatahash" xmlns:w16sdtfl="http://schemas.microsoft.com/office/word/2024/wordml/sdtformatlock" xmlns:w16se="http://schemas.microsoft.com/office/word/2015/wordml/symex" xmlns:wpg="http://schemas.microsoft.com/office/word/2010/wordprocessingGroup" xmlns:wpi="http://schemas.microsoft.com/office/word/2010/wordprocessingInk" xmlns:wne="http://schemas.microsoft.com/office/word/2006/wordml" xmlns:wps="http://schemas.microsoft.com/office/word/2010/wordprocessingShape" mc:Ignorable="w14 w15 w16se w16cid w16 w16cex w16sdtdh w16sdtfl w16du wp14">
   <w:sdt>
     <w:sdtPr>
       <w:rPr>
@@ -10145,11 +10633,6 @@
         <w:docPartUnique/>
       </w:docPartObj>
     </w:sdtPr>
-    <w:sdtEndPr>
-      <w:rPr>
-        <w:rStyle w:val="Oldalszm"/>
-      </w:rPr>
-    </w:sdtEndPr>
     <w:sdtContent>
       <w:p>
         <w:pPr>
@@ -10215,11 +10698,6 @@
         <w:docPartUnique/>
       </w:docPartObj>
     </w:sdtPr>
-    <w:sdtEndPr>
-      <w:rPr>
-        <w:rStyle w:val="Oldalszm"/>
-      </w:rPr>
-    </w:sdtEndPr>
     <w:sdtContent>
       <w:p>
         <w:pPr>
@@ -10242,7 +10720,7 @@
 </file>
 
 <file path=word/footnotes.xml><?xml version="1.0" encoding="utf-8"?>
-<w:footnotes xmlns:wpc="http://schemas.microsoft.com/office/word/2010/wordprocessingCanvas" xmlns:cx="http://schemas.microsoft.com/office/drawing/2014/chartex" xmlns:cx1="http://schemas.microsoft.com/office/drawing/2015/9/8/chartex" xmlns:mc="http://schemas.openxmlformats.org/markup-compatibility/2006" xmlns:o="urn:schemas-microsoft-com:office:office" xmlns:r="http://schemas.openxmlformats.org/officeDocument/2006/relationships" xmlns:m="http://schemas.openxmlformats.org/officeDocument/2006/math" xmlns:v="urn:schemas-microsoft-com:vml" xmlns:wp14="http://schemas.microsoft.com/office/word/2010/wordprocessingDrawing" xmlns:wp="http://schemas.openxmlformats.org/drawingml/2006/wordprocessingDrawing" xmlns:w10="urn:schemas-microsoft-com:office:word" xmlns:w="http://schemas.openxmlformats.org/wordprocessingml/2006/main" xmlns:w14="http://schemas.microsoft.com/office/word/2010/wordml" xmlns:w15="http://schemas.microsoft.com/office/word/2012/wordml" xmlns:w16se="http://schemas.microsoft.com/office/word/2015/wordml/symex" xmlns:wpg="http://schemas.microsoft.com/office/word/2010/wordprocessingGroup" xmlns:wpi="http://schemas.microsoft.com/office/word/2010/wordprocessingInk" xmlns:wne="http://schemas.microsoft.com/office/word/2006/wordml" xmlns:wps="http://schemas.microsoft.com/office/word/2010/wordprocessingShape" mc:Ignorable="w14 w15 w16se wp14">
+<w:footnotes xmlns:wpc="http://schemas.microsoft.com/office/word/2010/wordprocessingCanvas" xmlns:cx="http://schemas.microsoft.com/office/drawing/2014/chartex" xmlns:cx1="http://schemas.microsoft.com/office/drawing/2015/9/8/chartex" xmlns:cx2="http://schemas.microsoft.com/office/drawing/2015/10/21/chartex" xmlns:cx3="http://schemas.microsoft.com/office/drawing/2016/5/9/chartex" xmlns:cx4="http://schemas.microsoft.com/office/drawing/2016/5/10/chartex" xmlns:cx5="http://schemas.microsoft.com/office/drawing/2016/5/11/chartex" xmlns:cx6="http://schemas.microsoft.com/office/drawing/2016/5/12/chartex" xmlns:cx7="http://schemas.microsoft.com/office/drawing/2016/5/13/chartex" xmlns:cx8="http://schemas.microsoft.com/office/drawing/2016/5/14/chartex" xmlns:mc="http://schemas.openxmlformats.org/markup-compatibility/2006" xmlns:aink="http://schemas.microsoft.com/office/drawing/2016/ink" xmlns:am3d="http://schemas.microsoft.com/office/drawing/2017/model3d" xmlns:o="urn:schemas-microsoft-com:office:office" xmlns:oel="http://schemas.microsoft.com/office/2019/extlst" xmlns:r="http://schemas.openxmlformats.org/officeDocument/2006/relationships" xmlns:m="http://schemas.openxmlformats.org/officeDocument/2006/math" xmlns:v="urn:schemas-microsoft-com:vml" xmlns:wp14="http://schemas.microsoft.com/office/word/2010/wordprocessingDrawing" xmlns:wp="http://schemas.openxmlformats.org/drawingml/2006/wordprocessingDrawing" xmlns:w10="urn:schemas-microsoft-com:office:word" xmlns:w="http://schemas.openxmlformats.org/wordprocessingml/2006/main" xmlns:w14="http://schemas.microsoft.com/office/word/2010/wordml" xmlns:w15="http://schemas.microsoft.com/office/word/2012/wordml" xmlns:w16cex="http://schemas.microsoft.com/office/word/2018/wordml/cex" xmlns:w16cid="http://schemas.microsoft.com/office/word/2016/wordml/cid" xmlns:w16="http://schemas.microsoft.com/office/word/2018/wordml" xmlns:w16du="http://schemas.microsoft.com/office/word/2023/wordml/word16du" xmlns:w16sdtdh="http://schemas.microsoft.com/office/word/2020/wordml/sdtdatahash" xmlns:w16sdtfl="http://schemas.microsoft.com/office/word/2024/wordml/sdtformatlock" xmlns:w16se="http://schemas.microsoft.com/office/word/2015/wordml/symex" xmlns:wpg="http://schemas.microsoft.com/office/word/2010/wordprocessingGroup" xmlns:wpi="http://schemas.microsoft.com/office/word/2010/wordprocessingInk" xmlns:wne="http://schemas.microsoft.com/office/word/2006/wordml" xmlns:wps="http://schemas.microsoft.com/office/word/2010/wordprocessingShape" mc:Ignorable="w14 w15 w16se w16cid w16 w16cex w16sdtdh w16sdtfl w16du wp14">
   <w:footnote w:type="separator" w:id="-1">
     <w:p>
       <w:pPr>
@@ -10267,7 +10745,7 @@
 </file>
 
 <file path=word/numbering.xml><?xml version="1.0" encoding="utf-8"?>
-<w:numbering xmlns:wpc="http://schemas.microsoft.com/office/word/2010/wordprocessingCanvas" xmlns:cx="http://schemas.microsoft.com/office/drawing/2014/chartex" xmlns:cx1="http://schemas.microsoft.com/office/drawing/2015/9/8/chartex" xmlns:mc="http://schemas.openxmlformats.org/markup-compatibility/2006" xmlns:o="urn:schemas-microsoft-com:office:office" xmlns:r="http://schemas.openxmlformats.org/officeDocument/2006/relationships" xmlns:m="http://schemas.openxmlformats.org/officeDocument/2006/math" xmlns:v="urn:schemas-microsoft-com:vml" xmlns:wp14="http://schemas.microsoft.com/office/word/2010/wordprocessingDrawing" xmlns:wp="http://schemas.openxmlformats.org/drawingml/2006/wordprocessingDrawing" xmlns:w10="urn:schemas-microsoft-com:office:word" xmlns:w="http://schemas.openxmlformats.org/wordprocessingml/2006/main" xmlns:w14="http://schemas.microsoft.com/office/word/2010/wordml" xmlns:w15="http://schemas.microsoft.com/office/word/2012/wordml" xmlns:w16se="http://schemas.microsoft.com/office/word/2015/wordml/symex" xmlns:wpg="http://schemas.microsoft.com/office/word/2010/wordprocessingGroup" xmlns:wpi="http://schemas.microsoft.com/office/word/2010/wordprocessingInk" xmlns:wne="http://schemas.microsoft.com/office/word/2006/wordml" xmlns:wps="http://schemas.microsoft.com/office/word/2010/wordprocessingShape" mc:Ignorable="w14 w15 w16se wp14">
+<w:numbering xmlns:wpc="http://schemas.microsoft.com/office/word/2010/wordprocessingCanvas" xmlns:cx="http://schemas.microsoft.com/office/drawing/2014/chartex" xmlns:cx1="http://schemas.microsoft.com/office/drawing/2015/9/8/chartex" xmlns:cx2="http://schemas.microsoft.com/office/drawing/2015/10/21/chartex" xmlns:cx3="http://schemas.microsoft.com/office/drawing/2016/5/9/chartex" xmlns:cx4="http://schemas.microsoft.com/office/drawing/2016/5/10/chartex" xmlns:cx5="http://schemas.microsoft.com/office/drawing/2016/5/11/chartex" xmlns:cx6="http://schemas.microsoft.com/office/drawing/2016/5/12/chartex" xmlns:cx7="http://schemas.microsoft.com/office/drawing/2016/5/13/chartex" xmlns:cx8="http://schemas.microsoft.com/office/drawing/2016/5/14/chartex" xmlns:mc="http://schemas.openxmlformats.org/markup-compatibility/2006" xmlns:aink="http://schemas.microsoft.com/office/drawing/2016/ink" xmlns:am3d="http://schemas.microsoft.com/office/drawing/2017/model3d" xmlns:o="urn:schemas-microsoft-com:office:office" xmlns:oel="http://schemas.microsoft.com/office/2019/extlst" xmlns:r="http://schemas.openxmlformats.org/officeDocument/2006/relationships" xmlns:m="http://schemas.openxmlformats.org/officeDocument/2006/math" xmlns:v="urn:schemas-microsoft-com:vml" xmlns:wp14="http://schemas.microsoft.com/office/word/2010/wordprocessingDrawing" xmlns:wp="http://schemas.openxmlformats.org/drawingml/2006/wordprocessingDrawing" xmlns:w10="urn:schemas-microsoft-com:office:word" xmlns:w="http://schemas.openxmlformats.org/wordprocessingml/2006/main" xmlns:w14="http://schemas.microsoft.com/office/word/2010/wordml" xmlns:w15="http://schemas.microsoft.com/office/word/2012/wordml" xmlns:w16cex="http://schemas.microsoft.com/office/word/2018/wordml/cex" xmlns:w16cid="http://schemas.microsoft.com/office/word/2016/wordml/cid" xmlns:w16="http://schemas.microsoft.com/office/word/2018/wordml" xmlns:w16du="http://schemas.microsoft.com/office/word/2023/wordml/word16du" xmlns:w16sdtdh="http://schemas.microsoft.com/office/word/2020/wordml/sdtdatahash" xmlns:w16sdtfl="http://schemas.microsoft.com/office/word/2024/wordml/sdtformatlock" xmlns:w16se="http://schemas.microsoft.com/office/word/2015/wordml/symex" xmlns:wpg="http://schemas.microsoft.com/office/word/2010/wordprocessingGroup" xmlns:wpi="http://schemas.microsoft.com/office/word/2010/wordprocessingInk" xmlns:wne="http://schemas.microsoft.com/office/word/2006/wordml" xmlns:wps="http://schemas.microsoft.com/office/word/2010/wordprocessingShape" mc:Ignorable="w14 w15 w16se w16cid w16 w16cex w16sdtdh w16sdtfl w16du wp14">
   <w:abstractNum w:abstractNumId="0" w15:restartNumberingAfterBreak="0">
     <w:nsid w:val="02826046"/>
     <w:multiLevelType w:val="multilevel"/>
@@ -11978,59 +12456,59 @@
       </w:rPr>
     </w:lvl>
   </w:abstractNum>
-  <w:num w:numId="1">
+  <w:num w:numId="1" w16cid:durableId="1110199671">
     <w:abstractNumId w:val="13"/>
   </w:num>
-  <w:num w:numId="2">
+  <w:num w:numId="2" w16cid:durableId="1379935666">
     <w:abstractNumId w:val="11"/>
   </w:num>
-  <w:num w:numId="3">
+  <w:num w:numId="3" w16cid:durableId="1867252823">
     <w:abstractNumId w:val="2"/>
   </w:num>
-  <w:num w:numId="4">
+  <w:num w:numId="4" w16cid:durableId="1710761454">
     <w:abstractNumId w:val="8"/>
   </w:num>
-  <w:num w:numId="5">
+  <w:num w:numId="5" w16cid:durableId="1963073442">
     <w:abstractNumId w:val="12"/>
   </w:num>
-  <w:num w:numId="6">
+  <w:num w:numId="6" w16cid:durableId="1183207749">
     <w:abstractNumId w:val="9"/>
   </w:num>
-  <w:num w:numId="7">
+  <w:num w:numId="7" w16cid:durableId="660351788">
     <w:abstractNumId w:val="0"/>
   </w:num>
-  <w:num w:numId="8">
+  <w:num w:numId="8" w16cid:durableId="1219174035">
     <w:abstractNumId w:val="10"/>
   </w:num>
-  <w:num w:numId="9">
+  <w:num w:numId="9" w16cid:durableId="1939488449">
     <w:abstractNumId w:val="7"/>
   </w:num>
-  <w:num w:numId="10">
+  <w:num w:numId="10" w16cid:durableId="1074401730">
     <w:abstractNumId w:val="1"/>
   </w:num>
-  <w:num w:numId="11">
+  <w:num w:numId="11" w16cid:durableId="233786767">
     <w:abstractNumId w:val="4"/>
   </w:num>
-  <w:num w:numId="12">
+  <w:num w:numId="12" w16cid:durableId="2044019019">
     <w:abstractNumId w:val="6"/>
   </w:num>
-  <w:num w:numId="13">
+  <w:num w:numId="13" w16cid:durableId="119617888">
     <w:abstractNumId w:val="14"/>
   </w:num>
-  <w:num w:numId="14">
+  <w:num w:numId="14" w16cid:durableId="133571577">
     <w:abstractNumId w:val="3"/>
   </w:num>
-  <w:num w:numId="15">
+  <w:num w:numId="15" w16cid:durableId="864052878">
     <w:abstractNumId w:val="5"/>
   </w:num>
-  <w:num w:numId="16">
+  <w:num w:numId="16" w16cid:durableId="1251503631">
     <w:abstractNumId w:val="15"/>
   </w:num>
 </w:numbering>
 </file>
 
 <file path=word/styles.xml><?xml version="1.0" encoding="utf-8"?>
-<w:styles xmlns:mc="http://schemas.openxmlformats.org/markup-compatibility/2006" xmlns:r="http://schemas.openxmlformats.org/officeDocument/2006/relationships" xmlns:w="http://schemas.openxmlformats.org/wordprocessingml/2006/main" xmlns:w14="http://schemas.microsoft.com/office/word/2010/wordml" xmlns:w15="http://schemas.microsoft.com/office/word/2012/wordml" xmlns:w16se="http://schemas.microsoft.com/office/word/2015/wordml/symex" mc:Ignorable="w14 w15 w16se">
+<w:styles xmlns:mc="http://schemas.openxmlformats.org/markup-compatibility/2006" xmlns:r="http://schemas.openxmlformats.org/officeDocument/2006/relationships" xmlns:w="http://schemas.openxmlformats.org/wordprocessingml/2006/main" xmlns:w14="http://schemas.microsoft.com/office/word/2010/wordml" xmlns:w15="http://schemas.microsoft.com/office/word/2012/wordml" xmlns:w16cex="http://schemas.microsoft.com/office/word/2018/wordml/cex" xmlns:w16cid="http://schemas.microsoft.com/office/word/2016/wordml/cid" xmlns:w16="http://schemas.microsoft.com/office/word/2018/wordml" xmlns:w16du="http://schemas.microsoft.com/office/word/2023/wordml/word16du" xmlns:w16sdtdh="http://schemas.microsoft.com/office/word/2020/wordml/sdtdatahash" xmlns:w16sdtfl="http://schemas.microsoft.com/office/word/2024/wordml/sdtformatlock" xmlns:w16se="http://schemas.microsoft.com/office/word/2015/wordml/symex" mc:Ignorable="w14 w15 w16se w16cid w16 w16cex w16sdtdh w16sdtfl w16du">
   <w:docDefaults>
     <w:rPrDefault>
       <w:rPr>
@@ -12046,7 +12524,7 @@
       </w:pPr>
     </w:pPrDefault>
   </w:docDefaults>
-  <w:latentStyles w:defLockedState="0" w:defUIPriority="99" w:defSemiHidden="0" w:defUnhideWhenUsed="0" w:defQFormat="0" w:count="371">
+  <w:latentStyles w:defLockedState="0" w:defUIPriority="99" w:defSemiHidden="0" w:defUnhideWhenUsed="0" w:defQFormat="0" w:count="376">
     <w:lsdException w:name="Normal" w:uiPriority="0" w:qFormat="1"/>
     <w:lsdException w:name="heading 1" w:uiPriority="9" w:qFormat="1"/>
     <w:lsdException w:name="heading 2" w:semiHidden="1" w:uiPriority="9" w:unhideWhenUsed="1" w:qFormat="1"/>
@@ -12418,6 +12896,11 @@
     <w:lsdException w:name="List Table 5 Dark Accent 6" w:uiPriority="50"/>
     <w:lsdException w:name="List Table 6 Colorful Accent 6" w:uiPriority="51"/>
     <w:lsdException w:name="List Table 7 Colorful Accent 6" w:uiPriority="52"/>
+    <w:lsdException w:name="Mention" w:semiHidden="1" w:unhideWhenUsed="1"/>
+    <w:lsdException w:name="Smart Hyperlink" w:semiHidden="1" w:unhideWhenUsed="1"/>
+    <w:lsdException w:name="Hashtag" w:semiHidden="1" w:unhideWhenUsed="1"/>
+    <w:lsdException w:name="Unresolved Mention" w:semiHidden="1" w:unhideWhenUsed="1"/>
+    <w:lsdException w:name="Smart Link" w:semiHidden="1" w:unhideWhenUsed="1"/>
   </w:latentStyles>
   <w:style w:type="paragraph" w:default="1" w:styleId="Norml">
     <w:name w:val="Normal"/>
@@ -12475,7 +12958,6 @@
   <w:style w:type="character" w:default="1" w:styleId="Bekezdsalapbettpusa">
     <w:name w:val="Default Paragraph Font"/>
     <w:uiPriority w:val="1"/>
-    <w:semiHidden/>
     <w:unhideWhenUsed/>
   </w:style>
   <w:style w:type="table" w:default="1" w:styleId="Normltblzat">
@@ -12580,8 +13062,8 @@
       <w:u w:val="single"/>
     </w:rPr>
   </w:style>
-  <w:style w:type="character" w:customStyle="1" w:styleId="UnresolvedMention">
-    <w:name w:val="Unresolved Mention"/>
+  <w:style w:type="character" w:customStyle="1" w:styleId="Feloldatlanmegemlts1">
+    <w:name w:val="Feloldatlan megemlítés1"/>
     <w:basedOn w:val="Bekezdsalapbettpusa"/>
     <w:uiPriority w:val="99"/>
     <w:semiHidden/>
@@ -12858,6 +13340,18 @@
       <w:spacing w:val="15"/>
       <w:sz w:val="40"/>
       <w:lang w:val="en-GB"/>
+    </w:rPr>
+  </w:style>
+  <w:style w:type="character" w:styleId="Feloldatlanmegemlts">
+    <w:name w:val="Unresolved Mention"/>
+    <w:basedOn w:val="Bekezdsalapbettpusa"/>
+    <w:uiPriority w:val="99"/>
+    <w:semiHidden/>
+    <w:unhideWhenUsed/>
+    <w:rsid w:val="001324CD"/>
+    <w:rPr>
+      <w:color w:val="605E5C"/>
+      <w:shd w:val="clear" w:color="auto" w:fill="E1DFDD"/>
     </w:rPr>
   </w:style>
 </w:styles>

</xml_diff>

<commit_message>
Véső módosítás a dokumentumon
</commit_message>
<xml_diff>
--- a/Borsod Coding - For the potato.docx
+++ b/Borsod Coding - For the potato.docx
@@ -1,6 +1,6 @@
 
 <file path=word/document.xml><?xml version="1.0" encoding="utf-8"?>
-<w:document xmlns:wpc="http://schemas.microsoft.com/office/word/2010/wordprocessingCanvas" xmlns:cx="http://schemas.microsoft.com/office/drawing/2014/chartex" xmlns:cx1="http://schemas.microsoft.com/office/drawing/2015/9/8/chartex" xmlns:mc="http://schemas.openxmlformats.org/markup-compatibility/2006" xmlns:o="urn:schemas-microsoft-com:office:office" xmlns:r="http://schemas.openxmlformats.org/officeDocument/2006/relationships" xmlns:m="http://schemas.openxmlformats.org/officeDocument/2006/math" xmlns:v="urn:schemas-microsoft-com:vml" xmlns:wp14="http://schemas.microsoft.com/office/word/2010/wordprocessingDrawing" xmlns:wp="http://schemas.openxmlformats.org/drawingml/2006/wordprocessingDrawing" xmlns:w10="urn:schemas-microsoft-com:office:word" xmlns:w="http://schemas.openxmlformats.org/wordprocessingml/2006/main" xmlns:w14="http://schemas.microsoft.com/office/word/2010/wordml" xmlns:w15="http://schemas.microsoft.com/office/word/2012/wordml" xmlns:w16se="http://schemas.microsoft.com/office/word/2015/wordml/symex" xmlns:wpg="http://schemas.microsoft.com/office/word/2010/wordprocessingGroup" xmlns:wpi="http://schemas.microsoft.com/office/word/2010/wordprocessingInk" xmlns:wne="http://schemas.microsoft.com/office/word/2006/wordml" xmlns:wps="http://schemas.microsoft.com/office/word/2010/wordprocessingShape" mc:Ignorable="w14 w15 w16se wp14">
+<w:document xmlns:wpc="http://schemas.microsoft.com/office/word/2010/wordprocessingCanvas" xmlns:cx="http://schemas.microsoft.com/office/drawing/2014/chartex" xmlns:cx1="http://schemas.microsoft.com/office/drawing/2015/9/8/chartex" xmlns:cx2="http://schemas.microsoft.com/office/drawing/2015/10/21/chartex" xmlns:cx3="http://schemas.microsoft.com/office/drawing/2016/5/9/chartex" xmlns:cx4="http://schemas.microsoft.com/office/drawing/2016/5/10/chartex" xmlns:cx5="http://schemas.microsoft.com/office/drawing/2016/5/11/chartex" xmlns:cx6="http://schemas.microsoft.com/office/drawing/2016/5/12/chartex" xmlns:cx7="http://schemas.microsoft.com/office/drawing/2016/5/13/chartex" xmlns:cx8="http://schemas.microsoft.com/office/drawing/2016/5/14/chartex" xmlns:mc="http://schemas.openxmlformats.org/markup-compatibility/2006" xmlns:aink="http://schemas.microsoft.com/office/drawing/2016/ink" xmlns:am3d="http://schemas.microsoft.com/office/drawing/2017/model3d" xmlns:o="urn:schemas-microsoft-com:office:office" xmlns:oel="http://schemas.microsoft.com/office/2019/extlst" xmlns:r="http://schemas.openxmlformats.org/officeDocument/2006/relationships" xmlns:m="http://schemas.openxmlformats.org/officeDocument/2006/math" xmlns:v="urn:schemas-microsoft-com:vml" xmlns:wp14="http://schemas.microsoft.com/office/word/2010/wordprocessingDrawing" xmlns:wp="http://schemas.openxmlformats.org/drawingml/2006/wordprocessingDrawing" xmlns:w10="urn:schemas-microsoft-com:office:word" xmlns:w="http://schemas.openxmlformats.org/wordprocessingml/2006/main" xmlns:w14="http://schemas.microsoft.com/office/word/2010/wordml" xmlns:w15="http://schemas.microsoft.com/office/word/2012/wordml" xmlns:w16cex="http://schemas.microsoft.com/office/word/2018/wordml/cex" xmlns:w16cid="http://schemas.microsoft.com/office/word/2016/wordml/cid" xmlns:w16="http://schemas.microsoft.com/office/word/2018/wordml" xmlns:w16du="http://schemas.microsoft.com/office/word/2023/wordml/word16du" xmlns:w16sdtdh="http://schemas.microsoft.com/office/word/2020/wordml/sdtdatahash" xmlns:w16sdtfl="http://schemas.microsoft.com/office/word/2024/wordml/sdtformatlock" xmlns:w16se="http://schemas.microsoft.com/office/word/2015/wordml/symex" xmlns:wpg="http://schemas.microsoft.com/office/word/2010/wordprocessingGroup" xmlns:wpi="http://schemas.microsoft.com/office/word/2010/wordprocessingInk" xmlns:wne="http://schemas.microsoft.com/office/word/2006/wordml" xmlns:wps="http://schemas.microsoft.com/office/word/2010/wordprocessingShape" mc:Ignorable="w14 w15 w16se w16cid w16 w16cex w16sdtdh w16sdtfl w16du wp14">
   <w:body>
     <w:p>
       <w:pPr>
@@ -4285,6 +4285,7 @@
         <w:spacing w:before="120" w:after="0" w:line="360" w:lineRule="auto"/>
         <w:rPr>
           <w:rFonts w:ascii="Times New Roman" w:eastAsia="Calibri" w:hAnsi="Times New Roman" w:cs="Times New Roman"/>
+          <w:color w:val="000000"/>
           <w:szCs w:val="24"/>
           <w:lang w:val="hu" w:eastAsia="hu-HU"/>
         </w:rPr>
@@ -4298,15 +4299,593 @@
         </w:rPr>
         <w:t>Szerettünk volna valami komolytalan, vicces történetet, ezt szeretnénk majd a védjegyünkké tenni.</w:t>
       </w:r>
-      <w:bookmarkStart w:id="1" w:name="_GoBack"/>
-      <w:bookmarkEnd w:id="1"/>
-      <w:r>
+    </w:p>
+    <w:p>
+      <w:pPr>
+        <w:pBdr>
+          <w:top w:val="nil"/>
+          <w:left w:val="nil"/>
+          <w:bottom w:val="nil"/>
+          <w:right w:val="nil"/>
+          <w:between w:val="nil"/>
+        </w:pBdr>
+        <w:spacing w:before="120" w:after="0" w:line="360" w:lineRule="auto"/>
+        <w:rPr>
+          <w:rFonts w:ascii="Times New Roman" w:eastAsia="Calibri" w:hAnsi="Times New Roman" w:cs="Times New Roman"/>
+          <w:color w:val="000000"/>
+          <w:szCs w:val="24"/>
+          <w:lang w:val="hu" w:eastAsia="hu-HU"/>
+        </w:rPr>
+      </w:pPr>
+      <w:r>
+        <w:rPr>
+          <w:rFonts w:ascii="Times New Roman" w:eastAsia="Calibri" w:hAnsi="Times New Roman" w:cs="Times New Roman"/>
+          <w:color w:val="000000"/>
+          <w:szCs w:val="24"/>
+          <w:lang w:val="hu" w:eastAsia="hu-HU"/>
+        </w:rPr>
+        <w:t>Egy</w:t>
+      </w:r>
+      <w:r>
+        <w:rPr>
+          <w:rFonts w:ascii="Times New Roman" w:eastAsia="Calibri" w:hAnsi="Times New Roman" w:cs="Times New Roman"/>
+          <w:color w:val="000000"/>
+          <w:szCs w:val="24"/>
+          <w:lang w:val="hu" w:eastAsia="hu-HU"/>
+        </w:rPr>
+        <w:t xml:space="preserve"> n</w:t>
+      </w:r>
+      <w:r>
+        <w:rPr>
+          <w:rFonts w:ascii="Times New Roman" w:eastAsia="Calibri" w:hAnsi="Times New Roman" w:cs="Times New Roman"/>
+          <w:color w:val="000000"/>
+          <w:szCs w:val="24"/>
+          <w:lang w:val="hu" w:eastAsia="hu-HU"/>
+        </w:rPr>
+        <w:t>yári mező nappal, napos idővel</w:t>
+      </w:r>
+      <w:r>
+        <w:rPr>
+          <w:rFonts w:ascii="Times New Roman" w:eastAsia="Calibri" w:hAnsi="Times New Roman" w:cs="Times New Roman"/>
+          <w:color w:val="000000"/>
+          <w:szCs w:val="24"/>
+          <w:lang w:val="hu" w:eastAsia="hu-HU"/>
+        </w:rPr>
+        <w:t xml:space="preserve"> pály</w:t>
+      </w:r>
+      <w:r>
+        <w:rPr>
+          <w:rFonts w:ascii="Times New Roman" w:eastAsia="Calibri" w:hAnsi="Times New Roman" w:cs="Times New Roman"/>
+          <w:color w:val="000000"/>
+          <w:szCs w:val="24"/>
+          <w:lang w:val="hu" w:eastAsia="hu-HU"/>
+        </w:rPr>
+        <w:t>a</w:t>
+      </w:r>
+      <w:r>
+        <w:rPr>
+          <w:rFonts w:ascii="Times New Roman" w:eastAsia="Calibri" w:hAnsi="Times New Roman" w:cs="Times New Roman"/>
+          <w:color w:val="000000"/>
+          <w:szCs w:val="24"/>
+          <w:lang w:val="hu" w:eastAsia="hu-HU"/>
+        </w:rPr>
+        <w:t>:</w:t>
+      </w:r>
+    </w:p>
+    <w:p>
+      <w:pPr>
+        <w:pBdr>
+          <w:top w:val="nil"/>
+          <w:left w:val="nil"/>
+          <w:bottom w:val="nil"/>
+          <w:right w:val="nil"/>
+          <w:between w:val="nil"/>
+        </w:pBdr>
+        <w:spacing w:before="120" w:after="0" w:line="360" w:lineRule="auto"/>
+        <w:rPr>
+          <w:rFonts w:ascii="Times New Roman" w:eastAsia="Calibri" w:hAnsi="Times New Roman" w:cs="Times New Roman"/>
+          <w:color w:val="000000"/>
+          <w:szCs w:val="24"/>
+          <w:lang w:val="hu" w:eastAsia="hu-HU"/>
+        </w:rPr>
+      </w:pPr>
+      <w:r>
+        <w:rPr>
+          <w:rFonts w:ascii="Times New Roman" w:eastAsia="Calibri" w:hAnsi="Times New Roman" w:cs="Times New Roman"/>
+          <w:noProof/>
+          <w:color w:val="000000"/>
+          <w:szCs w:val="24"/>
+          <w:lang w:val="hu" w:eastAsia="hu-HU"/>
+        </w:rPr>
+        <w:drawing>
+          <wp:inline distT="0" distB="0" distL="0" distR="0" wp14:anchorId="76AC568F" wp14:editId="35E2D352">
+            <wp:extent cx="2854519" cy="2970851"/>
+            <wp:effectExtent l="0" t="0" r="3175" b="1270"/>
+            <wp:docPr id="1247725776" name="Kép 1"/>
+            <wp:cNvGraphicFramePr>
+              <a:graphicFrameLocks xmlns:a="http://schemas.openxmlformats.org/drawingml/2006/main" noChangeAspect="1"/>
+            </wp:cNvGraphicFramePr>
+            <a:graphic xmlns:a="http://schemas.openxmlformats.org/drawingml/2006/main">
+              <a:graphicData uri="http://schemas.openxmlformats.org/drawingml/2006/picture">
+                <pic:pic xmlns:pic="http://schemas.openxmlformats.org/drawingml/2006/picture">
+                  <pic:nvPicPr>
+                    <pic:cNvPr id="1247725776" name="Kép 1247725776"/>
+                    <pic:cNvPicPr/>
+                  </pic:nvPicPr>
+                  <pic:blipFill>
+                    <a:blip r:embed="rId12" cstate="print">
+                      <a:extLst>
+                        <a:ext uri="{28A0092B-C50C-407E-A947-70E740481C1C}">
+                          <a14:useLocalDpi xmlns:a14="http://schemas.microsoft.com/office/drawing/2010/main" val="0"/>
+                        </a:ext>
+                      </a:extLst>
+                    </a:blip>
+                    <a:stretch>
+                      <a:fillRect/>
+                    </a:stretch>
+                  </pic:blipFill>
+                  <pic:spPr>
+                    <a:xfrm>
+                      <a:off x="0" y="0"/>
+                      <a:ext cx="2854519" cy="2970851"/>
+                    </a:xfrm>
+                    <a:prstGeom prst="rect">
+                      <a:avLst/>
+                    </a:prstGeom>
+                  </pic:spPr>
+                </pic:pic>
+              </a:graphicData>
+            </a:graphic>
+          </wp:inline>
+        </w:drawing>
+      </w:r>
+    </w:p>
+    <w:p>
+      <w:pPr>
+        <w:pBdr>
+          <w:top w:val="nil"/>
+          <w:left w:val="nil"/>
+          <w:bottom w:val="nil"/>
+          <w:right w:val="nil"/>
+          <w:between w:val="nil"/>
+        </w:pBdr>
+        <w:spacing w:before="120" w:after="0" w:line="360" w:lineRule="auto"/>
+        <w:rPr>
+          <w:rFonts w:ascii="Times New Roman" w:eastAsia="Calibri" w:hAnsi="Times New Roman" w:cs="Times New Roman"/>
+          <w:color w:val="000000"/>
+          <w:szCs w:val="24"/>
+          <w:lang w:val="hu" w:eastAsia="hu-HU"/>
+        </w:rPr>
+      </w:pPr>
+      <w:r>
+        <w:rPr>
+          <w:rFonts w:ascii="Times New Roman" w:eastAsia="Calibri" w:hAnsi="Times New Roman" w:cs="Times New Roman"/>
+          <w:color w:val="000000"/>
+          <w:szCs w:val="24"/>
+          <w:lang w:val="hu" w:eastAsia="hu-HU"/>
+        </w:rPr>
+        <w:br w:type="page"/>
+      </w:r>
+    </w:p>
+    <w:p>
+      <w:pPr>
+        <w:pBdr>
+          <w:top w:val="nil"/>
+          <w:left w:val="nil"/>
+          <w:bottom w:val="nil"/>
+          <w:right w:val="nil"/>
+          <w:between w:val="nil"/>
+        </w:pBdr>
+        <w:spacing w:before="120" w:after="0" w:line="360" w:lineRule="auto"/>
+        <w:rPr>
+          <w:rFonts w:ascii="Times New Roman" w:eastAsia="Calibri" w:hAnsi="Times New Roman" w:cs="Times New Roman"/>
+          <w:color w:val="000000"/>
+          <w:szCs w:val="24"/>
+          <w:lang w:val="hu" w:eastAsia="hu-HU"/>
+        </w:rPr>
+      </w:pPr>
+      <w:r>
+        <w:rPr>
+          <w:rFonts w:ascii="Times New Roman" w:eastAsia="Calibri" w:hAnsi="Times New Roman" w:cs="Times New Roman"/>
+          <w:color w:val="000000"/>
+          <w:szCs w:val="24"/>
+          <w:lang w:val="hu" w:eastAsia="hu-HU"/>
+        </w:rPr>
+        <w:lastRenderedPageBreak/>
+        <w:t>Egy</w:t>
+      </w:r>
+      <w:r>
+        <w:rPr>
+          <w:rFonts w:ascii="Times New Roman" w:eastAsia="Calibri" w:hAnsi="Times New Roman" w:cs="Times New Roman"/>
+          <w:color w:val="000000"/>
+          <w:szCs w:val="24"/>
+          <w:lang w:val="hu" w:eastAsia="hu-HU"/>
+        </w:rPr>
+        <w:t xml:space="preserve"> n</w:t>
+      </w:r>
+      <w:r>
+        <w:rPr>
+          <w:rFonts w:ascii="Times New Roman" w:eastAsia="Calibri" w:hAnsi="Times New Roman" w:cs="Times New Roman"/>
+          <w:color w:val="000000"/>
+          <w:szCs w:val="24"/>
+          <w:lang w:val="hu" w:eastAsia="hu-HU"/>
+        </w:rPr>
+        <w:t>yári mező nappal, esős idővel</w:t>
+      </w:r>
+      <w:r>
+        <w:rPr>
+          <w:rFonts w:ascii="Times New Roman" w:eastAsia="Calibri" w:hAnsi="Times New Roman" w:cs="Times New Roman"/>
+          <w:color w:val="000000"/>
+          <w:szCs w:val="24"/>
+          <w:lang w:val="hu" w:eastAsia="hu-HU"/>
+        </w:rPr>
+        <w:t xml:space="preserve"> pály</w:t>
+      </w:r>
+      <w:r>
+        <w:rPr>
+          <w:rFonts w:ascii="Times New Roman" w:eastAsia="Calibri" w:hAnsi="Times New Roman" w:cs="Times New Roman"/>
+          <w:color w:val="000000"/>
+          <w:szCs w:val="24"/>
+          <w:lang w:val="hu" w:eastAsia="hu-HU"/>
+        </w:rPr>
+        <w:t>a</w:t>
+      </w:r>
+      <w:r>
+        <w:rPr>
+          <w:rFonts w:ascii="Times New Roman" w:eastAsia="Calibri" w:hAnsi="Times New Roman" w:cs="Times New Roman"/>
+          <w:color w:val="000000"/>
+          <w:szCs w:val="24"/>
+          <w:lang w:val="hu" w:eastAsia="hu-HU"/>
+        </w:rPr>
+        <w:t>:</w:t>
+      </w:r>
+    </w:p>
+    <w:p>
+      <w:pPr>
+        <w:pBdr>
+          <w:top w:val="nil"/>
+          <w:left w:val="nil"/>
+          <w:bottom w:val="nil"/>
+          <w:right w:val="nil"/>
+          <w:between w:val="nil"/>
+        </w:pBdr>
+        <w:spacing w:before="120" w:after="0" w:line="360" w:lineRule="auto"/>
+        <w:rPr>
+          <w:rFonts w:ascii="Times New Roman" w:eastAsia="Calibri" w:hAnsi="Times New Roman" w:cs="Times New Roman"/>
+          <w:color w:val="000000"/>
+          <w:szCs w:val="24"/>
+          <w:lang w:val="hu" w:eastAsia="hu-HU"/>
+        </w:rPr>
+      </w:pPr>
+      <w:r>
+        <w:rPr>
+          <w:rFonts w:ascii="Times New Roman" w:eastAsia="Calibri" w:hAnsi="Times New Roman" w:cs="Times New Roman"/>
+          <w:noProof/>
+          <w:color w:val="000000"/>
+          <w:szCs w:val="24"/>
+          <w:lang w:val="hu" w:eastAsia="hu-HU"/>
+        </w:rPr>
+        <w:drawing>
+          <wp:inline distT="0" distB="0" distL="0" distR="0" wp14:anchorId="7167790D" wp14:editId="20563041">
+            <wp:extent cx="2997642" cy="3132313"/>
+            <wp:effectExtent l="0" t="0" r="0" b="0"/>
+            <wp:docPr id="78317842" name="Kép 2"/>
+            <wp:cNvGraphicFramePr>
+              <a:graphicFrameLocks xmlns:a="http://schemas.openxmlformats.org/drawingml/2006/main" noChangeAspect="1"/>
+            </wp:cNvGraphicFramePr>
+            <a:graphic xmlns:a="http://schemas.openxmlformats.org/drawingml/2006/main">
+              <a:graphicData uri="http://schemas.openxmlformats.org/drawingml/2006/picture">
+                <pic:pic xmlns:pic="http://schemas.openxmlformats.org/drawingml/2006/picture">
+                  <pic:nvPicPr>
+                    <pic:cNvPr id="78317842" name="Kép 78317842"/>
+                    <pic:cNvPicPr/>
+                  </pic:nvPicPr>
+                  <pic:blipFill>
+                    <a:blip r:embed="rId13" cstate="print">
+                      <a:extLst>
+                        <a:ext uri="{28A0092B-C50C-407E-A947-70E740481C1C}">
+                          <a14:useLocalDpi xmlns:a14="http://schemas.microsoft.com/office/drawing/2010/main" val="0"/>
+                        </a:ext>
+                      </a:extLst>
+                    </a:blip>
+                    <a:stretch>
+                      <a:fillRect/>
+                    </a:stretch>
+                  </pic:blipFill>
+                  <pic:spPr>
+                    <a:xfrm>
+                      <a:off x="0" y="0"/>
+                      <a:ext cx="3034623" cy="3170955"/>
+                    </a:xfrm>
+                    <a:prstGeom prst="rect">
+                      <a:avLst/>
+                    </a:prstGeom>
+                  </pic:spPr>
+                </pic:pic>
+              </a:graphicData>
+            </a:graphic>
+          </wp:inline>
+        </w:drawing>
+      </w:r>
+    </w:p>
+    <w:p>
+      <w:pPr>
+        <w:pBdr>
+          <w:top w:val="nil"/>
+          <w:left w:val="nil"/>
+          <w:bottom w:val="nil"/>
+          <w:right w:val="nil"/>
+          <w:between w:val="nil"/>
+        </w:pBdr>
+        <w:spacing w:before="120" w:after="0" w:line="360" w:lineRule="auto"/>
+        <w:rPr>
+          <w:rFonts w:ascii="Times New Roman" w:eastAsia="Calibri" w:hAnsi="Times New Roman" w:cs="Times New Roman"/>
+          <w:color w:val="000000"/>
+          <w:szCs w:val="24"/>
+          <w:lang w:val="hu" w:eastAsia="hu-HU"/>
+        </w:rPr>
+      </w:pPr>
+      <w:r>
+        <w:rPr>
+          <w:rFonts w:ascii="Times New Roman" w:eastAsia="Calibri" w:hAnsi="Times New Roman" w:cs="Times New Roman"/>
+          <w:color w:val="000000"/>
+          <w:szCs w:val="24"/>
+          <w:lang w:val="hu" w:eastAsia="hu-HU"/>
+        </w:rPr>
+        <w:t>Egy</w:t>
+      </w:r>
+      <w:r>
+        <w:rPr>
+          <w:rFonts w:ascii="Times New Roman" w:eastAsia="Calibri" w:hAnsi="Times New Roman" w:cs="Times New Roman"/>
+          <w:color w:val="000000"/>
+          <w:szCs w:val="24"/>
+          <w:lang w:val="hu" w:eastAsia="hu-HU"/>
+        </w:rPr>
+        <w:t xml:space="preserve"> barlangos pály</w:t>
+      </w:r>
+      <w:r>
+        <w:rPr>
+          <w:rFonts w:ascii="Times New Roman" w:eastAsia="Calibri" w:hAnsi="Times New Roman" w:cs="Times New Roman"/>
+          <w:color w:val="000000"/>
+          <w:szCs w:val="24"/>
+          <w:lang w:val="hu" w:eastAsia="hu-HU"/>
+        </w:rPr>
+        <w:t>a</w:t>
+      </w:r>
+      <w:r>
+        <w:rPr>
+          <w:rFonts w:ascii="Times New Roman" w:eastAsia="Calibri" w:hAnsi="Times New Roman" w:cs="Times New Roman"/>
+          <w:color w:val="000000"/>
+          <w:szCs w:val="24"/>
+          <w:lang w:val="hu" w:eastAsia="hu-HU"/>
+        </w:rPr>
+        <w:t>:</w:t>
+      </w:r>
+    </w:p>
+    <w:p>
+      <w:pPr>
+        <w:pBdr>
+          <w:top w:val="nil"/>
+          <w:left w:val="nil"/>
+          <w:bottom w:val="nil"/>
+          <w:right w:val="nil"/>
+          <w:between w:val="nil"/>
+        </w:pBdr>
+        <w:spacing w:before="120" w:after="0" w:line="360" w:lineRule="auto"/>
+        <w:rPr>
+          <w:rFonts w:ascii="Times New Roman" w:eastAsia="Calibri" w:hAnsi="Times New Roman" w:cs="Times New Roman"/>
+          <w:color w:val="000000"/>
+          <w:szCs w:val="24"/>
+          <w:lang w:val="hu" w:eastAsia="hu-HU"/>
+        </w:rPr>
+      </w:pPr>
+      <w:r>
+        <w:rPr>
+          <w:rFonts w:ascii="Times New Roman" w:eastAsia="Calibri" w:hAnsi="Times New Roman" w:cs="Times New Roman"/>
+          <w:noProof/>
+          <w:color w:val="000000"/>
+          <w:szCs w:val="24"/>
+          <w:lang w:val="hu" w:eastAsia="hu-HU"/>
+        </w:rPr>
+        <w:drawing>
+          <wp:inline distT="0" distB="0" distL="0" distR="0" wp14:anchorId="7F06CF52" wp14:editId="35A840EB">
+            <wp:extent cx="3037399" cy="3460091"/>
+            <wp:effectExtent l="0" t="0" r="0" b="7620"/>
+            <wp:docPr id="1075194851" name="Kép 3"/>
+            <wp:cNvGraphicFramePr>
+              <a:graphicFrameLocks xmlns:a="http://schemas.openxmlformats.org/drawingml/2006/main" noChangeAspect="1"/>
+            </wp:cNvGraphicFramePr>
+            <a:graphic xmlns:a="http://schemas.openxmlformats.org/drawingml/2006/main">
+              <a:graphicData uri="http://schemas.openxmlformats.org/drawingml/2006/picture">
+                <pic:pic xmlns:pic="http://schemas.openxmlformats.org/drawingml/2006/picture">
+                  <pic:nvPicPr>
+                    <pic:cNvPr id="1075194851" name="Kép 1075194851"/>
+                    <pic:cNvPicPr/>
+                  </pic:nvPicPr>
+                  <pic:blipFill>
+                    <a:blip r:embed="rId14">
+                      <a:extLst>
+                        <a:ext uri="{28A0092B-C50C-407E-A947-70E740481C1C}">
+                          <a14:useLocalDpi xmlns:a14="http://schemas.microsoft.com/office/drawing/2010/main" val="0"/>
+                        </a:ext>
+                      </a:extLst>
+                    </a:blip>
+                    <a:stretch>
+                      <a:fillRect/>
+                    </a:stretch>
+                  </pic:blipFill>
+                  <pic:spPr>
+                    <a:xfrm>
+                      <a:off x="0" y="0"/>
+                      <a:ext cx="3062541" cy="3488732"/>
+                    </a:xfrm>
+                    <a:prstGeom prst="rect">
+                      <a:avLst/>
+                    </a:prstGeom>
+                  </pic:spPr>
+                </pic:pic>
+              </a:graphicData>
+            </a:graphic>
+          </wp:inline>
+        </w:drawing>
+      </w:r>
+    </w:p>
+    <w:p>
+      <w:pPr>
+        <w:pBdr>
+          <w:top w:val="nil"/>
+          <w:left w:val="nil"/>
+          <w:bottom w:val="nil"/>
+          <w:right w:val="nil"/>
+          <w:between w:val="nil"/>
+        </w:pBdr>
+        <w:spacing w:before="120" w:after="0" w:line="360" w:lineRule="auto"/>
+        <w:rPr>
+          <w:rFonts w:ascii="Times New Roman" w:eastAsia="Calibri" w:hAnsi="Times New Roman" w:cs="Times New Roman"/>
+          <w:color w:val="000000"/>
+          <w:szCs w:val="24"/>
+          <w:lang w:val="hu" w:eastAsia="hu-HU"/>
+        </w:rPr>
+      </w:pPr>
+      <w:r>
+        <w:rPr>
+          <w:rFonts w:ascii="Times New Roman" w:eastAsia="Calibri" w:hAnsi="Times New Roman" w:cs="Times New Roman"/>
+          <w:color w:val="000000"/>
+          <w:szCs w:val="24"/>
+          <w:lang w:val="hu" w:eastAsia="hu-HU"/>
+        </w:rPr>
+        <w:br w:type="page"/>
+      </w:r>
+    </w:p>
+    <w:p>
+      <w:pPr>
+        <w:pBdr>
+          <w:top w:val="nil"/>
+          <w:left w:val="nil"/>
+          <w:bottom w:val="nil"/>
+          <w:right w:val="nil"/>
+          <w:between w:val="nil"/>
+        </w:pBdr>
+        <w:spacing w:before="120" w:after="0" w:line="360" w:lineRule="auto"/>
+        <w:rPr>
+          <w:rFonts w:ascii="Times New Roman" w:eastAsia="Calibri" w:hAnsi="Times New Roman" w:cs="Times New Roman"/>
+          <w:color w:val="000000"/>
+          <w:szCs w:val="24"/>
+          <w:lang w:val="hu" w:eastAsia="hu-HU"/>
+        </w:rPr>
+      </w:pPr>
+      <w:r>
+        <w:rPr>
+          <w:rFonts w:ascii="Times New Roman" w:eastAsia="Calibri" w:hAnsi="Times New Roman" w:cs="Times New Roman"/>
+          <w:color w:val="000000"/>
+          <w:szCs w:val="24"/>
+          <w:lang w:val="hu" w:eastAsia="hu-HU"/>
+        </w:rPr>
+        <w:lastRenderedPageBreak/>
+        <w:t>Egy havas pály</w:t>
+      </w:r>
+      <w:r>
+        <w:rPr>
+          <w:rFonts w:ascii="Times New Roman" w:eastAsia="Calibri" w:hAnsi="Times New Roman" w:cs="Times New Roman"/>
+          <w:color w:val="000000"/>
+          <w:szCs w:val="24"/>
+          <w:lang w:val="hu" w:eastAsia="hu-HU"/>
+        </w:rPr>
+        <w:t>a</w:t>
+      </w:r>
+      <w:r>
+        <w:rPr>
+          <w:rFonts w:ascii="Times New Roman" w:eastAsia="Calibri" w:hAnsi="Times New Roman" w:cs="Times New Roman"/>
+          <w:color w:val="000000"/>
+          <w:szCs w:val="24"/>
+          <w:lang w:val="hu" w:eastAsia="hu-HU"/>
+        </w:rPr>
+        <w:t>:</w:t>
+      </w:r>
+    </w:p>
+    <w:p>
+      <w:pPr>
+        <w:pBdr>
+          <w:top w:val="nil"/>
+          <w:left w:val="nil"/>
+          <w:bottom w:val="nil"/>
+          <w:right w:val="nil"/>
+          <w:between w:val="nil"/>
+        </w:pBdr>
+        <w:spacing w:before="120" w:after="0" w:line="360" w:lineRule="auto"/>
+        <w:rPr>
+          <w:rFonts w:ascii="Times New Roman" w:eastAsia="Calibri" w:hAnsi="Times New Roman" w:cs="Times New Roman"/>
+          <w:color w:val="000000"/>
+          <w:szCs w:val="24"/>
+          <w:lang w:val="hu" w:eastAsia="hu-HU"/>
+        </w:rPr>
+      </w:pPr>
+      <w:r>
+        <w:rPr>
+          <w:rFonts w:ascii="Times New Roman" w:eastAsia="Calibri" w:hAnsi="Times New Roman" w:cs="Times New Roman"/>
+          <w:noProof/>
+          <w:color w:val="000000"/>
+          <w:szCs w:val="24"/>
+          <w:lang w:val="hu" w:eastAsia="hu-HU"/>
+        </w:rPr>
+        <w:drawing>
+          <wp:inline distT="0" distB="0" distL="0" distR="0" wp14:anchorId="473A714C" wp14:editId="4F5CFA60">
+            <wp:extent cx="3260035" cy="3463290"/>
+            <wp:effectExtent l="0" t="0" r="0" b="3810"/>
+            <wp:docPr id="885464015" name="Kép 4"/>
+            <wp:cNvGraphicFramePr>
+              <a:graphicFrameLocks xmlns:a="http://schemas.openxmlformats.org/drawingml/2006/main" noChangeAspect="1"/>
+            </wp:cNvGraphicFramePr>
+            <a:graphic xmlns:a="http://schemas.openxmlformats.org/drawingml/2006/main">
+              <a:graphicData uri="http://schemas.openxmlformats.org/drawingml/2006/picture">
+                <pic:pic xmlns:pic="http://schemas.openxmlformats.org/drawingml/2006/picture">
+                  <pic:nvPicPr>
+                    <pic:cNvPr id="885464015" name="Kép 885464015"/>
+                    <pic:cNvPicPr/>
+                  </pic:nvPicPr>
+                  <pic:blipFill>
+                    <a:blip r:embed="rId15">
+                      <a:extLst>
+                        <a:ext uri="{28A0092B-C50C-407E-A947-70E740481C1C}">
+                          <a14:useLocalDpi xmlns:a14="http://schemas.microsoft.com/office/drawing/2010/main" val="0"/>
+                        </a:ext>
+                      </a:extLst>
+                    </a:blip>
+                    <a:stretch>
+                      <a:fillRect/>
+                    </a:stretch>
+                  </pic:blipFill>
+                  <pic:spPr>
+                    <a:xfrm>
+                      <a:off x="0" y="0"/>
+                      <a:ext cx="3276798" cy="3481098"/>
+                    </a:xfrm>
+                    <a:prstGeom prst="rect">
+                      <a:avLst/>
+                    </a:prstGeom>
+                  </pic:spPr>
+                </pic:pic>
+              </a:graphicData>
+            </a:graphic>
+          </wp:inline>
+        </w:drawing>
+      </w:r>
+    </w:p>
+    <w:p>
+      <w:pPr>
+        <w:pBdr>
+          <w:top w:val="nil"/>
+          <w:left w:val="nil"/>
+          <w:bottom w:val="nil"/>
+          <w:right w:val="nil"/>
+          <w:between w:val="nil"/>
+        </w:pBdr>
+        <w:spacing w:before="120" w:after="0" w:line="360" w:lineRule="auto"/>
         <w:rPr>
           <w:rFonts w:ascii="Times New Roman" w:hAnsi="Times New Roman" w:cs="Times New Roman"/>
           <w:lang w:val="hu-HU"/>
         </w:rPr>
-        <w:br/>
-      </w:r>
+      </w:pPr>
       <w:r>
         <w:rPr>
           <w:rFonts w:ascii="Times New Roman" w:hAnsi="Times New Roman" w:cs="Times New Roman"/>
@@ -4325,7 +4904,7 @@
           <w:lang w:val="hu-HU"/>
         </w:rPr>
       </w:pPr>
-      <w:bookmarkStart w:id="2" w:name="_Toc227104185"/>
+      <w:bookmarkStart w:id="1" w:name="_Toc227104185"/>
       <w:r>
         <w:rPr>
           <w:rFonts w:ascii="Times New Roman" w:hAnsi="Times New Roman" w:cs="Times New Roman"/>
@@ -4335,7 +4914,7 @@
         <w:lastRenderedPageBreak/>
         <w:t>Backend</w:t>
       </w:r>
-      <w:bookmarkEnd w:id="2"/>
+      <w:bookmarkEnd w:id="1"/>
     </w:p>
     <w:p>
       <w:pPr>
@@ -4874,14 +5453,6 @@
         </w:rPr>
       </w:pPr>
       <w:proofErr w:type="spellStart"/>
-      <w:r>
-        <w:rPr>
-          <w:rFonts w:ascii="Times New Roman" w:eastAsia="Calibri" w:hAnsi="Times New Roman" w:cs="Times New Roman"/>
-          <w:szCs w:val="24"/>
-          <w:lang w:val="hu" w:eastAsia="hu-HU"/>
-        </w:rPr>
-        <w:t>Microsoft</w:t>
-      </w:r>
       <w:proofErr w:type="gramStart"/>
       <w:r>
         <w:rPr>
@@ -4889,18 +5460,10 @@
           <w:szCs w:val="24"/>
           <w:lang w:val="hu" w:eastAsia="hu-HU"/>
         </w:rPr>
-        <w:t>.AspNetCore</w:t>
-      </w:r>
+        <w:t>Microsoft.AspNetCore.Authentication.JwtBearer</w:t>
+      </w:r>
+      <w:proofErr w:type="spellEnd"/>
       <w:proofErr w:type="gramEnd"/>
-      <w:r>
-        <w:rPr>
-          <w:rFonts w:ascii="Times New Roman" w:eastAsia="Calibri" w:hAnsi="Times New Roman" w:cs="Times New Roman"/>
-          <w:szCs w:val="24"/>
-          <w:lang w:val="hu" w:eastAsia="hu-HU"/>
-        </w:rPr>
-        <w:t>.Authentication.JwtBearer</w:t>
-      </w:r>
-      <w:proofErr w:type="spellEnd"/>
       <w:r>
         <w:rPr>
           <w:rFonts w:ascii="Times New Roman" w:eastAsia="Calibri" w:hAnsi="Times New Roman" w:cs="Times New Roman"/>
@@ -4932,14 +5495,6 @@
         </w:rPr>
       </w:pPr>
       <w:proofErr w:type="spellStart"/>
-      <w:r>
-        <w:rPr>
-          <w:rFonts w:ascii="Times New Roman" w:eastAsia="Calibri" w:hAnsi="Times New Roman" w:cs="Times New Roman"/>
-          <w:szCs w:val="24"/>
-          <w:lang w:val="hu" w:eastAsia="hu-HU"/>
-        </w:rPr>
-        <w:t>Microsoft</w:t>
-      </w:r>
       <w:proofErr w:type="gramStart"/>
       <w:r>
         <w:rPr>
@@ -4947,18 +5502,10 @@
           <w:szCs w:val="24"/>
           <w:lang w:val="hu" w:eastAsia="hu-HU"/>
         </w:rPr>
-        <w:t>.AspNetCore</w:t>
-      </w:r>
+        <w:t>Microsoft.AspNetCore.Identity.EntityFrameworkCore</w:t>
+      </w:r>
+      <w:proofErr w:type="spellEnd"/>
       <w:proofErr w:type="gramEnd"/>
-      <w:r>
-        <w:rPr>
-          <w:rFonts w:ascii="Times New Roman" w:eastAsia="Calibri" w:hAnsi="Times New Roman" w:cs="Times New Roman"/>
-          <w:szCs w:val="24"/>
-          <w:lang w:val="hu" w:eastAsia="hu-HU"/>
-        </w:rPr>
-        <w:t>.Identity.EntityFrameworkCore</w:t>
-      </w:r>
-      <w:proofErr w:type="spellEnd"/>
       <w:r>
         <w:rPr>
           <w:rFonts w:ascii="Times New Roman" w:eastAsia="Calibri" w:hAnsi="Times New Roman" w:cs="Times New Roman"/>
@@ -4990,14 +5537,6 @@
         </w:rPr>
       </w:pPr>
       <w:proofErr w:type="spellStart"/>
-      <w:r>
-        <w:rPr>
-          <w:rFonts w:ascii="Times New Roman" w:eastAsia="Calibri" w:hAnsi="Times New Roman" w:cs="Times New Roman"/>
-          <w:szCs w:val="24"/>
-          <w:lang w:val="hu" w:eastAsia="hu-HU"/>
-        </w:rPr>
-        <w:t>Microsoft</w:t>
-      </w:r>
       <w:proofErr w:type="gramStart"/>
       <w:r>
         <w:rPr>
@@ -5005,18 +5544,10 @@
           <w:szCs w:val="24"/>
           <w:lang w:val="hu" w:eastAsia="hu-HU"/>
         </w:rPr>
-        <w:t>.EntityFrameworkCore</w:t>
-      </w:r>
+        <w:t>Microsoft.EntityFrameworkCore.Tools</w:t>
+      </w:r>
+      <w:proofErr w:type="spellEnd"/>
       <w:proofErr w:type="gramEnd"/>
-      <w:r>
-        <w:rPr>
-          <w:rFonts w:ascii="Times New Roman" w:eastAsia="Calibri" w:hAnsi="Times New Roman" w:cs="Times New Roman"/>
-          <w:szCs w:val="24"/>
-          <w:lang w:val="hu" w:eastAsia="hu-HU"/>
-        </w:rPr>
-        <w:t>.Tools</w:t>
-      </w:r>
-      <w:proofErr w:type="spellEnd"/>
       <w:r>
         <w:rPr>
           <w:rFonts w:ascii="Times New Roman" w:eastAsia="Calibri" w:hAnsi="Times New Roman" w:cs="Times New Roman"/>
@@ -5633,17 +6164,17 @@
           <w:szCs w:val="24"/>
           <w:lang w:val="hu" w:eastAsia="hu-HU"/>
         </w:rPr>
-        <w:t>Community-ben</w:t>
-      </w:r>
-      <w:proofErr w:type="spellEnd"/>
-      <w:r>
-        <w:rPr>
-          <w:rFonts w:ascii="Times New Roman" w:eastAsia="Calibri" w:hAnsi="Times New Roman" w:cs="Times New Roman"/>
-          <w:color w:val="000000"/>
-          <w:szCs w:val="24"/>
-          <w:lang w:val="hu" w:eastAsia="hu-HU"/>
-        </w:rPr>
-        <w:t xml:space="preserve"> </w:t>
+        <w:t>Community</w:t>
+      </w:r>
+      <w:proofErr w:type="spellEnd"/>
+      <w:r>
+        <w:rPr>
+          <w:rFonts w:ascii="Times New Roman" w:eastAsia="Calibri" w:hAnsi="Times New Roman" w:cs="Times New Roman"/>
+          <w:color w:val="000000"/>
+          <w:szCs w:val="24"/>
+          <w:lang w:val="hu" w:eastAsia="hu-HU"/>
+        </w:rPr>
+        <w:t xml:space="preserve">-ben </w:t>
       </w:r>
       <w:proofErr w:type="spellStart"/>
       <w:r>
@@ -6105,7 +6636,7 @@
           <w:lang w:val="hu-HU"/>
         </w:rPr>
       </w:pPr>
-      <w:bookmarkStart w:id="3" w:name="_Toc227104186"/>
+      <w:bookmarkStart w:id="2" w:name="_Toc227104186"/>
       <w:r>
         <w:rPr>
           <w:rFonts w:ascii="Times New Roman" w:hAnsi="Times New Roman" w:cs="Times New Roman"/>
@@ -6115,7 +6646,7 @@
         <w:lastRenderedPageBreak/>
         <w:t>Adatbázis</w:t>
       </w:r>
-      <w:bookmarkEnd w:id="3"/>
+      <w:bookmarkEnd w:id="2"/>
     </w:p>
     <w:p>
       <w:pPr>
@@ -6166,27 +6697,7 @@
           <w:szCs w:val="24"/>
           <w:lang w:val="hu" w:eastAsia="hu-HU"/>
         </w:rPr>
-        <w:t xml:space="preserve">, illetve </w:t>
-      </w:r>
-      <w:proofErr w:type="spellStart"/>
-      <w:r>
-        <w:rPr>
-          <w:rFonts w:ascii="Times New Roman" w:eastAsia="Calibri" w:hAnsi="Times New Roman" w:cs="Times New Roman"/>
-          <w:color w:val="000000"/>
-          <w:szCs w:val="24"/>
-          <w:lang w:val="hu" w:eastAsia="hu-HU"/>
-        </w:rPr>
-        <w:t>Docker</w:t>
-      </w:r>
-      <w:proofErr w:type="spellEnd"/>
-      <w:r>
-        <w:rPr>
-          <w:rFonts w:ascii="Times New Roman" w:eastAsia="Calibri" w:hAnsi="Times New Roman" w:cs="Times New Roman"/>
-          <w:color w:val="000000"/>
-          <w:szCs w:val="24"/>
-          <w:lang w:val="hu" w:eastAsia="hu-HU"/>
-        </w:rPr>
-        <w:t xml:space="preserve"> alkalmazással </w:t>
+        <w:t xml:space="preserve">, illetve Docker alkalmazással </w:t>
       </w:r>
       <w:proofErr w:type="spellStart"/>
       <w:r>
@@ -6614,7 +7125,7 @@
           <w:lang w:val="hu-HU"/>
         </w:rPr>
       </w:pPr>
-      <w:bookmarkStart w:id="4" w:name="_Toc227104187"/>
+      <w:bookmarkStart w:id="3" w:name="_Toc227104187"/>
       <w:r>
         <w:rPr>
           <w:rFonts w:ascii="Times New Roman" w:hAnsi="Times New Roman" w:cs="Times New Roman"/>
@@ -6624,7 +7135,7 @@
         <w:lastRenderedPageBreak/>
         <w:t>Frontend</w:t>
       </w:r>
-      <w:bookmarkEnd w:id="4"/>
+      <w:bookmarkEnd w:id="3"/>
     </w:p>
     <w:p>
       <w:pPr>
@@ -6894,9 +7405,18 @@
           <w:szCs w:val="24"/>
           <w:lang w:val="hu" w:eastAsia="hu-HU"/>
         </w:rPr>
-        <w:t>Code-ban</w:t>
-      </w:r>
-      <w:proofErr w:type="spellEnd"/>
+        <w:t>Code</w:t>
+      </w:r>
+      <w:proofErr w:type="spellEnd"/>
+      <w:r>
+        <w:rPr>
+          <w:rFonts w:ascii="Times New Roman" w:eastAsia="Calibri" w:hAnsi="Times New Roman" w:cs="Times New Roman"/>
+          <w:color w:val="000000"/>
+          <w:szCs w:val="24"/>
+          <w:lang w:val="hu" w:eastAsia="hu-HU"/>
+        </w:rPr>
+        <w:t>-ban</w:t>
+      </w:r>
       <w:r>
         <w:rPr>
           <w:rFonts w:ascii="Times New Roman" w:eastAsia="Calibri" w:hAnsi="Times New Roman" w:cs="Times New Roman"/>
@@ -7338,23 +7858,13 @@
           <w:lang w:val="hu" w:eastAsia="hu-HU"/>
         </w:rPr>
       </w:pPr>
-      <w:proofErr w:type="spellStart"/>
-      <w:r>
-        <w:rPr>
-          <w:rFonts w:ascii="Times New Roman" w:eastAsia="Calibri" w:hAnsi="Times New Roman" w:cs="Times New Roman"/>
-          <w:szCs w:val="24"/>
-          <w:lang w:val="hu" w:eastAsia="hu-HU"/>
-        </w:rPr>
-        <w:t>Dockerfile</w:t>
-      </w:r>
-      <w:proofErr w:type="spellEnd"/>
-      <w:r>
-        <w:rPr>
-          <w:rFonts w:ascii="Times New Roman" w:eastAsia="Calibri" w:hAnsi="Times New Roman" w:cs="Times New Roman"/>
-          <w:szCs w:val="24"/>
-          <w:lang w:val="hu" w:eastAsia="hu-HU"/>
-        </w:rPr>
-        <w:t xml:space="preserve"> segítségével a </w:t>
+      <w:r>
+        <w:rPr>
+          <w:rFonts w:ascii="Times New Roman" w:eastAsia="Calibri" w:hAnsi="Times New Roman" w:cs="Times New Roman"/>
+          <w:szCs w:val="24"/>
+          <w:lang w:val="hu" w:eastAsia="hu-HU"/>
+        </w:rPr>
+        <w:t xml:space="preserve">Dockerfile segítségével a </w:t>
       </w:r>
       <w:proofErr w:type="spellStart"/>
       <w:r>
@@ -7435,43 +7945,7 @@
           <w:szCs w:val="24"/>
           <w:lang w:val="hu" w:eastAsia="hu-HU"/>
         </w:rPr>
-        <w:t>Teszteléshez: @testing-</w:t>
-      </w:r>
-      <w:proofErr w:type="spellStart"/>
-      <w:r>
-        <w:rPr>
-          <w:rFonts w:ascii="Times New Roman" w:eastAsia="Calibri" w:hAnsi="Times New Roman" w:cs="Times New Roman"/>
-          <w:szCs w:val="24"/>
-          <w:lang w:val="hu" w:eastAsia="hu-HU"/>
-        </w:rPr>
-        <w:t>library</w:t>
-      </w:r>
-      <w:proofErr w:type="spellEnd"/>
-      <w:r>
-        <w:rPr>
-          <w:rFonts w:ascii="Times New Roman" w:eastAsia="Calibri" w:hAnsi="Times New Roman" w:cs="Times New Roman"/>
-          <w:szCs w:val="24"/>
-          <w:lang w:val="hu" w:eastAsia="hu-HU"/>
-        </w:rPr>
-        <w:t>/</w:t>
-      </w:r>
-      <w:proofErr w:type="spellStart"/>
-      <w:r>
-        <w:rPr>
-          <w:rFonts w:ascii="Times New Roman" w:eastAsia="Calibri" w:hAnsi="Times New Roman" w:cs="Times New Roman"/>
-          <w:szCs w:val="24"/>
-          <w:lang w:val="hu" w:eastAsia="hu-HU"/>
-        </w:rPr>
-        <w:t>react</w:t>
-      </w:r>
-      <w:proofErr w:type="spellEnd"/>
-      <w:r>
-        <w:rPr>
-          <w:rFonts w:ascii="Times New Roman" w:eastAsia="Calibri" w:hAnsi="Times New Roman" w:cs="Times New Roman"/>
-          <w:szCs w:val="24"/>
-          <w:lang w:val="hu" w:eastAsia="hu-HU"/>
-        </w:rPr>
-        <w:t xml:space="preserve">, </w:t>
+        <w:t xml:space="preserve">Teszteléshez: @testing-library/react, </w:t>
       </w:r>
       <w:proofErr w:type="spellStart"/>
       <w:r>
@@ -7513,7 +7987,25 @@
           <w:szCs w:val="24"/>
           <w:lang w:val="hu" w:eastAsia="hu-HU"/>
         </w:rPr>
-        <w:t>react-router-dom</w:t>
+        <w:t>react</w:t>
+      </w:r>
+      <w:proofErr w:type="spellEnd"/>
+      <w:r>
+        <w:rPr>
+          <w:rFonts w:ascii="Times New Roman" w:eastAsia="Calibri" w:hAnsi="Times New Roman" w:cs="Times New Roman"/>
+          <w:szCs w:val="24"/>
+          <w:lang w:val="hu" w:eastAsia="hu-HU"/>
+        </w:rPr>
+        <w:t>-router-</w:t>
+      </w:r>
+      <w:proofErr w:type="spellStart"/>
+      <w:r>
+        <w:rPr>
+          <w:rFonts w:ascii="Times New Roman" w:eastAsia="Calibri" w:hAnsi="Times New Roman" w:cs="Times New Roman"/>
+          <w:szCs w:val="24"/>
+          <w:lang w:val="hu" w:eastAsia="hu-HU"/>
+        </w:rPr>
+        <w:t>dom</w:t>
       </w:r>
       <w:proofErr w:type="spellEnd"/>
       <w:r>
@@ -7856,7 +8348,7 @@
           <w:lang w:val="hu-HU"/>
         </w:rPr>
       </w:pPr>
-      <w:bookmarkStart w:id="5" w:name="_Toc227104188"/>
+      <w:bookmarkStart w:id="4" w:name="_Toc227104188"/>
       <w:r>
         <w:rPr>
           <w:rFonts w:ascii="Times New Roman" w:hAnsi="Times New Roman" w:cs="Times New Roman"/>
@@ -7866,7 +8358,7 @@
         <w:lastRenderedPageBreak/>
         <w:t>WPF alkalmazás</w:t>
       </w:r>
-      <w:bookmarkEnd w:id="5"/>
+      <w:bookmarkEnd w:id="4"/>
     </w:p>
     <w:p>
       <w:pPr>
@@ -8837,7 +9329,7 @@
           <w:lang w:val="hu-HU"/>
         </w:rPr>
       </w:pPr>
-      <w:bookmarkStart w:id="6" w:name="_Toc227104189"/>
+      <w:bookmarkStart w:id="5" w:name="_Toc227104189"/>
       <w:r>
         <w:rPr>
           <w:rFonts w:ascii="Times New Roman" w:hAnsi="Times New Roman" w:cs="Times New Roman"/>
@@ -8856,7 +9348,7 @@
         </w:rPr>
         <w:t>Coding</w:t>
       </w:r>
-      <w:bookmarkEnd w:id="6"/>
+      <w:bookmarkEnd w:id="5"/>
       <w:proofErr w:type="spellEnd"/>
     </w:p>
     <w:p>
@@ -8940,7 +9432,7 @@
           <w:lang w:val="hu" w:eastAsia="hu-HU"/>
         </w:rPr>
       </w:pPr>
-      <w:bookmarkStart w:id="7" w:name="_Toc227002228"/>
+      <w:bookmarkStart w:id="6" w:name="_Toc227002228"/>
       <w:r>
         <w:rPr>
           <w:rFonts w:ascii="Times New Roman" w:eastAsia="Calibri" w:hAnsi="Times New Roman" w:cs="Times New Roman"/>
@@ -8948,7 +9440,7 @@
         </w:rPr>
         <w:t>Feladatok elosztása:</w:t>
       </w:r>
-      <w:bookmarkEnd w:id="7"/>
+      <w:bookmarkEnd w:id="6"/>
     </w:p>
     <w:p>
       <w:pPr>
@@ -9474,7 +9966,7 @@
           <w:szCs w:val="44"/>
         </w:rPr>
       </w:pPr>
-      <w:bookmarkStart w:id="8" w:name="_Toc227104190"/>
+      <w:bookmarkStart w:id="7" w:name="_Toc227104190"/>
       <w:proofErr w:type="spellStart"/>
       <w:r>
         <w:rPr>
@@ -9483,7 +9975,7 @@
         </w:rPr>
         <w:t>Irodalomjegyzék</w:t>
       </w:r>
-      <w:bookmarkEnd w:id="8"/>
+      <w:bookmarkEnd w:id="7"/>
       <w:proofErr w:type="spellEnd"/>
     </w:p>
     <w:p>
@@ -9512,7 +10004,7 @@
         </w:rPr>
         <w:t xml:space="preserve">Frontend feltöltése, webcím: </w:t>
       </w:r>
-      <w:hyperlink r:id="rId12">
+      <w:hyperlink r:id="rId16">
         <w:r>
           <w:rPr>
             <w:rStyle w:val="Hiperhivatkozs"/>
@@ -9534,12 +10026,60 @@
           <w:rFonts w:ascii="Times New Roman" w:hAnsi="Times New Roman" w:cs="Times New Roman"/>
         </w:rPr>
       </w:pPr>
-      <w:proofErr w:type="spellStart"/>
-      <w:r>
-        <w:rPr>
-          <w:rFonts w:ascii="Times New Roman" w:hAnsi="Times New Roman" w:cs="Times New Roman"/>
-        </w:rPr>
-        <w:t>Forrás</w:t>
+      <w:r>
+        <w:rPr>
+          <w:rFonts w:ascii="Times New Roman" w:hAnsi="Times New Roman" w:cs="Times New Roman"/>
+        </w:rPr>
+        <w:t xml:space="preserve">Forrás: </w:t>
+      </w:r>
+      <w:proofErr w:type="spellStart"/>
+      <w:r>
+        <w:rPr>
+          <w:rFonts w:ascii="Times New Roman" w:hAnsi="Times New Roman" w:cs="Times New Roman"/>
+        </w:rPr>
+        <w:t>pygame-ce</w:t>
+      </w:r>
+      <w:proofErr w:type="spellEnd"/>
+      <w:r>
+        <w:rPr>
+          <w:rFonts w:ascii="Times New Roman" w:hAnsi="Times New Roman" w:cs="Times New Roman"/>
+        </w:rPr>
+        <w:t xml:space="preserve"> </w:t>
+      </w:r>
+      <w:proofErr w:type="spellStart"/>
+      <w:r>
+        <w:rPr>
+          <w:rFonts w:ascii="Times New Roman" w:hAnsi="Times New Roman" w:cs="Times New Roman"/>
+        </w:rPr>
+        <w:t>használata</w:t>
+      </w:r>
+      <w:proofErr w:type="spellEnd"/>
+      <w:r>
+        <w:rPr>
+          <w:rFonts w:ascii="Times New Roman" w:hAnsi="Times New Roman" w:cs="Times New Roman"/>
+        </w:rPr>
+        <w:t>/</w:t>
+      </w:r>
+      <w:proofErr w:type="spellStart"/>
+      <w:r>
+        <w:rPr>
+          <w:rFonts w:ascii="Times New Roman" w:hAnsi="Times New Roman" w:cs="Times New Roman"/>
+        </w:rPr>
+        <w:t>telepítése</w:t>
+      </w:r>
+      <w:proofErr w:type="spellEnd"/>
+      <w:r>
+        <w:rPr>
+          <w:rFonts w:ascii="Times New Roman" w:hAnsi="Times New Roman" w:cs="Times New Roman"/>
+        </w:rPr>
+        <w:t xml:space="preserve">, </w:t>
+      </w:r>
+      <w:proofErr w:type="spellStart"/>
+      <w:r>
+        <w:rPr>
+          <w:rFonts w:ascii="Times New Roman" w:hAnsi="Times New Roman" w:cs="Times New Roman"/>
+        </w:rPr>
+        <w:t>webcím</w:t>
       </w:r>
       <w:proofErr w:type="spellEnd"/>
       <w:r>
@@ -9548,63 +10088,7 @@
         </w:rPr>
         <w:t xml:space="preserve">: </w:t>
       </w:r>
-      <w:proofErr w:type="spellStart"/>
-      <w:r>
-        <w:rPr>
-          <w:rFonts w:ascii="Times New Roman" w:hAnsi="Times New Roman" w:cs="Times New Roman"/>
-        </w:rPr>
-        <w:t>pygame-ce</w:t>
-      </w:r>
-      <w:proofErr w:type="spellEnd"/>
-      <w:r>
-        <w:rPr>
-          <w:rFonts w:ascii="Times New Roman" w:hAnsi="Times New Roman" w:cs="Times New Roman"/>
-        </w:rPr>
-        <w:t xml:space="preserve"> </w:t>
-      </w:r>
-      <w:proofErr w:type="spellStart"/>
-      <w:r>
-        <w:rPr>
-          <w:rFonts w:ascii="Times New Roman" w:hAnsi="Times New Roman" w:cs="Times New Roman"/>
-        </w:rPr>
-        <w:t>használata</w:t>
-      </w:r>
-      <w:proofErr w:type="spellEnd"/>
-      <w:r>
-        <w:rPr>
-          <w:rFonts w:ascii="Times New Roman" w:hAnsi="Times New Roman" w:cs="Times New Roman"/>
-        </w:rPr>
-        <w:t>/</w:t>
-      </w:r>
-      <w:proofErr w:type="spellStart"/>
-      <w:r>
-        <w:rPr>
-          <w:rFonts w:ascii="Times New Roman" w:hAnsi="Times New Roman" w:cs="Times New Roman"/>
-        </w:rPr>
-        <w:t>telepítése</w:t>
-      </w:r>
-      <w:proofErr w:type="spellEnd"/>
-      <w:r>
-        <w:rPr>
-          <w:rFonts w:ascii="Times New Roman" w:hAnsi="Times New Roman" w:cs="Times New Roman"/>
-        </w:rPr>
-        <w:t xml:space="preserve">, </w:t>
-      </w:r>
-      <w:proofErr w:type="spellStart"/>
-      <w:r>
-        <w:rPr>
-          <w:rFonts w:ascii="Times New Roman" w:hAnsi="Times New Roman" w:cs="Times New Roman"/>
-        </w:rPr>
-        <w:t>webcím</w:t>
-      </w:r>
-      <w:proofErr w:type="spellEnd"/>
-      <w:r>
-        <w:rPr>
-          <w:rFonts w:ascii="Times New Roman" w:hAnsi="Times New Roman" w:cs="Times New Roman"/>
-        </w:rPr>
-        <w:t xml:space="preserve">: </w:t>
-      </w:r>
-      <w:hyperlink r:id="rId13" w:history="1">
+      <w:hyperlink r:id="rId17" w:history="1">
         <w:r>
           <w:rPr>
             <w:rStyle w:val="Hiperhivatkozs"/>
@@ -9659,19 +10143,11 @@
           <w:rFonts w:ascii="Times New Roman" w:hAnsi="Times New Roman" w:cs="Times New Roman"/>
         </w:rPr>
       </w:pPr>
-      <w:proofErr w:type="spellStart"/>
-      <w:r>
-        <w:rPr>
-          <w:rFonts w:ascii="Times New Roman" w:hAnsi="Times New Roman" w:cs="Times New Roman"/>
-        </w:rPr>
-        <w:t>Forrás</w:t>
-      </w:r>
-      <w:proofErr w:type="spellEnd"/>
-      <w:r>
-        <w:rPr>
-          <w:rFonts w:ascii="Times New Roman" w:hAnsi="Times New Roman" w:cs="Times New Roman"/>
-        </w:rPr>
-        <w:t xml:space="preserve">: </w:t>
+      <w:r>
+        <w:rPr>
+          <w:rFonts w:ascii="Times New Roman" w:hAnsi="Times New Roman" w:cs="Times New Roman"/>
+        </w:rPr>
+        <w:t xml:space="preserve">Forrás: </w:t>
       </w:r>
       <w:r>
         <w:rPr>
@@ -9727,7 +10203,7 @@
         </w:rPr>
         <w:t xml:space="preserve"> </w:t>
       </w:r>
-      <w:hyperlink r:id="rId14" w:history="1">
+      <w:hyperlink r:id="rId18" w:history="1">
         <w:r>
           <w:rPr>
             <w:rStyle w:val="Hiperhivatkozs"/>
@@ -9788,12 +10264,32 @@
           <w:rFonts w:ascii="Times New Roman" w:hAnsi="Times New Roman" w:cs="Times New Roman"/>
         </w:rPr>
       </w:pPr>
-      <w:proofErr w:type="spellStart"/>
-      <w:r>
-        <w:rPr>
-          <w:rFonts w:ascii="Times New Roman" w:hAnsi="Times New Roman" w:cs="Times New Roman"/>
-        </w:rPr>
-        <w:t>Forrás</w:t>
+      <w:r>
+        <w:rPr>
+          <w:rFonts w:ascii="Times New Roman" w:hAnsi="Times New Roman" w:cs="Times New Roman"/>
+        </w:rPr>
+        <w:t xml:space="preserve">Forrás: Inno Setup </w:t>
+      </w:r>
+      <w:proofErr w:type="spellStart"/>
+      <w:r>
+        <w:rPr>
+          <w:rFonts w:ascii="Times New Roman" w:hAnsi="Times New Roman" w:cs="Times New Roman"/>
+        </w:rPr>
+        <w:t>használata</w:t>
+      </w:r>
+      <w:proofErr w:type="spellEnd"/>
+      <w:r>
+        <w:rPr>
+          <w:rFonts w:ascii="Times New Roman" w:hAnsi="Times New Roman" w:cs="Times New Roman"/>
+        </w:rPr>
+        <w:t xml:space="preserve">, </w:t>
+      </w:r>
+      <w:proofErr w:type="spellStart"/>
+      <w:r>
+        <w:rPr>
+          <w:rFonts w:ascii="Times New Roman" w:hAnsi="Times New Roman" w:cs="Times New Roman"/>
+        </w:rPr>
+        <w:t>webcím</w:t>
       </w:r>
       <w:proofErr w:type="spellEnd"/>
       <w:r>
@@ -9802,49 +10298,7 @@
         </w:rPr>
         <w:t xml:space="preserve">: </w:t>
       </w:r>
-      <w:proofErr w:type="spellStart"/>
-      <w:r>
-        <w:rPr>
-          <w:rFonts w:ascii="Times New Roman" w:hAnsi="Times New Roman" w:cs="Times New Roman"/>
-        </w:rPr>
-        <w:t>Inno</w:t>
-      </w:r>
-      <w:proofErr w:type="spellEnd"/>
-      <w:r>
-        <w:rPr>
-          <w:rFonts w:ascii="Times New Roman" w:hAnsi="Times New Roman" w:cs="Times New Roman"/>
-        </w:rPr>
-        <w:t xml:space="preserve"> Setup </w:t>
-      </w:r>
-      <w:proofErr w:type="spellStart"/>
-      <w:r>
-        <w:rPr>
-          <w:rFonts w:ascii="Times New Roman" w:hAnsi="Times New Roman" w:cs="Times New Roman"/>
-        </w:rPr>
-        <w:t>használata</w:t>
-      </w:r>
-      <w:proofErr w:type="spellEnd"/>
-      <w:r>
-        <w:rPr>
-          <w:rFonts w:ascii="Times New Roman" w:hAnsi="Times New Roman" w:cs="Times New Roman"/>
-        </w:rPr>
-        <w:t xml:space="preserve">, </w:t>
-      </w:r>
-      <w:proofErr w:type="spellStart"/>
-      <w:r>
-        <w:rPr>
-          <w:rFonts w:ascii="Times New Roman" w:hAnsi="Times New Roman" w:cs="Times New Roman"/>
-        </w:rPr>
-        <w:t>webcím</w:t>
-      </w:r>
-      <w:proofErr w:type="spellEnd"/>
-      <w:r>
-        <w:rPr>
-          <w:rFonts w:ascii="Times New Roman" w:hAnsi="Times New Roman" w:cs="Times New Roman"/>
-        </w:rPr>
-        <w:t xml:space="preserve">: </w:t>
-      </w:r>
-      <w:hyperlink r:id="rId15" w:history="1">
+      <w:hyperlink r:id="rId19" w:history="1">
         <w:r>
           <w:rPr>
             <w:rStyle w:val="Hiperhivatkozs"/>
@@ -9919,7 +10373,7 @@
           <w:lang w:val="hu-HU"/>
         </w:rPr>
         <w:sectPr>
-          <w:footerReference w:type="default" r:id="rId16"/>
+          <w:footerReference w:type="default" r:id="rId20"/>
           <w:pgSz w:w="11906" w:h="16838"/>
           <w:pgMar w:top="1417" w:right="1417" w:bottom="1417" w:left="1417" w:header="708" w:footer="708" w:gutter="0"/>
           <w:pgNumType w:start="1"/>
@@ -10055,7 +10509,7 @@
           <w:lang w:val="hu-HU"/>
         </w:rPr>
       </w:pPr>
-      <w:bookmarkStart w:id="9" w:name="_Toc227104191"/>
+      <w:bookmarkStart w:id="8" w:name="_Toc227104191"/>
       <w:r>
         <w:rPr>
           <w:rFonts w:ascii="Times New Roman" w:hAnsi="Times New Roman" w:cs="Times New Roman"/>
@@ -10063,7 +10517,7 @@
         </w:rPr>
         <w:t>Mellékletek</w:t>
       </w:r>
-      <w:bookmarkEnd w:id="9"/>
+      <w:bookmarkEnd w:id="8"/>
     </w:p>
     <w:p>
       <w:pPr>
@@ -10074,8 +10528,8 @@
           <w:lang w:val="hu-HU"/>
         </w:rPr>
       </w:pPr>
-      <w:bookmarkStart w:id="10" w:name="_worlds.py"/>
-      <w:bookmarkEnd w:id="10"/>
+      <w:bookmarkStart w:id="9" w:name="_worlds.py"/>
+      <w:bookmarkEnd w:id="9"/>
       <w:r>
         <w:rPr>
           <w:rFonts w:ascii="Times New Roman" w:hAnsi="Times New Roman" w:cs="Times New Roman"/>
@@ -10083,7 +10537,7 @@
         </w:rPr>
         <w:br w:type="page"/>
       </w:r>
-      <w:bookmarkStart w:id="11" w:name="_Toc227104192"/>
+      <w:bookmarkStart w:id="10" w:name="_Toc227104192"/>
       <w:r>
         <w:rPr>
           <w:rFonts w:ascii="Times New Roman" w:hAnsi="Times New Roman" w:cs="Times New Roman"/>
@@ -10106,7 +10560,7 @@
         </w:rPr>
         <w:t>py</w:t>
       </w:r>
-      <w:bookmarkEnd w:id="11"/>
+      <w:bookmarkEnd w:id="10"/>
     </w:p>
     <w:p>
       <w:pPr>
@@ -10137,7 +10591,7 @@
                     <pic:cNvPicPr/>
                   </pic:nvPicPr>
                   <pic:blipFill>
-                    <a:blip r:embed="rId17">
+                    <a:blip r:embed="rId21">
                       <a:extLst>
                         <a:ext uri="{28A0092B-C50C-407E-A947-70E740481C1C}">
                           <a14:useLocalDpi xmlns:a14="http://schemas.microsoft.com/office/drawing/2010/main" val="0"/>
@@ -10173,9 +10627,9 @@
           <w:lang w:val="hu-HU"/>
         </w:rPr>
       </w:pPr>
-      <w:bookmarkStart w:id="12" w:name="_MainWindow.xaml.cs"/>
-      <w:bookmarkStart w:id="13" w:name="_Toc227104193"/>
-      <w:bookmarkEnd w:id="12"/>
+      <w:bookmarkStart w:id="11" w:name="_MainWindow.xaml.cs"/>
+      <w:bookmarkStart w:id="12" w:name="_Toc227104193"/>
+      <w:bookmarkEnd w:id="11"/>
       <w:r>
         <w:rPr>
           <w:rFonts w:ascii="Times New Roman" w:hAnsi="Times New Roman" w:cs="Times New Roman"/>
@@ -10207,7 +10661,7 @@
                     <pic:cNvPicPr/>
                   </pic:nvPicPr>
                   <pic:blipFill>
-                    <a:blip r:embed="rId18">
+                    <a:blip r:embed="rId22">
                       <a:extLst>
                         <a:ext uri="{28A0092B-C50C-407E-A947-70E740481C1C}">
                           <a14:useLocalDpi xmlns:a14="http://schemas.microsoft.com/office/drawing/2010/main" val="0"/>
@@ -10261,7 +10715,7 @@
         </w:rPr>
         <w:t>s</w:t>
       </w:r>
-      <w:bookmarkEnd w:id="13"/>
+      <w:bookmarkEnd w:id="12"/>
       <w:proofErr w:type="spellEnd"/>
     </w:p>
     <w:p>
@@ -10273,9 +10727,9 @@
           <w:lang w:val="hu-HU"/>
         </w:rPr>
       </w:pPr>
-      <w:bookmarkStart w:id="14" w:name="_AddWindow.xaml.cs"/>
-      <w:bookmarkStart w:id="15" w:name="_Toc227104194"/>
-      <w:bookmarkEnd w:id="14"/>
+      <w:bookmarkStart w:id="13" w:name="_AddWindow.xaml.cs"/>
+      <w:bookmarkStart w:id="14" w:name="_Toc227104194"/>
+      <w:bookmarkEnd w:id="13"/>
       <w:r>
         <w:rPr>
           <w:rFonts w:ascii="Times New Roman" w:hAnsi="Times New Roman" w:cs="Times New Roman"/>
@@ -10307,7 +10761,7 @@
                     <pic:cNvPicPr/>
                   </pic:nvPicPr>
                   <pic:blipFill>
-                    <a:blip r:embed="rId19">
+                    <a:blip r:embed="rId23">
                       <a:extLst>
                         <a:ext uri="{28A0092B-C50C-407E-A947-70E740481C1C}">
                           <a14:useLocalDpi xmlns:a14="http://schemas.microsoft.com/office/drawing/2010/main" val="0"/>
@@ -10347,7 +10801,7 @@
         </w:rPr>
         <w:t>AddWindow.xaml.cs</w:t>
       </w:r>
-      <w:bookmarkEnd w:id="15"/>
+      <w:bookmarkEnd w:id="14"/>
       <w:proofErr w:type="spellEnd"/>
     </w:p>
     <w:p>
@@ -10374,9 +10828,9 @@
           <w:lang w:val="hu-HU"/>
         </w:rPr>
       </w:pPr>
-      <w:bookmarkStart w:id="16" w:name="_menu.py"/>
-      <w:bookmarkStart w:id="17" w:name="_Toc227104195"/>
-      <w:bookmarkEnd w:id="16"/>
+      <w:bookmarkStart w:id="15" w:name="_menu.py"/>
+      <w:bookmarkStart w:id="16" w:name="_Toc227104195"/>
+      <w:bookmarkEnd w:id="15"/>
       <w:r>
         <w:rPr>
           <w:rFonts w:ascii="Times New Roman" w:hAnsi="Times New Roman" w:cs="Times New Roman"/>
@@ -10408,7 +10862,7 @@
                     <pic:cNvPicPr/>
                   </pic:nvPicPr>
                   <pic:blipFill>
-                    <a:blip r:embed="rId20">
+                    <a:blip r:embed="rId24">
                       <a:extLst>
                         <a:ext uri="{28A0092B-C50C-407E-A947-70E740481C1C}">
                           <a14:useLocalDpi xmlns:a14="http://schemas.microsoft.com/office/drawing/2010/main" val="0"/>
@@ -10447,7 +10901,7 @@
         </w:rPr>
         <w:t>menu.py</w:t>
       </w:r>
-      <w:bookmarkEnd w:id="17"/>
+      <w:bookmarkEnd w:id="16"/>
     </w:p>
     <w:p>
       <w:pPr>
@@ -10470,9 +10924,9 @@
           <w:lang w:val="hu-HU"/>
         </w:rPr>
       </w:pPr>
-      <w:bookmarkStart w:id="18" w:name="_Sweagger_UI"/>
-      <w:bookmarkStart w:id="19" w:name="_Toc227104196"/>
-      <w:bookmarkEnd w:id="18"/>
+      <w:bookmarkStart w:id="17" w:name="_Sweagger_UI"/>
+      <w:bookmarkStart w:id="18" w:name="_Toc227104196"/>
+      <w:bookmarkEnd w:id="17"/>
       <w:r>
         <w:rPr>
           <w:noProof/>
@@ -10503,7 +10957,7 @@
                     <pic:cNvPicPr/>
                   </pic:nvPicPr>
                   <pic:blipFill>
-                    <a:blip r:embed="rId21">
+                    <a:blip r:embed="rId25">
                       <a:extLst>
                         <a:ext uri="{28A0092B-C50C-407E-A947-70E740481C1C}">
                           <a14:useLocalDpi xmlns:a14="http://schemas.microsoft.com/office/drawing/2010/main" val="0"/>
@@ -10549,7 +11003,7 @@
         </w:rPr>
         <w:t xml:space="preserve"> UI</w:t>
       </w:r>
-      <w:bookmarkEnd w:id="19"/>
+      <w:bookmarkEnd w:id="18"/>
     </w:p>
     <w:p>
       <w:pPr>
@@ -10572,9 +11026,9 @@
           <w:lang w:val="hu-HU"/>
         </w:rPr>
       </w:pPr>
-      <w:bookmarkStart w:id="20" w:name="_Xampp_MySQL"/>
-      <w:bookmarkStart w:id="21" w:name="_Toc227104197"/>
-      <w:bookmarkEnd w:id="20"/>
+      <w:bookmarkStart w:id="19" w:name="_Xampp_MySQL"/>
+      <w:bookmarkStart w:id="20" w:name="_Toc227104197"/>
+      <w:bookmarkEnd w:id="19"/>
       <w:r>
         <w:rPr>
           <w:noProof/>
@@ -10605,7 +11059,7 @@
                     <pic:cNvPicPr/>
                   </pic:nvPicPr>
                   <pic:blipFill>
-                    <a:blip r:embed="rId22" cstate="print">
+                    <a:blip r:embed="rId26" cstate="print">
                       <a:extLst>
                         <a:ext uri="{28A0092B-C50C-407E-A947-70E740481C1C}">
                           <a14:useLocalDpi xmlns:a14="http://schemas.microsoft.com/office/drawing/2010/main" val="0"/>
@@ -10658,7 +11112,7 @@
         </w:rPr>
         <w:t>MySQL</w:t>
       </w:r>
-      <w:bookmarkEnd w:id="21"/>
+      <w:bookmarkEnd w:id="20"/>
       <w:proofErr w:type="spellEnd"/>
     </w:p>
     <w:p>
@@ -10682,9 +11136,9 @@
           <w:lang w:val="hu-HU"/>
         </w:rPr>
       </w:pPr>
-      <w:bookmarkStart w:id="22" w:name="_Index.jsx"/>
-      <w:bookmarkStart w:id="23" w:name="_Toc227104198"/>
-      <w:bookmarkEnd w:id="22"/>
+      <w:bookmarkStart w:id="21" w:name="_Index.jsx"/>
+      <w:bookmarkStart w:id="22" w:name="_Toc227104198"/>
+      <w:bookmarkEnd w:id="21"/>
       <w:r>
         <w:rPr>
           <w:noProof/>
@@ -10692,7 +11146,7 @@
         </w:rPr>
         <w:lastRenderedPageBreak/>
         <w:drawing>
-          <wp:anchor distT="0" distB="0" distL="114300" distR="114300" simplePos="0" relativeHeight="251668480" behindDoc="0" locked="0" layoutInCell="1" allowOverlap="1" wp14:anchorId="118766BC" wp14:editId="6D8DB178">
+          <wp:anchor distT="0" distB="0" distL="114300" distR="114300" simplePos="0" relativeHeight="251668480" behindDoc="0" locked="0" layoutInCell="1" allowOverlap="1" wp14:anchorId="118766BC" wp14:editId="3BA992AF">
             <wp:simplePos x="0" y="0"/>
             <wp:positionH relativeFrom="page">
               <wp:align>right</wp:align>
@@ -10700,8 +11154,8 @@
             <wp:positionV relativeFrom="paragraph">
               <wp:posOffset>546597</wp:posOffset>
             </wp:positionV>
-            <wp:extent cx="7489825" cy="3211830"/>
-            <wp:effectExtent l="0" t="0" r="0" b="7620"/>
+            <wp:extent cx="7487920" cy="6265545"/>
+            <wp:effectExtent l="0" t="0" r="0" b="1905"/>
             <wp:wrapSquare wrapText="bothSides"/>
             <wp:docPr id="387182555" name="Kép 4"/>
             <wp:cNvGraphicFramePr>
@@ -10715,7 +11169,7 @@
                     <pic:cNvPicPr/>
                   </pic:nvPicPr>
                   <pic:blipFill>
-                    <a:blip r:embed="rId23">
+                    <a:blip r:embed="rId27">
                       <a:extLst>
                         <a:ext uri="{28A0092B-C50C-407E-A947-70E740481C1C}">
                           <a14:useLocalDpi xmlns:a14="http://schemas.microsoft.com/office/drawing/2010/main" val="0"/>
@@ -10729,7 +11183,7 @@
                   <pic:spPr>
                     <a:xfrm>
                       <a:off x="0" y="0"/>
-                      <a:ext cx="7492898" cy="3213390"/>
+                      <a:ext cx="7517622" cy="6290158"/>
                     </a:xfrm>
                     <a:prstGeom prst="rect">
                       <a:avLst/>
@@ -10754,7 +11208,7 @@
         </w:rPr>
         <w:t>Index.jsx</w:t>
       </w:r>
-      <w:bookmarkEnd w:id="23"/>
+      <w:bookmarkEnd w:id="22"/>
       <w:proofErr w:type="spellEnd"/>
     </w:p>
     <w:p>
@@ -10765,7 +11219,7 @@
       </w:pPr>
     </w:p>
     <w:sectPr>
-      <w:footerReference w:type="default" r:id="rId24"/>
+      <w:footerReference w:type="default" r:id="rId28"/>
       <w:pgSz w:w="11906" w:h="16838"/>
       <w:pgMar w:top="1417" w:right="1417" w:bottom="1417" w:left="1417" w:header="708" w:footer="708" w:gutter="0"/>
       <w:pgNumType w:fmt="upperRoman" w:start="1"/>
@@ -10777,7 +11231,7 @@
 </file>
 
 <file path=word/endnotes.xml><?xml version="1.0" encoding="utf-8"?>
-<w:endnotes xmlns:wpc="http://schemas.microsoft.com/office/word/2010/wordprocessingCanvas" xmlns:cx="http://schemas.microsoft.com/office/drawing/2014/chartex" xmlns:cx1="http://schemas.microsoft.com/office/drawing/2015/9/8/chartex" xmlns:mc="http://schemas.openxmlformats.org/markup-compatibility/2006" xmlns:o="urn:schemas-microsoft-com:office:office" xmlns:r="http://schemas.openxmlformats.org/officeDocument/2006/relationships" xmlns:m="http://schemas.openxmlformats.org/officeDocument/2006/math" xmlns:v="urn:schemas-microsoft-com:vml" xmlns:wp14="http://schemas.microsoft.com/office/word/2010/wordprocessingDrawing" xmlns:wp="http://schemas.openxmlformats.org/drawingml/2006/wordprocessingDrawing" xmlns:w10="urn:schemas-microsoft-com:office:word" xmlns:w="http://schemas.openxmlformats.org/wordprocessingml/2006/main" xmlns:w14="http://schemas.microsoft.com/office/word/2010/wordml" xmlns:w15="http://schemas.microsoft.com/office/word/2012/wordml" xmlns:w16se="http://schemas.microsoft.com/office/word/2015/wordml/symex" xmlns:wpg="http://schemas.microsoft.com/office/word/2010/wordprocessingGroup" xmlns:wpi="http://schemas.microsoft.com/office/word/2010/wordprocessingInk" xmlns:wne="http://schemas.microsoft.com/office/word/2006/wordml" xmlns:wps="http://schemas.microsoft.com/office/word/2010/wordprocessingShape" mc:Ignorable="w14 w15 w16se wp14">
+<w:endnotes xmlns:wpc="http://schemas.microsoft.com/office/word/2010/wordprocessingCanvas" xmlns:cx="http://schemas.microsoft.com/office/drawing/2014/chartex" xmlns:cx1="http://schemas.microsoft.com/office/drawing/2015/9/8/chartex" xmlns:cx2="http://schemas.microsoft.com/office/drawing/2015/10/21/chartex" xmlns:cx3="http://schemas.microsoft.com/office/drawing/2016/5/9/chartex" xmlns:cx4="http://schemas.microsoft.com/office/drawing/2016/5/10/chartex" xmlns:cx5="http://schemas.microsoft.com/office/drawing/2016/5/11/chartex" xmlns:cx6="http://schemas.microsoft.com/office/drawing/2016/5/12/chartex" xmlns:cx7="http://schemas.microsoft.com/office/drawing/2016/5/13/chartex" xmlns:cx8="http://schemas.microsoft.com/office/drawing/2016/5/14/chartex" xmlns:mc="http://schemas.openxmlformats.org/markup-compatibility/2006" xmlns:aink="http://schemas.microsoft.com/office/drawing/2016/ink" xmlns:am3d="http://schemas.microsoft.com/office/drawing/2017/model3d" xmlns:o="urn:schemas-microsoft-com:office:office" xmlns:oel="http://schemas.microsoft.com/office/2019/extlst" xmlns:r="http://schemas.openxmlformats.org/officeDocument/2006/relationships" xmlns:m="http://schemas.openxmlformats.org/officeDocument/2006/math" xmlns:v="urn:schemas-microsoft-com:vml" xmlns:wp14="http://schemas.microsoft.com/office/word/2010/wordprocessingDrawing" xmlns:wp="http://schemas.openxmlformats.org/drawingml/2006/wordprocessingDrawing" xmlns:w10="urn:schemas-microsoft-com:office:word" xmlns:w="http://schemas.openxmlformats.org/wordprocessingml/2006/main" xmlns:w14="http://schemas.microsoft.com/office/word/2010/wordml" xmlns:w15="http://schemas.microsoft.com/office/word/2012/wordml" xmlns:w16cex="http://schemas.microsoft.com/office/word/2018/wordml/cex" xmlns:w16cid="http://schemas.microsoft.com/office/word/2016/wordml/cid" xmlns:w16="http://schemas.microsoft.com/office/word/2018/wordml" xmlns:w16du="http://schemas.microsoft.com/office/word/2023/wordml/word16du" xmlns:w16sdtdh="http://schemas.microsoft.com/office/word/2020/wordml/sdtdatahash" xmlns:w16sdtfl="http://schemas.microsoft.com/office/word/2024/wordml/sdtformatlock" xmlns:w16se="http://schemas.microsoft.com/office/word/2015/wordml/symex" xmlns:wpg="http://schemas.microsoft.com/office/word/2010/wordprocessingGroup" xmlns:wpi="http://schemas.microsoft.com/office/word/2010/wordprocessingInk" xmlns:wne="http://schemas.microsoft.com/office/word/2006/wordml" xmlns:wps="http://schemas.microsoft.com/office/word/2010/wordprocessingShape" mc:Ignorable="w14 w15 w16se w16cid w16 w16cex w16sdtdh w16sdtfl w16du wp14">
   <w:endnote w:type="separator" w:id="-1">
     <w:p>
       <w:pPr>
@@ -10802,7 +11256,7 @@
 </file>
 
 <file path=word/footer1.xml><?xml version="1.0" encoding="utf-8"?>
-<w:ftr xmlns:wpc="http://schemas.microsoft.com/office/word/2010/wordprocessingCanvas" xmlns:cx="http://schemas.microsoft.com/office/drawing/2014/chartex" xmlns:cx1="http://schemas.microsoft.com/office/drawing/2015/9/8/chartex" xmlns:mc="http://schemas.openxmlformats.org/markup-compatibility/2006" xmlns:o="urn:schemas-microsoft-com:office:office" xmlns:r="http://schemas.openxmlformats.org/officeDocument/2006/relationships" xmlns:m="http://schemas.openxmlformats.org/officeDocument/2006/math" xmlns:v="urn:schemas-microsoft-com:vml" xmlns:wp14="http://schemas.microsoft.com/office/word/2010/wordprocessingDrawing" xmlns:wp="http://schemas.openxmlformats.org/drawingml/2006/wordprocessingDrawing" xmlns:w10="urn:schemas-microsoft-com:office:word" xmlns:w="http://schemas.openxmlformats.org/wordprocessingml/2006/main" xmlns:w14="http://schemas.microsoft.com/office/word/2010/wordml" xmlns:w15="http://schemas.microsoft.com/office/word/2012/wordml" xmlns:w16se="http://schemas.microsoft.com/office/word/2015/wordml/symex" xmlns:wpg="http://schemas.microsoft.com/office/word/2010/wordprocessingGroup" xmlns:wpi="http://schemas.microsoft.com/office/word/2010/wordprocessingInk" xmlns:wne="http://schemas.microsoft.com/office/word/2006/wordml" xmlns:wps="http://schemas.microsoft.com/office/word/2010/wordprocessingShape" mc:Ignorable="w14 w15 w16se wp14">
+<w:ftr xmlns:wpc="http://schemas.microsoft.com/office/word/2010/wordprocessingCanvas" xmlns:cx="http://schemas.microsoft.com/office/drawing/2014/chartex" xmlns:cx1="http://schemas.microsoft.com/office/drawing/2015/9/8/chartex" xmlns:cx2="http://schemas.microsoft.com/office/drawing/2015/10/21/chartex" xmlns:cx3="http://schemas.microsoft.com/office/drawing/2016/5/9/chartex" xmlns:cx4="http://schemas.microsoft.com/office/drawing/2016/5/10/chartex" xmlns:cx5="http://schemas.microsoft.com/office/drawing/2016/5/11/chartex" xmlns:cx6="http://schemas.microsoft.com/office/drawing/2016/5/12/chartex" xmlns:cx7="http://schemas.microsoft.com/office/drawing/2016/5/13/chartex" xmlns:cx8="http://schemas.microsoft.com/office/drawing/2016/5/14/chartex" xmlns:mc="http://schemas.openxmlformats.org/markup-compatibility/2006" xmlns:aink="http://schemas.microsoft.com/office/drawing/2016/ink" xmlns:am3d="http://schemas.microsoft.com/office/drawing/2017/model3d" xmlns:o="urn:schemas-microsoft-com:office:office" xmlns:oel="http://schemas.microsoft.com/office/2019/extlst" xmlns:r="http://schemas.openxmlformats.org/officeDocument/2006/relationships" xmlns:m="http://schemas.openxmlformats.org/officeDocument/2006/math" xmlns:v="urn:schemas-microsoft-com:vml" xmlns:wp14="http://schemas.microsoft.com/office/word/2010/wordprocessingDrawing" xmlns:wp="http://schemas.openxmlformats.org/drawingml/2006/wordprocessingDrawing" xmlns:w10="urn:schemas-microsoft-com:office:word" xmlns:w="http://schemas.openxmlformats.org/wordprocessingml/2006/main" xmlns:w14="http://schemas.microsoft.com/office/word/2010/wordml" xmlns:w15="http://schemas.microsoft.com/office/word/2012/wordml" xmlns:w16cex="http://schemas.microsoft.com/office/word/2018/wordml/cex" xmlns:w16cid="http://schemas.microsoft.com/office/word/2016/wordml/cid" xmlns:w16="http://schemas.microsoft.com/office/word/2018/wordml" xmlns:w16du="http://schemas.microsoft.com/office/word/2023/wordml/word16du" xmlns:w16sdtdh="http://schemas.microsoft.com/office/word/2020/wordml/sdtdatahash" xmlns:w16sdtfl="http://schemas.microsoft.com/office/word/2024/wordml/sdtformatlock" xmlns:w16se="http://schemas.microsoft.com/office/word/2015/wordml/symex" xmlns:wpg="http://schemas.microsoft.com/office/word/2010/wordprocessingGroup" xmlns:wpi="http://schemas.microsoft.com/office/word/2010/wordprocessingInk" xmlns:wne="http://schemas.microsoft.com/office/word/2006/wordml" xmlns:wps="http://schemas.microsoft.com/office/word/2010/wordprocessingShape" mc:Ignorable="w14 w15 w16se w16cid w16 w16cex w16sdtdh w16sdtfl w16du wp14">
   <w:sdt>
     <w:sdtPr>
       <w:rPr>
@@ -10814,11 +11268,6 @@
         <w:docPartUnique/>
       </w:docPartObj>
     </w:sdtPr>
-    <w:sdtEndPr>
-      <w:rPr>
-        <w:rStyle w:val="Oldalszm"/>
-      </w:rPr>
-    </w:sdtEndPr>
     <w:sdtContent>
       <w:p>
         <w:pPr>
@@ -10860,11 +11309,6 @@
         <w:docPartUnique/>
       </w:docPartObj>
     </w:sdtPr>
-    <w:sdtEndPr>
-      <w:rPr>
-        <w:rStyle w:val="Oldalszm"/>
-      </w:rPr>
-    </w:sdtEndPr>
     <w:sdtContent>
       <w:p>
         <w:pPr>
@@ -10906,11 +11350,6 @@
         <w:docPartUnique/>
       </w:docPartObj>
     </w:sdtPr>
-    <w:sdtEndPr>
-      <w:rPr>
-        <w:rStyle w:val="Oldalszm"/>
-      </w:rPr>
-    </w:sdtEndPr>
     <w:sdtContent>
       <w:p>
         <w:pPr>
@@ -10950,7 +11389,7 @@
 </file>
 
 <file path=word/footer2.xml><?xml version="1.0" encoding="utf-8"?>
-<w:ftr xmlns:wpc="http://schemas.microsoft.com/office/word/2010/wordprocessingCanvas" xmlns:cx="http://schemas.microsoft.com/office/drawing/2014/chartex" xmlns:cx1="http://schemas.microsoft.com/office/drawing/2015/9/8/chartex" xmlns:mc="http://schemas.openxmlformats.org/markup-compatibility/2006" xmlns:o="urn:schemas-microsoft-com:office:office" xmlns:r="http://schemas.openxmlformats.org/officeDocument/2006/relationships" xmlns:m="http://schemas.openxmlformats.org/officeDocument/2006/math" xmlns:v="urn:schemas-microsoft-com:vml" xmlns:wp14="http://schemas.microsoft.com/office/word/2010/wordprocessingDrawing" xmlns:wp="http://schemas.openxmlformats.org/drawingml/2006/wordprocessingDrawing" xmlns:w10="urn:schemas-microsoft-com:office:word" xmlns:w="http://schemas.openxmlformats.org/wordprocessingml/2006/main" xmlns:w14="http://schemas.microsoft.com/office/word/2010/wordml" xmlns:w15="http://schemas.microsoft.com/office/word/2012/wordml" xmlns:w16se="http://schemas.microsoft.com/office/word/2015/wordml/symex" xmlns:wpg="http://schemas.microsoft.com/office/word/2010/wordprocessingGroup" xmlns:wpi="http://schemas.microsoft.com/office/word/2010/wordprocessingInk" xmlns:wne="http://schemas.microsoft.com/office/word/2006/wordml" xmlns:wps="http://schemas.microsoft.com/office/word/2010/wordprocessingShape" mc:Ignorable="w14 w15 w16se wp14">
+<w:ftr xmlns:wpc="http://schemas.microsoft.com/office/word/2010/wordprocessingCanvas" xmlns:cx="http://schemas.microsoft.com/office/drawing/2014/chartex" xmlns:cx1="http://schemas.microsoft.com/office/drawing/2015/9/8/chartex" xmlns:cx2="http://schemas.microsoft.com/office/drawing/2015/10/21/chartex" xmlns:cx3="http://schemas.microsoft.com/office/drawing/2016/5/9/chartex" xmlns:cx4="http://schemas.microsoft.com/office/drawing/2016/5/10/chartex" xmlns:cx5="http://schemas.microsoft.com/office/drawing/2016/5/11/chartex" xmlns:cx6="http://schemas.microsoft.com/office/drawing/2016/5/12/chartex" xmlns:cx7="http://schemas.microsoft.com/office/drawing/2016/5/13/chartex" xmlns:cx8="http://schemas.microsoft.com/office/drawing/2016/5/14/chartex" xmlns:mc="http://schemas.openxmlformats.org/markup-compatibility/2006" xmlns:aink="http://schemas.microsoft.com/office/drawing/2016/ink" xmlns:am3d="http://schemas.microsoft.com/office/drawing/2017/model3d" xmlns:o="urn:schemas-microsoft-com:office:office" xmlns:oel="http://schemas.microsoft.com/office/2019/extlst" xmlns:r="http://schemas.openxmlformats.org/officeDocument/2006/relationships" xmlns:m="http://schemas.openxmlformats.org/officeDocument/2006/math" xmlns:v="urn:schemas-microsoft-com:vml" xmlns:wp14="http://schemas.microsoft.com/office/word/2010/wordprocessingDrawing" xmlns:wp="http://schemas.openxmlformats.org/drawingml/2006/wordprocessingDrawing" xmlns:w10="urn:schemas-microsoft-com:office:word" xmlns:w="http://schemas.openxmlformats.org/wordprocessingml/2006/main" xmlns:w14="http://schemas.microsoft.com/office/word/2010/wordml" xmlns:w15="http://schemas.microsoft.com/office/word/2012/wordml" xmlns:w16cex="http://schemas.microsoft.com/office/word/2018/wordml/cex" xmlns:w16cid="http://schemas.microsoft.com/office/word/2016/wordml/cid" xmlns:w16="http://schemas.microsoft.com/office/word/2018/wordml" xmlns:w16du="http://schemas.microsoft.com/office/word/2023/wordml/word16du" xmlns:w16sdtdh="http://schemas.microsoft.com/office/word/2020/wordml/sdtdatahash" xmlns:w16sdtfl="http://schemas.microsoft.com/office/word/2024/wordml/sdtformatlock" xmlns:w16se="http://schemas.microsoft.com/office/word/2015/wordml/symex" xmlns:wpg="http://schemas.microsoft.com/office/word/2010/wordprocessingGroup" xmlns:wpi="http://schemas.microsoft.com/office/word/2010/wordprocessingInk" xmlns:wne="http://schemas.microsoft.com/office/word/2006/wordml" xmlns:wps="http://schemas.microsoft.com/office/word/2010/wordprocessingShape" mc:Ignorable="w14 w15 w16se w16cid w16 w16cex w16sdtdh w16sdtfl w16du wp14">
   <w:p>
     <w:pPr>
       <w:pStyle w:val="llb"/>
@@ -10970,7 +11409,7 @@
 </file>
 
 <file path=word/footer3.xml><?xml version="1.0" encoding="utf-8"?>
-<w:ftr xmlns:wpc="http://schemas.microsoft.com/office/word/2010/wordprocessingCanvas" xmlns:cx="http://schemas.microsoft.com/office/drawing/2014/chartex" xmlns:cx1="http://schemas.microsoft.com/office/drawing/2015/9/8/chartex" xmlns:mc="http://schemas.openxmlformats.org/markup-compatibility/2006" xmlns:o="urn:schemas-microsoft-com:office:office" xmlns:r="http://schemas.openxmlformats.org/officeDocument/2006/relationships" xmlns:m="http://schemas.openxmlformats.org/officeDocument/2006/math" xmlns:v="urn:schemas-microsoft-com:vml" xmlns:wp14="http://schemas.microsoft.com/office/word/2010/wordprocessingDrawing" xmlns:wp="http://schemas.openxmlformats.org/drawingml/2006/wordprocessingDrawing" xmlns:w10="urn:schemas-microsoft-com:office:word" xmlns:w="http://schemas.openxmlformats.org/wordprocessingml/2006/main" xmlns:w14="http://schemas.microsoft.com/office/word/2010/wordml" xmlns:w15="http://schemas.microsoft.com/office/word/2012/wordml" xmlns:w16se="http://schemas.microsoft.com/office/word/2015/wordml/symex" xmlns:wpg="http://schemas.microsoft.com/office/word/2010/wordprocessingGroup" xmlns:wpi="http://schemas.microsoft.com/office/word/2010/wordprocessingInk" xmlns:wne="http://schemas.microsoft.com/office/word/2006/wordml" xmlns:wps="http://schemas.microsoft.com/office/word/2010/wordprocessingShape" mc:Ignorable="w14 w15 w16se wp14">
+<w:ftr xmlns:wpc="http://schemas.microsoft.com/office/word/2010/wordprocessingCanvas" xmlns:cx="http://schemas.microsoft.com/office/drawing/2014/chartex" xmlns:cx1="http://schemas.microsoft.com/office/drawing/2015/9/8/chartex" xmlns:cx2="http://schemas.microsoft.com/office/drawing/2015/10/21/chartex" xmlns:cx3="http://schemas.microsoft.com/office/drawing/2016/5/9/chartex" xmlns:cx4="http://schemas.microsoft.com/office/drawing/2016/5/10/chartex" xmlns:cx5="http://schemas.microsoft.com/office/drawing/2016/5/11/chartex" xmlns:cx6="http://schemas.microsoft.com/office/drawing/2016/5/12/chartex" xmlns:cx7="http://schemas.microsoft.com/office/drawing/2016/5/13/chartex" xmlns:cx8="http://schemas.microsoft.com/office/drawing/2016/5/14/chartex" xmlns:mc="http://schemas.openxmlformats.org/markup-compatibility/2006" xmlns:aink="http://schemas.microsoft.com/office/drawing/2016/ink" xmlns:am3d="http://schemas.microsoft.com/office/drawing/2017/model3d" xmlns:o="urn:schemas-microsoft-com:office:office" xmlns:oel="http://schemas.microsoft.com/office/2019/extlst" xmlns:r="http://schemas.openxmlformats.org/officeDocument/2006/relationships" xmlns:m="http://schemas.openxmlformats.org/officeDocument/2006/math" xmlns:v="urn:schemas-microsoft-com:vml" xmlns:wp14="http://schemas.microsoft.com/office/word/2010/wordprocessingDrawing" xmlns:wp="http://schemas.openxmlformats.org/drawingml/2006/wordprocessingDrawing" xmlns:w10="urn:schemas-microsoft-com:office:word" xmlns:w="http://schemas.openxmlformats.org/wordprocessingml/2006/main" xmlns:w14="http://schemas.microsoft.com/office/word/2010/wordml" xmlns:w15="http://schemas.microsoft.com/office/word/2012/wordml" xmlns:w16cex="http://schemas.microsoft.com/office/word/2018/wordml/cex" xmlns:w16cid="http://schemas.microsoft.com/office/word/2016/wordml/cid" xmlns:w16="http://schemas.microsoft.com/office/word/2018/wordml" xmlns:w16du="http://schemas.microsoft.com/office/word/2023/wordml/word16du" xmlns:w16sdtdh="http://schemas.microsoft.com/office/word/2020/wordml/sdtdatahash" xmlns:w16sdtfl="http://schemas.microsoft.com/office/word/2024/wordml/sdtformatlock" xmlns:w16se="http://schemas.microsoft.com/office/word/2015/wordml/symex" xmlns:wpg="http://schemas.microsoft.com/office/word/2010/wordprocessingGroup" xmlns:wpi="http://schemas.microsoft.com/office/word/2010/wordprocessingInk" xmlns:wne="http://schemas.microsoft.com/office/word/2006/wordml" xmlns:wps="http://schemas.microsoft.com/office/word/2010/wordprocessingShape" mc:Ignorable="w14 w15 w16se w16cid w16 w16cex w16sdtdh w16sdtfl w16du wp14">
   <w:sdt>
     <w:sdtPr>
       <w:rPr>
@@ -10982,11 +11421,6 @@
         <w:docPartUnique/>
       </w:docPartObj>
     </w:sdtPr>
-    <w:sdtEndPr>
-      <w:rPr>
-        <w:rStyle w:val="Oldalszm"/>
-      </w:rPr>
-    </w:sdtEndPr>
     <w:sdtContent>
       <w:p>
         <w:pPr>
@@ -11050,7 +11484,7 @@
 </file>
 
 <file path=word/footer4.xml><?xml version="1.0" encoding="utf-8"?>
-<w:ftr xmlns:wpc="http://schemas.microsoft.com/office/word/2010/wordprocessingCanvas" xmlns:cx="http://schemas.microsoft.com/office/drawing/2014/chartex" xmlns:cx1="http://schemas.microsoft.com/office/drawing/2015/9/8/chartex" xmlns:mc="http://schemas.openxmlformats.org/markup-compatibility/2006" xmlns:o="urn:schemas-microsoft-com:office:office" xmlns:r="http://schemas.openxmlformats.org/officeDocument/2006/relationships" xmlns:m="http://schemas.openxmlformats.org/officeDocument/2006/math" xmlns:v="urn:schemas-microsoft-com:vml" xmlns:wp14="http://schemas.microsoft.com/office/word/2010/wordprocessingDrawing" xmlns:wp="http://schemas.openxmlformats.org/drawingml/2006/wordprocessingDrawing" xmlns:w10="urn:schemas-microsoft-com:office:word" xmlns:w="http://schemas.openxmlformats.org/wordprocessingml/2006/main" xmlns:w14="http://schemas.microsoft.com/office/word/2010/wordml" xmlns:w15="http://schemas.microsoft.com/office/word/2012/wordml" xmlns:w16se="http://schemas.microsoft.com/office/word/2015/wordml/symex" xmlns:wpg="http://schemas.microsoft.com/office/word/2010/wordprocessingGroup" xmlns:wpi="http://schemas.microsoft.com/office/word/2010/wordprocessingInk" xmlns:wne="http://schemas.microsoft.com/office/word/2006/wordml" xmlns:wps="http://schemas.microsoft.com/office/word/2010/wordprocessingShape" mc:Ignorable="w14 w15 w16se wp14">
+<w:ftr xmlns:wpc="http://schemas.microsoft.com/office/word/2010/wordprocessingCanvas" xmlns:cx="http://schemas.microsoft.com/office/drawing/2014/chartex" xmlns:cx1="http://schemas.microsoft.com/office/drawing/2015/9/8/chartex" xmlns:cx2="http://schemas.microsoft.com/office/drawing/2015/10/21/chartex" xmlns:cx3="http://schemas.microsoft.com/office/drawing/2016/5/9/chartex" xmlns:cx4="http://schemas.microsoft.com/office/drawing/2016/5/10/chartex" xmlns:cx5="http://schemas.microsoft.com/office/drawing/2016/5/11/chartex" xmlns:cx6="http://schemas.microsoft.com/office/drawing/2016/5/12/chartex" xmlns:cx7="http://schemas.microsoft.com/office/drawing/2016/5/13/chartex" xmlns:cx8="http://schemas.microsoft.com/office/drawing/2016/5/14/chartex" xmlns:mc="http://schemas.openxmlformats.org/markup-compatibility/2006" xmlns:aink="http://schemas.microsoft.com/office/drawing/2016/ink" xmlns:am3d="http://schemas.microsoft.com/office/drawing/2017/model3d" xmlns:o="urn:schemas-microsoft-com:office:office" xmlns:oel="http://schemas.microsoft.com/office/2019/extlst" xmlns:r="http://schemas.openxmlformats.org/officeDocument/2006/relationships" xmlns:m="http://schemas.openxmlformats.org/officeDocument/2006/math" xmlns:v="urn:schemas-microsoft-com:vml" xmlns:wp14="http://schemas.microsoft.com/office/word/2010/wordprocessingDrawing" xmlns:wp="http://schemas.openxmlformats.org/drawingml/2006/wordprocessingDrawing" xmlns:w10="urn:schemas-microsoft-com:office:word" xmlns:w="http://schemas.openxmlformats.org/wordprocessingml/2006/main" xmlns:w14="http://schemas.microsoft.com/office/word/2010/wordml" xmlns:w15="http://schemas.microsoft.com/office/word/2012/wordml" xmlns:w16cex="http://schemas.microsoft.com/office/word/2018/wordml/cex" xmlns:w16cid="http://schemas.microsoft.com/office/word/2016/wordml/cid" xmlns:w16="http://schemas.microsoft.com/office/word/2018/wordml" xmlns:w16du="http://schemas.microsoft.com/office/word/2023/wordml/word16du" xmlns:w16sdtdh="http://schemas.microsoft.com/office/word/2020/wordml/sdtdatahash" xmlns:w16sdtfl="http://schemas.microsoft.com/office/word/2024/wordml/sdtformatlock" xmlns:w16se="http://schemas.microsoft.com/office/word/2015/wordml/symex" xmlns:wpg="http://schemas.microsoft.com/office/word/2010/wordprocessingGroup" xmlns:wpi="http://schemas.microsoft.com/office/word/2010/wordprocessingInk" xmlns:wne="http://schemas.microsoft.com/office/word/2006/wordml" xmlns:wps="http://schemas.microsoft.com/office/word/2010/wordprocessingShape" mc:Ignorable="w14 w15 w16se w16cid w16 w16cex w16sdtdh w16sdtfl w16du wp14">
   <w:sdt>
     <w:sdtPr>
       <w:rPr>
@@ -11062,11 +11496,6 @@
         <w:docPartUnique/>
       </w:docPartObj>
     </w:sdtPr>
-    <w:sdtEndPr>
-      <w:rPr>
-        <w:rStyle w:val="Oldalszm"/>
-      </w:rPr>
-    </w:sdtEndPr>
     <w:sdtContent>
       <w:p>
         <w:pPr>
@@ -11132,11 +11561,6 @@
         <w:docPartUnique/>
       </w:docPartObj>
     </w:sdtPr>
-    <w:sdtEndPr>
-      <w:rPr>
-        <w:rStyle w:val="Oldalszm"/>
-      </w:rPr>
-    </w:sdtEndPr>
     <w:sdtContent>
       <w:p>
         <w:pPr>
@@ -11159,7 +11583,7 @@
 </file>
 
 <file path=word/footnotes.xml><?xml version="1.0" encoding="utf-8"?>
-<w:footnotes xmlns:wpc="http://schemas.microsoft.com/office/word/2010/wordprocessingCanvas" xmlns:cx="http://schemas.microsoft.com/office/drawing/2014/chartex" xmlns:cx1="http://schemas.microsoft.com/office/drawing/2015/9/8/chartex" xmlns:mc="http://schemas.openxmlformats.org/markup-compatibility/2006" xmlns:o="urn:schemas-microsoft-com:office:office" xmlns:r="http://schemas.openxmlformats.org/officeDocument/2006/relationships" xmlns:m="http://schemas.openxmlformats.org/officeDocument/2006/math" xmlns:v="urn:schemas-microsoft-com:vml" xmlns:wp14="http://schemas.microsoft.com/office/word/2010/wordprocessingDrawing" xmlns:wp="http://schemas.openxmlformats.org/drawingml/2006/wordprocessingDrawing" xmlns:w10="urn:schemas-microsoft-com:office:word" xmlns:w="http://schemas.openxmlformats.org/wordprocessingml/2006/main" xmlns:w14="http://schemas.microsoft.com/office/word/2010/wordml" xmlns:w15="http://schemas.microsoft.com/office/word/2012/wordml" xmlns:w16se="http://schemas.microsoft.com/office/word/2015/wordml/symex" xmlns:wpg="http://schemas.microsoft.com/office/word/2010/wordprocessingGroup" xmlns:wpi="http://schemas.microsoft.com/office/word/2010/wordprocessingInk" xmlns:wne="http://schemas.microsoft.com/office/word/2006/wordml" xmlns:wps="http://schemas.microsoft.com/office/word/2010/wordprocessingShape" mc:Ignorable="w14 w15 w16se wp14">
+<w:footnotes xmlns:wpc="http://schemas.microsoft.com/office/word/2010/wordprocessingCanvas" xmlns:cx="http://schemas.microsoft.com/office/drawing/2014/chartex" xmlns:cx1="http://schemas.microsoft.com/office/drawing/2015/9/8/chartex" xmlns:cx2="http://schemas.microsoft.com/office/drawing/2015/10/21/chartex" xmlns:cx3="http://schemas.microsoft.com/office/drawing/2016/5/9/chartex" xmlns:cx4="http://schemas.microsoft.com/office/drawing/2016/5/10/chartex" xmlns:cx5="http://schemas.microsoft.com/office/drawing/2016/5/11/chartex" xmlns:cx6="http://schemas.microsoft.com/office/drawing/2016/5/12/chartex" xmlns:cx7="http://schemas.microsoft.com/office/drawing/2016/5/13/chartex" xmlns:cx8="http://schemas.microsoft.com/office/drawing/2016/5/14/chartex" xmlns:mc="http://schemas.openxmlformats.org/markup-compatibility/2006" xmlns:aink="http://schemas.microsoft.com/office/drawing/2016/ink" xmlns:am3d="http://schemas.microsoft.com/office/drawing/2017/model3d" xmlns:o="urn:schemas-microsoft-com:office:office" xmlns:oel="http://schemas.microsoft.com/office/2019/extlst" xmlns:r="http://schemas.openxmlformats.org/officeDocument/2006/relationships" xmlns:m="http://schemas.openxmlformats.org/officeDocument/2006/math" xmlns:v="urn:schemas-microsoft-com:vml" xmlns:wp14="http://schemas.microsoft.com/office/word/2010/wordprocessingDrawing" xmlns:wp="http://schemas.openxmlformats.org/drawingml/2006/wordprocessingDrawing" xmlns:w10="urn:schemas-microsoft-com:office:word" xmlns:w="http://schemas.openxmlformats.org/wordprocessingml/2006/main" xmlns:w14="http://schemas.microsoft.com/office/word/2010/wordml" xmlns:w15="http://schemas.microsoft.com/office/word/2012/wordml" xmlns:w16cex="http://schemas.microsoft.com/office/word/2018/wordml/cex" xmlns:w16cid="http://schemas.microsoft.com/office/word/2016/wordml/cid" xmlns:w16="http://schemas.microsoft.com/office/word/2018/wordml" xmlns:w16du="http://schemas.microsoft.com/office/word/2023/wordml/word16du" xmlns:w16sdtdh="http://schemas.microsoft.com/office/word/2020/wordml/sdtdatahash" xmlns:w16sdtfl="http://schemas.microsoft.com/office/word/2024/wordml/sdtformatlock" xmlns:w16se="http://schemas.microsoft.com/office/word/2015/wordml/symex" xmlns:wpg="http://schemas.microsoft.com/office/word/2010/wordprocessingGroup" xmlns:wpi="http://schemas.microsoft.com/office/word/2010/wordprocessingInk" xmlns:wne="http://schemas.microsoft.com/office/word/2006/wordml" xmlns:wps="http://schemas.microsoft.com/office/word/2010/wordprocessingShape" mc:Ignorable="w14 w15 w16se w16cid w16 w16cex w16sdtdh w16sdtfl w16du wp14">
   <w:footnote w:type="separator" w:id="-1">
     <w:p>
       <w:pPr>
@@ -11184,7 +11608,7 @@
 </file>
 
 <file path=word/numbering.xml><?xml version="1.0" encoding="utf-8"?>
-<w:numbering xmlns:wpc="http://schemas.microsoft.com/office/word/2010/wordprocessingCanvas" xmlns:cx="http://schemas.microsoft.com/office/drawing/2014/chartex" xmlns:cx1="http://schemas.microsoft.com/office/drawing/2015/9/8/chartex" xmlns:mc="http://schemas.openxmlformats.org/markup-compatibility/2006" xmlns:o="urn:schemas-microsoft-com:office:office" xmlns:r="http://schemas.openxmlformats.org/officeDocument/2006/relationships" xmlns:m="http://schemas.openxmlformats.org/officeDocument/2006/math" xmlns:v="urn:schemas-microsoft-com:vml" xmlns:wp14="http://schemas.microsoft.com/office/word/2010/wordprocessingDrawing" xmlns:wp="http://schemas.openxmlformats.org/drawingml/2006/wordprocessingDrawing" xmlns:w10="urn:schemas-microsoft-com:office:word" xmlns:w="http://schemas.openxmlformats.org/wordprocessingml/2006/main" xmlns:w14="http://schemas.microsoft.com/office/word/2010/wordml" xmlns:w15="http://schemas.microsoft.com/office/word/2012/wordml" xmlns:w16se="http://schemas.microsoft.com/office/word/2015/wordml/symex" xmlns:wpg="http://schemas.microsoft.com/office/word/2010/wordprocessingGroup" xmlns:wpi="http://schemas.microsoft.com/office/word/2010/wordprocessingInk" xmlns:wne="http://schemas.microsoft.com/office/word/2006/wordml" xmlns:wps="http://schemas.microsoft.com/office/word/2010/wordprocessingShape" mc:Ignorable="w14 w15 w16se wp14">
+<w:numbering xmlns:wpc="http://schemas.microsoft.com/office/word/2010/wordprocessingCanvas" xmlns:cx="http://schemas.microsoft.com/office/drawing/2014/chartex" xmlns:cx1="http://schemas.microsoft.com/office/drawing/2015/9/8/chartex" xmlns:cx2="http://schemas.microsoft.com/office/drawing/2015/10/21/chartex" xmlns:cx3="http://schemas.microsoft.com/office/drawing/2016/5/9/chartex" xmlns:cx4="http://schemas.microsoft.com/office/drawing/2016/5/10/chartex" xmlns:cx5="http://schemas.microsoft.com/office/drawing/2016/5/11/chartex" xmlns:cx6="http://schemas.microsoft.com/office/drawing/2016/5/12/chartex" xmlns:cx7="http://schemas.microsoft.com/office/drawing/2016/5/13/chartex" xmlns:cx8="http://schemas.microsoft.com/office/drawing/2016/5/14/chartex" xmlns:mc="http://schemas.openxmlformats.org/markup-compatibility/2006" xmlns:aink="http://schemas.microsoft.com/office/drawing/2016/ink" xmlns:am3d="http://schemas.microsoft.com/office/drawing/2017/model3d" xmlns:o="urn:schemas-microsoft-com:office:office" xmlns:oel="http://schemas.microsoft.com/office/2019/extlst" xmlns:r="http://schemas.openxmlformats.org/officeDocument/2006/relationships" xmlns:m="http://schemas.openxmlformats.org/officeDocument/2006/math" xmlns:v="urn:schemas-microsoft-com:vml" xmlns:wp14="http://schemas.microsoft.com/office/word/2010/wordprocessingDrawing" xmlns:wp="http://schemas.openxmlformats.org/drawingml/2006/wordprocessingDrawing" xmlns:w10="urn:schemas-microsoft-com:office:word" xmlns:w="http://schemas.openxmlformats.org/wordprocessingml/2006/main" xmlns:w14="http://schemas.microsoft.com/office/word/2010/wordml" xmlns:w15="http://schemas.microsoft.com/office/word/2012/wordml" xmlns:w16cex="http://schemas.microsoft.com/office/word/2018/wordml/cex" xmlns:w16cid="http://schemas.microsoft.com/office/word/2016/wordml/cid" xmlns:w16="http://schemas.microsoft.com/office/word/2018/wordml" xmlns:w16du="http://schemas.microsoft.com/office/word/2023/wordml/word16du" xmlns:w16sdtdh="http://schemas.microsoft.com/office/word/2020/wordml/sdtdatahash" xmlns:w16sdtfl="http://schemas.microsoft.com/office/word/2024/wordml/sdtformatlock" xmlns:w16se="http://schemas.microsoft.com/office/word/2015/wordml/symex" xmlns:wpg="http://schemas.microsoft.com/office/word/2010/wordprocessingGroup" xmlns:wpi="http://schemas.microsoft.com/office/word/2010/wordprocessingInk" xmlns:wne="http://schemas.microsoft.com/office/word/2006/wordml" xmlns:wps="http://schemas.microsoft.com/office/word/2010/wordprocessingShape" mc:Ignorable="w14 w15 w16se w16cid w16 w16cex w16sdtdh w16sdtfl w16du wp14">
   <w:abstractNum w:abstractNumId="0" w15:restartNumberingAfterBreak="0">
     <w:nsid w:val="02826046"/>
     <w:multiLevelType w:val="multilevel"/>
@@ -12895,59 +13319,59 @@
       </w:rPr>
     </w:lvl>
   </w:abstractNum>
-  <w:num w:numId="1">
+  <w:num w:numId="1" w16cid:durableId="221453100">
     <w:abstractNumId w:val="13"/>
   </w:num>
-  <w:num w:numId="2">
+  <w:num w:numId="2" w16cid:durableId="274219993">
     <w:abstractNumId w:val="11"/>
   </w:num>
-  <w:num w:numId="3">
+  <w:num w:numId="3" w16cid:durableId="1160970560">
     <w:abstractNumId w:val="2"/>
   </w:num>
-  <w:num w:numId="4">
+  <w:num w:numId="4" w16cid:durableId="1657805742">
     <w:abstractNumId w:val="8"/>
   </w:num>
-  <w:num w:numId="5">
+  <w:num w:numId="5" w16cid:durableId="524097303">
     <w:abstractNumId w:val="12"/>
   </w:num>
-  <w:num w:numId="6">
+  <w:num w:numId="6" w16cid:durableId="543715811">
     <w:abstractNumId w:val="9"/>
   </w:num>
-  <w:num w:numId="7">
+  <w:num w:numId="7" w16cid:durableId="735251469">
     <w:abstractNumId w:val="0"/>
   </w:num>
-  <w:num w:numId="8">
+  <w:num w:numId="8" w16cid:durableId="1830055011">
     <w:abstractNumId w:val="10"/>
   </w:num>
-  <w:num w:numId="9">
+  <w:num w:numId="9" w16cid:durableId="2047371794">
     <w:abstractNumId w:val="7"/>
   </w:num>
-  <w:num w:numId="10">
+  <w:num w:numId="10" w16cid:durableId="2144496623">
     <w:abstractNumId w:val="1"/>
   </w:num>
-  <w:num w:numId="11">
+  <w:num w:numId="11" w16cid:durableId="1144470724">
     <w:abstractNumId w:val="4"/>
   </w:num>
-  <w:num w:numId="12">
+  <w:num w:numId="12" w16cid:durableId="444428183">
     <w:abstractNumId w:val="6"/>
   </w:num>
-  <w:num w:numId="13">
+  <w:num w:numId="13" w16cid:durableId="293295875">
     <w:abstractNumId w:val="14"/>
   </w:num>
-  <w:num w:numId="14">
+  <w:num w:numId="14" w16cid:durableId="650714070">
     <w:abstractNumId w:val="3"/>
   </w:num>
-  <w:num w:numId="15">
+  <w:num w:numId="15" w16cid:durableId="2086804302">
     <w:abstractNumId w:val="5"/>
   </w:num>
-  <w:num w:numId="16">
+  <w:num w:numId="16" w16cid:durableId="646210167">
     <w:abstractNumId w:val="15"/>
   </w:num>
 </w:numbering>
 </file>
 
 <file path=word/styles.xml><?xml version="1.0" encoding="utf-8"?>
-<w:styles xmlns:mc="http://schemas.openxmlformats.org/markup-compatibility/2006" xmlns:r="http://schemas.openxmlformats.org/officeDocument/2006/relationships" xmlns:w="http://schemas.openxmlformats.org/wordprocessingml/2006/main" xmlns:w14="http://schemas.microsoft.com/office/word/2010/wordml" xmlns:w15="http://schemas.microsoft.com/office/word/2012/wordml" xmlns:w16se="http://schemas.microsoft.com/office/word/2015/wordml/symex" mc:Ignorable="w14 w15 w16se">
+<w:styles xmlns:mc="http://schemas.openxmlformats.org/markup-compatibility/2006" xmlns:r="http://schemas.openxmlformats.org/officeDocument/2006/relationships" xmlns:w="http://schemas.openxmlformats.org/wordprocessingml/2006/main" xmlns:w14="http://schemas.microsoft.com/office/word/2010/wordml" xmlns:w15="http://schemas.microsoft.com/office/word/2012/wordml" xmlns:w16cex="http://schemas.microsoft.com/office/word/2018/wordml/cex" xmlns:w16cid="http://schemas.microsoft.com/office/word/2016/wordml/cid" xmlns:w16="http://schemas.microsoft.com/office/word/2018/wordml" xmlns:w16du="http://schemas.microsoft.com/office/word/2023/wordml/word16du" xmlns:w16sdtdh="http://schemas.microsoft.com/office/word/2020/wordml/sdtdatahash" xmlns:w16sdtfl="http://schemas.microsoft.com/office/word/2024/wordml/sdtformatlock" xmlns:w16se="http://schemas.microsoft.com/office/word/2015/wordml/symex" mc:Ignorable="w14 w15 w16se w16cid w16 w16cex w16sdtdh w16sdtfl w16du">
   <w:docDefaults>
     <w:rPrDefault>
       <w:rPr>
@@ -12963,7 +13387,7 @@
       </w:pPr>
     </w:pPrDefault>
   </w:docDefaults>
-  <w:latentStyles w:defLockedState="0" w:defUIPriority="99" w:defSemiHidden="0" w:defUnhideWhenUsed="0" w:defQFormat="0" w:count="371">
+  <w:latentStyles w:defLockedState="0" w:defUIPriority="99" w:defSemiHidden="0" w:defUnhideWhenUsed="0" w:defQFormat="0" w:count="376">
     <w:lsdException w:name="Normal" w:uiPriority="0" w:qFormat="1"/>
     <w:lsdException w:name="heading 1" w:uiPriority="9" w:qFormat="1"/>
     <w:lsdException w:name="heading 2" w:semiHidden="1" w:uiPriority="9" w:unhideWhenUsed="1" w:qFormat="1"/>
@@ -13335,6 +13759,11 @@
     <w:lsdException w:name="List Table 5 Dark Accent 6" w:uiPriority="50"/>
     <w:lsdException w:name="List Table 6 Colorful Accent 6" w:uiPriority="51"/>
     <w:lsdException w:name="List Table 7 Colorful Accent 6" w:uiPriority="52"/>
+    <w:lsdException w:name="Mention" w:semiHidden="1" w:unhideWhenUsed="1"/>
+    <w:lsdException w:name="Smart Hyperlink" w:semiHidden="1" w:unhideWhenUsed="1"/>
+    <w:lsdException w:name="Hashtag" w:semiHidden="1" w:unhideWhenUsed="1"/>
+    <w:lsdException w:name="Unresolved Mention" w:semiHidden="1" w:unhideWhenUsed="1"/>
+    <w:lsdException w:name="Smart Link" w:semiHidden="1" w:unhideWhenUsed="1"/>
   </w:latentStyles>
   <w:style w:type="paragraph" w:default="1" w:styleId="Norml">
     <w:name w:val="Normal"/>
@@ -13777,8 +14206,8 @@
       <w:lang w:val="en-GB"/>
     </w:rPr>
   </w:style>
-  <w:style w:type="character" w:customStyle="1" w:styleId="UnresolvedMention">
-    <w:name w:val="Unresolved Mention"/>
+  <w:style w:type="character" w:customStyle="1" w:styleId="Feloldatlanmegemlts2">
+    <w:name w:val="Feloldatlan megemlítés2"/>
     <w:basedOn w:val="Bekezdsalapbettpusa"/>
     <w:uiPriority w:val="99"/>
     <w:semiHidden/>

</xml_diff>